<commit_message>
fixed a typo in the record name ("RECC" instead of "REC")
</commit_message>
<xml_diff>
--- a/1 - Data Entry/Two Level Application/CSDP-2-level.docx
+++ b/1 - Data Entry/Two Level Application/CSDP-2-level.docx
@@ -1,6 +1,6 @@
 
 <file path=word/document.xml><?xml version="1.0" encoding="utf-8"?>
-<w:document xmlns:wpc="http://schemas.microsoft.com/office/word/2010/wordprocessingCanvas" xmlns:mc="http://schemas.openxmlformats.org/markup-compatibility/2006" xmlns:o="urn:schemas-microsoft-com:office:office" xmlns:r="http://schemas.openxmlformats.org/officeDocument/2006/relationships" xmlns:m="http://schemas.openxmlformats.org/officeDocument/2006/math" xmlns:v="urn:schemas-microsoft-com:vml" xmlns:wp14="http://schemas.microsoft.com/office/word/2010/wordprocessingDrawing" xmlns:wp="http://schemas.openxmlformats.org/drawingml/2006/wordprocessingDrawing" xmlns:w10="urn:schemas-microsoft-com:office:word" xmlns:w="http://schemas.openxmlformats.org/wordprocessingml/2006/main" xmlns:w14="http://schemas.microsoft.com/office/word/2010/wordml" xmlns:wpg="http://schemas.microsoft.com/office/word/2010/wordprocessingGroup" xmlns:wpi="http://schemas.microsoft.com/office/word/2010/wordprocessingInk" xmlns:wne="http://schemas.microsoft.com/office/word/2006/wordml" xmlns:wps="http://schemas.microsoft.com/office/word/2010/wordprocessingShape" mc:Ignorable="w14 wp14">
+<w:document xmlns:wpc="http://schemas.microsoft.com/office/word/2010/wordprocessingCanvas" xmlns:cx="http://schemas.microsoft.com/office/drawing/2014/chartex" xmlns:cx1="http://schemas.microsoft.com/office/drawing/2015/9/8/chartex" xmlns:cx2="http://schemas.microsoft.com/office/drawing/2015/10/21/chartex" xmlns:cx3="http://schemas.microsoft.com/office/drawing/2016/5/9/chartex" xmlns:cx4="http://schemas.microsoft.com/office/drawing/2016/5/10/chartex" xmlns:cx5="http://schemas.microsoft.com/office/drawing/2016/5/11/chartex" xmlns:cx6="http://schemas.microsoft.com/office/drawing/2016/5/12/chartex" xmlns:cx7="http://schemas.microsoft.com/office/drawing/2016/5/13/chartex" xmlns:cx8="http://schemas.microsoft.com/office/drawing/2016/5/14/chartex" xmlns:mc="http://schemas.openxmlformats.org/markup-compatibility/2006" xmlns:aink="http://schemas.microsoft.com/office/drawing/2016/ink" xmlns:am3d="http://schemas.microsoft.com/office/drawing/2017/model3d" xmlns:o="urn:schemas-microsoft-com:office:office" xmlns:oel="http://schemas.microsoft.com/office/2019/extlst" xmlns:r="http://schemas.openxmlformats.org/officeDocument/2006/relationships" xmlns:m="http://schemas.openxmlformats.org/officeDocument/2006/math" xmlns:v="urn:schemas-microsoft-com:vml" xmlns:wp14="http://schemas.microsoft.com/office/word/2010/wordprocessingDrawing" xmlns:wp="http://schemas.openxmlformats.org/drawingml/2006/wordprocessingDrawing" xmlns:w10="urn:schemas-microsoft-com:office:word" xmlns:w="http://schemas.openxmlformats.org/wordprocessingml/2006/main" xmlns:w14="http://schemas.microsoft.com/office/word/2010/wordml" xmlns:w15="http://schemas.microsoft.com/office/word/2012/wordml" xmlns:w16cei="http://schemas.microsoft.com/office/word/2026/wordml/cei" xmlns:w16cex="http://schemas.microsoft.com/office/word/2018/wordml/cex" xmlns:w16cid="http://schemas.microsoft.com/office/word/2016/wordml/cid" xmlns:w16="http://schemas.microsoft.com/office/word/2018/wordml" xmlns:w16du="http://schemas.microsoft.com/office/word/2023/wordml/word16du" xmlns:w16sdtdh="http://schemas.microsoft.com/office/word/2020/wordml/sdtdatahash" xmlns:w16sdtfl="http://schemas.microsoft.com/office/word/2024/wordml/sdtformatlock" xmlns:w16se="http://schemas.microsoft.com/office/word/2015/wordml/symex" xmlns:wpg="http://schemas.microsoft.com/office/word/2010/wordprocessingGroup" xmlns:wpi="http://schemas.microsoft.com/office/word/2010/wordprocessingInk" xmlns:wne="http://schemas.microsoft.com/office/word/2006/wordml" xmlns:wps="http://schemas.microsoft.com/office/word/2010/wordprocessingShape" mc:Ignorable="w14 w15 w16se w16cid w16 w16cex w16sdtdh w16sdtfl w16du wp14">
   <w:body>
     <w:p>
       <w:pPr>
@@ -9,8 +9,6 @@
           <w:rFonts w:asciiTheme="minorBidi" w:hAnsiTheme="minorBidi" w:cstheme="minorBidi"/>
         </w:rPr>
       </w:pPr>
-      <w:bookmarkStart w:id="0" w:name="_GoBack"/>
-      <w:bookmarkEnd w:id="0"/>
       <w:r>
         <w:rPr>
           <w:rFonts w:asciiTheme="minorBidi" w:hAnsiTheme="minorBidi" w:cstheme="minorBidi"/>
@@ -221,7 +219,7 @@
           </mc:Choice>
           <mc:Fallback>
             <w:pict>
-              <v:rect id="Rectangle 4" o:spid="_x0000_s1026" style="position:absolute;margin-left:162pt;margin-top:13.3pt;width:63pt;height:27pt;z-index:251651072;visibility:visible;mso-wrap-style:square;mso-width-percent:0;mso-height-percent:0;mso-wrap-distance-left:9pt;mso-wrap-distance-top:0;mso-wrap-distance-right:9pt;mso-wrap-distance-bottom:0;mso-position-horizontal:absolute;mso-position-horizontal-relative:text;mso-position-vertical:absolute;mso-position-vertical-relative:text;mso-width-percent:0;mso-height-percent:0;mso-width-relative:page;mso-height-relative:page;v-text-anchor:top" o:gfxdata="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">
+              <v:rect w14:anchorId="6D6B8FA7" id="Rectangle 4" o:spid="_x0000_s1026" style="position:absolute;margin-left:162pt;margin-top:13.3pt;width:63pt;height:27pt;z-index:251651072;visibility:visible;mso-wrap-style:square;mso-width-percent:0;mso-height-percent:0;mso-wrap-distance-left:9pt;mso-wrap-distance-top:0;mso-wrap-distance-right:9pt;mso-wrap-distance-bottom:0;mso-position-horizontal:absolute;mso-position-horizontal-relative:text;mso-position-vertical:absolute;mso-position-vertical-relative:text;mso-width-percent:0;mso-height-percent:0;mso-width-relative:page;mso-height-relative:page;v-text-anchor:top" o:gfxdata="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">
                 <v:textbox>
                   <w:txbxContent>
                     <w:p>
@@ -303,7 +301,7 @@
           </mc:Choice>
           <mc:Fallback>
             <w:pict>
-              <v:rect id="Rectangle 3" o:spid="_x0000_s1026" style="position:absolute;margin-left:0;margin-top:4.3pt;width:405pt;height:189pt;z-index:251650048;visibility:visible;mso-wrap-style:square;mso-width-percent:0;mso-height-percent:0;mso-wrap-distance-left:9pt;mso-wrap-distance-top:0;mso-wrap-distance-right:9pt;mso-wrap-distance-bottom:0;mso-position-horizontal:absolute;mso-position-horizontal-relative:text;mso-position-vertical:absolute;mso-position-vertical-relative:text;mso-width-percent:0;mso-height-percent:0;mso-width-relative:page;mso-height-relative:page;v-text-anchor:top" o:gfxdata="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"/>
+              <v:rect w14:anchorId="5C285E0E" id="Rectangle 3" o:spid="_x0000_s1026" style="position:absolute;margin-left:0;margin-top:4.3pt;width:405pt;height:189pt;z-index:251650048;visibility:visible;mso-wrap-style:square;mso-width-percent:0;mso-height-percent:0;mso-wrap-distance-left:9pt;mso-wrap-distance-top:0;mso-wrap-distance-right:9pt;mso-wrap-distance-bottom:0;mso-position-horizontal:absolute;mso-position-horizontal-relative:text;mso-position-vertical:absolute;mso-position-vertical-relative:text;mso-width-percent:0;mso-height-percent:0;mso-width-relative:page;mso-height-relative:page;v-text-anchor:top" o:gfxdata="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"/>
             </w:pict>
           </mc:Fallback>
         </mc:AlternateContent>
@@ -392,7 +390,7 @@
           </mc:Choice>
           <mc:Fallback>
             <w:pict>
-              <v:line id="Line 23" o:spid="_x0000_s1026" style="position:absolute;z-index:251665408;visibility:visible;mso-wrap-style:square;mso-width-percent:0;mso-height-percent:0;mso-wrap-distance-left:9pt;mso-wrap-distance-top:0;mso-wrap-distance-right:9pt;mso-wrap-distance-bottom:0;mso-position-horizontal:absolute;mso-position-horizontal-relative:text;mso-position-vertical:absolute;mso-position-vertical-relative:text;mso-width-percent:0;mso-height-percent:0;mso-width-relative:page;mso-height-relative:page" from="225pt,3.7pt" to="279pt,30.7pt" o:gfxdata="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">
+              <v:line w14:anchorId="7C1327E4" id="Line 23" o:spid="_x0000_s1026" style="position:absolute;z-index:251665408;visibility:visible;mso-wrap-style:square;mso-width-percent:0;mso-height-percent:0;mso-wrap-distance-left:9pt;mso-wrap-distance-top:0;mso-wrap-distance-right:9pt;mso-wrap-distance-bottom:0;mso-position-horizontal:absolute;mso-position-horizontal-relative:text;mso-position-vertical:absolute;mso-position-vertical-relative:text;mso-width-percent:0;mso-height-percent:0;mso-width-relative:page;mso-height-relative:page" from="225pt,3.7pt" to="279pt,30.7pt" o:gfxdata="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">
                 <v:stroke endarrow="block"/>
               </v:line>
             </w:pict>
@@ -469,7 +467,7 @@
           </mc:Choice>
           <mc:Fallback>
             <w:pict>
-              <v:line id="Line 19" o:spid="_x0000_s1026" style="position:absolute;flip:x;z-index:251661312;visibility:visible;mso-wrap-style:square;mso-width-percent:0;mso-height-percent:0;mso-wrap-distance-left:9pt;mso-wrap-distance-top:0;mso-wrap-distance-right:9pt;mso-wrap-distance-bottom:0;mso-position-horizontal:absolute;mso-position-horizontal-relative:text;mso-position-vertical:absolute;mso-position-vertical-relative:text;mso-width-percent:0;mso-height-percent:0;mso-width-relative:page;mso-height-relative:page" from="99pt,3.7pt" to="162pt,30.7pt" o:gfxdata="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">
+              <v:line w14:anchorId="145A5599" id="Line 19" o:spid="_x0000_s1026" style="position:absolute;flip:x;z-index:251661312;visibility:visible;mso-wrap-style:square;mso-width-percent:0;mso-height-percent:0;mso-wrap-distance-left:9pt;mso-wrap-distance-top:0;mso-wrap-distance-right:9pt;mso-wrap-distance-bottom:0;mso-position-horizontal:absolute;mso-position-horizontal-relative:text;mso-position-vertical:absolute;mso-position-vertical-relative:text;mso-width-percent:0;mso-height-percent:0;mso-width-relative:page;mso-height-relative:page" from="99pt,3.7pt" to="162pt,30.7pt" o:gfxdata="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">
                 <v:stroke endarrow="block"/>
               </v:line>
             </w:pict>
@@ -546,7 +544,7 @@
           </mc:Choice>
           <mc:Fallback>
             <w:pict>
-              <v:line id="Line 13" o:spid="_x0000_s1026" style="position:absolute;z-index:251656192;visibility:visible;mso-wrap-style:square;mso-width-percent:0;mso-height-percent:0;mso-wrap-distance-left:9pt;mso-wrap-distance-top:0;mso-wrap-distance-right:9pt;mso-wrap-distance-bottom:0;mso-position-horizontal:absolute;mso-position-horizontal-relative:text;mso-position-vertical:absolute;mso-position-vertical-relative:text;mso-width-percent:0;mso-height-percent:0;mso-width-relative:page;mso-height-relative:page" from="225pt,3.7pt" to="279pt,30.7pt" o:gfxdata="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"/>
+              <v:line w14:anchorId="6015C5AA" id="Line 13" o:spid="_x0000_s1026" style="position:absolute;z-index:251656192;visibility:visible;mso-wrap-style:square;mso-width-percent:0;mso-height-percent:0;mso-wrap-distance-left:9pt;mso-wrap-distance-top:0;mso-wrap-distance-right:9pt;mso-wrap-distance-bottom:0;mso-position-horizontal:absolute;mso-position-horizontal-relative:text;mso-position-vertical:absolute;mso-position-vertical-relative:text;mso-width-percent:0;mso-height-percent:0;mso-width-relative:page;mso-height-relative:page" from="225pt,3.7pt" to="279pt,30.7pt" o:gfxdata="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"/>
             </w:pict>
           </mc:Fallback>
         </mc:AlternateContent>
@@ -621,7 +619,7 @@
           </mc:Choice>
           <mc:Fallback>
             <w:pict>
-              <v:line id="Line 12" o:spid="_x0000_s1026" style="position:absolute;flip:x;z-index:251655168;visibility:visible;mso-wrap-style:square;mso-width-percent:0;mso-height-percent:0;mso-wrap-distance-left:9pt;mso-wrap-distance-top:0;mso-wrap-distance-right:9pt;mso-wrap-distance-bottom:0;mso-position-horizontal:absolute;mso-position-horizontal-relative:text;mso-position-vertical:absolute;mso-position-vertical-relative:text;mso-width-percent:0;mso-height-percent:0;mso-width-relative:page;mso-height-relative:page" from="99pt,3.7pt" to="162pt,30.7pt" o:gfxdata="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"/>
+              <v:line w14:anchorId="477BD342" id="Line 12" o:spid="_x0000_s1026" style="position:absolute;flip:x;z-index:251655168;visibility:visible;mso-wrap-style:square;mso-width-percent:0;mso-height-percent:0;mso-wrap-distance-left:9pt;mso-wrap-distance-top:0;mso-wrap-distance-right:9pt;mso-wrap-distance-bottom:0;mso-position-horizontal:absolute;mso-position-horizontal-relative:text;mso-position-vertical:absolute;mso-position-vertical-relative:text;mso-width-percent:0;mso-height-percent:0;mso-width-relative:page;mso-height-relative:page" from="99pt,3.7pt" to="162pt,30.7pt" o:gfxdata="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"/>
             </w:pict>
           </mc:Fallback>
         </mc:AlternateContent>
@@ -709,7 +707,7 @@
           </mc:Choice>
           <mc:Fallback>
             <w:pict>
-              <v:oval id="Oval 9" o:spid="_x0000_s1027" style="position:absolute;margin-left:27pt;margin-top:7.9pt;width:1in;height:36pt;z-index:251653120;visibility:visible;mso-wrap-style:square;mso-width-percent:0;mso-height-percent:0;mso-wrap-distance-left:9pt;mso-wrap-distance-top:0;mso-wrap-distance-right:9pt;mso-wrap-distance-bottom:0;mso-position-horizontal:absolute;mso-position-horizontal-relative:text;mso-position-vertical:absolute;mso-position-vertical-relative:text;mso-width-percent:0;mso-height-percent:0;mso-width-relative:page;mso-height-relative:page;v-text-anchor:top" o:gfxdata="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">
+              <v:oval w14:anchorId="36F21EE6" id="Oval 9" o:spid="_x0000_s1027" style="position:absolute;margin-left:27pt;margin-top:7.9pt;width:1in;height:36pt;z-index:251653120;visibility:visible;mso-wrap-style:square;mso-width-percent:0;mso-height-percent:0;mso-wrap-distance-left:9pt;mso-wrap-distance-top:0;mso-wrap-distance-right:9pt;mso-wrap-distance-bottom:0;mso-position-horizontal:absolute;mso-position-horizontal-relative:text;mso-position-vertical:absolute;mso-position-vertical-relative:text;mso-width-percent:0;mso-height-percent:0;mso-width-relative:page;mso-height-relative:page;v-text-anchor:top" o:gfxdata="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">
                 <v:textbox>
                   <w:txbxContent>
                     <w:p>
@@ -800,7 +798,7 @@
           </mc:Choice>
           <mc:Fallback>
             <w:pict>
-              <v:oval id="Oval 11" o:spid="_x0000_s1028" style="position:absolute;margin-left:270pt;margin-top:7.9pt;width:1in;height:36pt;z-index:251654144;visibility:visible;mso-wrap-style:square;mso-width-percent:0;mso-height-percent:0;mso-wrap-distance-left:9pt;mso-wrap-distance-top:0;mso-wrap-distance-right:9pt;mso-wrap-distance-bottom:0;mso-position-horizontal:absolute;mso-position-horizontal-relative:text;mso-position-vertical:absolute;mso-position-vertical-relative:text;mso-width-percent:0;mso-height-percent:0;mso-width-relative:page;mso-height-relative:page;v-text-anchor:top" o:gfxdata="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">
+              <v:oval w14:anchorId="47894FC0" id="Oval 11" o:spid="_x0000_s1028" style="position:absolute;margin-left:270pt;margin-top:7.9pt;width:1in;height:36pt;z-index:251654144;visibility:visible;mso-wrap-style:square;mso-width-percent:0;mso-height-percent:0;mso-wrap-distance-left:9pt;mso-wrap-distance-top:0;mso-wrap-distance-right:9pt;mso-wrap-distance-bottom:0;mso-position-horizontal:absolute;mso-position-horizontal-relative:text;mso-position-vertical:absolute;mso-position-vertical-relative:text;mso-width-percent:0;mso-height-percent:0;mso-width-relative:page;mso-height-relative:page;v-text-anchor:top" o:gfxdata="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">
                 <v:textbox>
                   <w:txbxContent>
                     <w:p>
@@ -899,7 +897,7 @@
           </mc:Choice>
           <mc:Fallback>
             <w:pict>
-              <v:line id="Line 21" o:spid="_x0000_s1026" style="position:absolute;z-index:251663360;visibility:visible;mso-wrap-style:square;mso-width-percent:0;mso-height-percent:0;mso-wrap-distance-left:9pt;mso-wrap-distance-top:0;mso-wrap-distance-right:9pt;mso-wrap-distance-bottom:0;mso-position-horizontal:absolute;mso-position-horizontal-relative:text;mso-position-vertical:absolute;mso-position-vertical-relative:text;mso-width-percent:0;mso-height-percent:0;mso-width-relative:page;mso-height-relative:page" from="90pt,7.3pt" to="207pt,61.3pt" o:gfxdata="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">
+              <v:line w14:anchorId="300D7EA2" id="Line 21" o:spid="_x0000_s1026" style="position:absolute;z-index:251663360;visibility:visible;mso-wrap-style:square;mso-width-percent:0;mso-height-percent:0;mso-wrap-distance-left:9pt;mso-wrap-distance-top:0;mso-wrap-distance-right:9pt;mso-wrap-distance-bottom:0;mso-position-horizontal:absolute;mso-position-horizontal-relative:text;mso-position-vertical:absolute;mso-position-vertical-relative:text;mso-width-percent:0;mso-height-percent:0;mso-width-relative:page;mso-height-relative:page" from="90pt,7.3pt" to="207pt,61.3pt" o:gfxdata="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">
                 <v:stroke endarrow="block"/>
               </v:line>
             </w:pict>
@@ -983,7 +981,7 @@
           </mc:Choice>
           <mc:Fallback>
             <w:pict>
-              <v:line id="Line 22" o:spid="_x0000_s1026" style="position:absolute;z-index:251664384;visibility:visible;mso-wrap-style:square;mso-width-percent:0;mso-height-percent:0;mso-wrap-distance-left:9pt;mso-wrap-distance-top:0;mso-wrap-distance-right:9pt;mso-wrap-distance-bottom:0;mso-position-horizontal:absolute;mso-position-horizontal-relative:text;mso-position-vertical:absolute;mso-position-vertical-relative:text;mso-width-percent:0;mso-height-percent:0;mso-width-relative:page;mso-height-relative:page" from="315pt,2.5pt" to="315pt,47.5pt" o:gfxdata="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">
+              <v:line w14:anchorId="263CDDF2" id="Line 22" o:spid="_x0000_s1026" style="position:absolute;z-index:251664384;visibility:visible;mso-wrap-style:square;mso-width-percent:0;mso-height-percent:0;mso-wrap-distance-left:9pt;mso-wrap-distance-top:0;mso-wrap-distance-right:9pt;mso-wrap-distance-bottom:0;mso-position-horizontal:absolute;mso-position-horizontal-relative:text;mso-position-vertical:absolute;mso-position-vertical-relative:text;mso-width-percent:0;mso-height-percent:0;mso-width-relative:page;mso-height-relative:page" from="315pt,2.5pt" to="315pt,47.5pt" o:gfxdata="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">
                 <v:stroke endarrow="block"/>
               </v:line>
             </w:pict>
@@ -1060,7 +1058,7 @@
           </mc:Choice>
           <mc:Fallback>
             <w:pict>
-              <v:line id="Line 20" o:spid="_x0000_s1026" style="position:absolute;z-index:251662336;visibility:visible;mso-wrap-style:square;mso-width-percent:0;mso-height-percent:0;mso-wrap-distance-left:9pt;mso-wrap-distance-top:0;mso-wrap-distance-right:9pt;mso-wrap-distance-bottom:0;mso-position-horizontal:absolute;mso-position-horizontal-relative:text;mso-position-vertical:absolute;mso-position-vertical-relative:text;mso-width-percent:0;mso-height-percent:0;mso-width-relative:page;mso-height-relative:page" from="1in,2.5pt" to="126pt,47.5pt" o:gfxdata="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">
+              <v:line w14:anchorId="11BE2CA9" id="Line 20" o:spid="_x0000_s1026" style="position:absolute;z-index:251662336;visibility:visible;mso-wrap-style:square;mso-width-percent:0;mso-height-percent:0;mso-wrap-distance-left:9pt;mso-wrap-distance-top:0;mso-wrap-distance-right:9pt;mso-wrap-distance-bottom:0;mso-position-horizontal:absolute;mso-position-horizontal-relative:text;mso-position-vertical:absolute;mso-position-vertical-relative:text;mso-width-percent:0;mso-height-percent:0;mso-width-relative:page;mso-height-relative:page" from="1in,2.5pt" to="126pt,47.5pt" o:gfxdata="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">
                 <v:stroke endarrow="block"/>
               </v:line>
             </w:pict>
@@ -1137,7 +1135,7 @@
           </mc:Choice>
           <mc:Fallback>
             <w:pict>
-              <v:line id="Line 18" o:spid="_x0000_s1026" style="position:absolute;flip:x;z-index:251660288;visibility:visible;mso-wrap-style:square;mso-width-percent:0;mso-height-percent:0;mso-wrap-distance-left:9pt;mso-wrap-distance-top:0;mso-wrap-distance-right:9pt;mso-wrap-distance-bottom:0;mso-position-horizontal:absolute;mso-position-horizontal-relative:text;mso-position-vertical:absolute;mso-position-vertical-relative:text;mso-width-percent:0;mso-height-percent:0;mso-width-relative:page;mso-height-relative:page" from="45pt,2.5pt" to="54pt,47.5pt" o:gfxdata="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">
+              <v:line w14:anchorId="36429A13" id="Line 18" o:spid="_x0000_s1026" style="position:absolute;flip:x;z-index:251660288;visibility:visible;mso-wrap-style:square;mso-width-percent:0;mso-height-percent:0;mso-wrap-distance-left:9pt;mso-wrap-distance-top:0;mso-wrap-distance-right:9pt;mso-wrap-distance-bottom:0;mso-position-horizontal:absolute;mso-position-horizontal-relative:text;mso-position-vertical:absolute;mso-position-vertical-relative:text;mso-width-percent:0;mso-height-percent:0;mso-width-relative:page;mso-height-relative:page" from="45pt,2.5pt" to="54pt,47.5pt" o:gfxdata="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">
                 <v:stroke endarrow="block"/>
               </v:line>
             </w:pict>
@@ -1241,7 +1239,7 @@
           </mc:Choice>
           <mc:Fallback>
             <w:pict>
-              <v:rect id="Rectangle 17" o:spid="_x0000_s1029" style="position:absolute;margin-left:4in;margin-top:6.1pt;width:63pt;height:27pt;z-index:251659264;visibility:visible;mso-wrap-style:square;mso-width-percent:0;mso-height-percent:0;mso-wrap-distance-left:9pt;mso-wrap-distance-top:0;mso-wrap-distance-right:9pt;mso-wrap-distance-bottom:0;mso-position-horizontal:absolute;mso-position-horizontal-relative:text;mso-position-vertical:absolute;mso-position-vertical-relative:text;mso-width-percent:0;mso-height-percent:0;mso-width-relative:page;mso-height-relative:page;v-text-anchor:top" o:gfxdata="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">
+              <v:rect w14:anchorId="44E87E6F" id="Rectangle 17" o:spid="_x0000_s1029" style="position:absolute;margin-left:4in;margin-top:6.1pt;width:63pt;height:27pt;z-index:251659264;visibility:visible;mso-wrap-style:square;mso-width-percent:0;mso-height-percent:0;mso-wrap-distance-left:9pt;mso-wrap-distance-top:0;mso-wrap-distance-right:9pt;mso-wrap-distance-bottom:0;mso-position-horizontal:absolute;mso-position-horizontal-relative:text;mso-position-vertical:absolute;mso-position-vertical-relative:text;mso-width-percent:0;mso-height-percent:0;mso-width-relative:page;mso-height-relative:page;v-text-anchor:top" o:gfxdata="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">
                 <v:textbox>
                   <w:txbxContent>
                     <w:p>
@@ -1332,7 +1330,7 @@
           </mc:Choice>
           <mc:Fallback>
             <w:pict>
-              <v:rect id="Rectangle 16" o:spid="_x0000_s1030" style="position:absolute;margin-left:189pt;margin-top:6.1pt;width:63pt;height:27pt;z-index:251658240;visibility:visible;mso-wrap-style:square;mso-width-percent:0;mso-height-percent:0;mso-wrap-distance-left:9pt;mso-wrap-distance-top:0;mso-wrap-distance-right:9pt;mso-wrap-distance-bottom:0;mso-position-horizontal:absolute;mso-position-horizontal-relative:text;mso-position-vertical:absolute;mso-position-vertical-relative:text;mso-width-percent:0;mso-height-percent:0;mso-width-relative:page;mso-height-relative:page;v-text-anchor:top" o:gfxdata="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">
+              <v:rect w14:anchorId="1657D2B8" id="Rectangle 16" o:spid="_x0000_s1030" style="position:absolute;margin-left:189pt;margin-top:6.1pt;width:63pt;height:27pt;z-index:251658240;visibility:visible;mso-wrap-style:square;mso-width-percent:0;mso-height-percent:0;mso-wrap-distance-left:9pt;mso-wrap-distance-top:0;mso-wrap-distance-right:9pt;mso-wrap-distance-bottom:0;mso-position-horizontal:absolute;mso-position-horizontal-relative:text;mso-position-vertical:absolute;mso-position-vertical-relative:text;mso-width-percent:0;mso-height-percent:0;mso-width-relative:page;mso-height-relative:page;v-text-anchor:top" o:gfxdata="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">
                 <v:textbox>
                   <w:txbxContent>
                     <w:p>
@@ -1423,7 +1421,7 @@
           </mc:Choice>
           <mc:Fallback>
             <w:pict>
-              <v:rect id="Rectangle 15" o:spid="_x0000_s1031" style="position:absolute;margin-left:108pt;margin-top:6.1pt;width:63pt;height:27pt;z-index:251657216;visibility:visible;mso-wrap-style:square;mso-width-percent:0;mso-height-percent:0;mso-wrap-distance-left:9pt;mso-wrap-distance-top:0;mso-wrap-distance-right:9pt;mso-wrap-distance-bottom:0;mso-position-horizontal:absolute;mso-position-horizontal-relative:text;mso-position-vertical:absolute;mso-position-vertical-relative:text;mso-width-percent:0;mso-height-percent:0;mso-width-relative:page;mso-height-relative:page;v-text-anchor:top" o:gfxdata="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">
+              <v:rect w14:anchorId="0649BB5B" id="Rectangle 15" o:spid="_x0000_s1031" style="position:absolute;margin-left:108pt;margin-top:6.1pt;width:63pt;height:27pt;z-index:251657216;visibility:visible;mso-wrap-style:square;mso-width-percent:0;mso-height-percent:0;mso-wrap-distance-left:9pt;mso-wrap-distance-top:0;mso-wrap-distance-right:9pt;mso-wrap-distance-bottom:0;mso-position-horizontal:absolute;mso-position-horizontal-relative:text;mso-position-vertical:absolute;mso-position-vertical-relative:text;mso-width-percent:0;mso-height-percent:0;mso-width-relative:page;mso-height-relative:page;v-text-anchor:top" o:gfxdata="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">
                 <v:textbox>
                   <w:txbxContent>
                     <w:p>
@@ -1514,7 +1512,7 @@
           </mc:Choice>
           <mc:Fallback>
             <w:pict>
-              <v:rect id="Rectangle 8" o:spid="_x0000_s1032" style="position:absolute;margin-left:18pt;margin-top:6.1pt;width:63pt;height:27pt;z-index:251652096;visibility:visible;mso-wrap-style:square;mso-width-percent:0;mso-height-percent:0;mso-wrap-distance-left:9pt;mso-wrap-distance-top:0;mso-wrap-distance-right:9pt;mso-wrap-distance-bottom:0;mso-position-horizontal:absolute;mso-position-horizontal-relative:text;mso-position-vertical:absolute;mso-position-vertical-relative:text;mso-width-percent:0;mso-height-percent:0;mso-width-relative:page;mso-height-relative:page;v-text-anchor:top" o:gfxdata="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">
+              <v:rect w14:anchorId="4091A8A2" id="Rectangle 8" o:spid="_x0000_s1032" style="position:absolute;margin-left:18pt;margin-top:6.1pt;width:63pt;height:27pt;z-index:251652096;visibility:visible;mso-wrap-style:square;mso-width-percent:0;mso-height-percent:0;mso-wrap-distance-left:9pt;mso-wrap-distance-top:0;mso-wrap-distance-right:9pt;mso-wrap-distance-bottom:0;mso-position-horizontal:absolute;mso-position-horizontal-relative:text;mso-position-vertical:absolute;mso-position-vertical-relative:text;mso-width-percent:0;mso-height-percent:0;mso-width-relative:page;mso-height-relative:page;v-text-anchor:top" o:gfxdata="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">
                 <v:textbox>
                   <w:txbxContent>
                     <w:p>
@@ -1766,15 +1764,8 @@
           <w:rFonts w:asciiTheme="minorBidi" w:hAnsiTheme="minorBidi" w:cstheme="minorBidi"/>
         </w:rPr>
         <w:tab/>
-      </w:r>
-      <w:proofErr w:type="gramStart"/>
-      <w:r>
-        <w:rPr>
-          <w:rFonts w:asciiTheme="minorBidi" w:hAnsiTheme="minorBidi" w:cstheme="minorBidi"/>
-        </w:rPr>
         <w:t>Household #2 information</w:t>
       </w:r>
-      <w:proofErr w:type="gramEnd"/>
     </w:p>
     <w:p>
       <w:pPr>
@@ -2630,21 +2621,12 @@
           <w:sz w:val="18"/>
         </w:rPr>
       </w:pPr>
-      <w:proofErr w:type="gramStart"/>
-      <w:r>
-        <w:rPr>
-          <w:rFonts w:ascii="Courier New" w:hAnsi="Courier New" w:cs="Courier New"/>
-          <w:sz w:val="18"/>
-        </w:rPr>
-        <w:t>two-level</w:t>
-      </w:r>
-      <w:proofErr w:type="gramEnd"/>
-      <w:r>
-        <w:rPr>
-          <w:rFonts w:ascii="Courier New" w:hAnsi="Courier New" w:cs="Courier New"/>
-          <w:sz w:val="18"/>
-        </w:rPr>
-        <w:t xml:space="preserve"> questionnaire                                     TWO_LEVEL_QUEST</w:t>
+      <w:r>
+        <w:rPr>
+          <w:rFonts w:ascii="Courier New" w:hAnsi="Courier New" w:cs="Courier New"/>
+          <w:sz w:val="18"/>
+        </w:rPr>
+        <w:t>two-level questionnaire                                     TWO_LEVEL_QUEST</w:t>
       </w:r>
     </w:p>
     <w:p>
@@ -2721,7 +2703,7 @@
           <w:rFonts w:ascii="Courier New" w:hAnsi="Courier New" w:cs="Courier New"/>
           <w:sz w:val="18"/>
         </w:rPr>
-        <w:t xml:space="preserve">  Person record                                               POP_RECC      </w:t>
+        <w:t xml:space="preserve">  Person record                                               POP_REC      </w:t>
       </w:r>
     </w:p>
     <w:p>
@@ -2872,148 +2854,87 @@
           <w:rFonts w:ascii="Courier New" w:hAnsi="Courier New" w:cs="Courier New"/>
           <w:sz w:val="18"/>
         </w:rPr>
-        <w:t xml:space="preserve">  (</w:t>
-      </w:r>
-      <w:proofErr w:type="gramStart"/>
-      <w:r>
-        <w:rPr>
-          <w:rFonts w:ascii="Courier New" w:hAnsi="Courier New" w:cs="Courier New"/>
-          <w:sz w:val="18"/>
-        </w:rPr>
-        <w:t>record</w:t>
-      </w:r>
-      <w:proofErr w:type="gramEnd"/>
-      <w:r>
-        <w:rPr>
-          <w:rFonts w:ascii="Courier New" w:hAnsi="Courier New" w:cs="Courier New"/>
-          <w:sz w:val="18"/>
-        </w:rPr>
-        <w:t xml:space="preserve"> type)                                                           1    </w:t>
-      </w:r>
-    </w:p>
-    <w:p>
-      <w:pPr>
-        <w:pStyle w:val="Header"/>
-        <w:rPr>
-          <w:rFonts w:ascii="Courier New" w:hAnsi="Courier New" w:cs="Courier New"/>
-          <w:sz w:val="18"/>
-        </w:rPr>
-      </w:pPr>
-      <w:proofErr w:type="gramStart"/>
-      <w:r>
-        <w:rPr>
-          <w:rFonts w:ascii="Courier New" w:hAnsi="Courier New" w:cs="Courier New"/>
-          <w:sz w:val="18"/>
-        </w:rPr>
-        <w:t>province</w:t>
-      </w:r>
-      <w:proofErr w:type="gramEnd"/>
-      <w:r>
-        <w:rPr>
-          <w:rFonts w:ascii="Courier New" w:hAnsi="Courier New" w:cs="Courier New"/>
-          <w:sz w:val="18"/>
-        </w:rPr>
-        <w:t xml:space="preserve">                                  (id) PROV                       2    </w:t>
-      </w:r>
-    </w:p>
-    <w:p>
-      <w:pPr>
-        <w:pStyle w:val="Header"/>
-        <w:rPr>
-          <w:rFonts w:ascii="Courier New" w:hAnsi="Courier New" w:cs="Courier New"/>
-          <w:sz w:val="18"/>
-        </w:rPr>
-      </w:pPr>
-      <w:proofErr w:type="gramStart"/>
-      <w:r>
-        <w:rPr>
-          <w:rFonts w:ascii="Courier New" w:hAnsi="Courier New" w:cs="Courier New"/>
-          <w:sz w:val="18"/>
-        </w:rPr>
-        <w:t>district</w:t>
-      </w:r>
-      <w:proofErr w:type="gramEnd"/>
-      <w:r>
-        <w:rPr>
-          <w:rFonts w:ascii="Courier New" w:hAnsi="Courier New" w:cs="Courier New"/>
-          <w:sz w:val="18"/>
-        </w:rPr>
-        <w:t xml:space="preserve">                                  (id) DIST                       4    </w:t>
-      </w:r>
-    </w:p>
-    <w:p>
-      <w:pPr>
-        <w:pStyle w:val="Header"/>
-        <w:rPr>
-          <w:rFonts w:ascii="Courier New" w:hAnsi="Courier New" w:cs="Courier New"/>
-          <w:sz w:val="18"/>
-        </w:rPr>
-      </w:pPr>
-      <w:proofErr w:type="gramStart"/>
-      <w:r>
-        <w:rPr>
-          <w:rFonts w:ascii="Courier New" w:hAnsi="Courier New" w:cs="Courier New"/>
-          <w:sz w:val="18"/>
-        </w:rPr>
-        <w:t>village</w:t>
-      </w:r>
-      <w:proofErr w:type="gramEnd"/>
-      <w:r>
-        <w:rPr>
-          <w:rFonts w:ascii="Courier New" w:hAnsi="Courier New" w:cs="Courier New"/>
-          <w:sz w:val="18"/>
-        </w:rPr>
-        <w:t xml:space="preserve">                                   (id) VILLAGE                    6    </w:t>
-      </w:r>
-    </w:p>
-    <w:p>
-      <w:pPr>
-        <w:pStyle w:val="Header"/>
-        <w:rPr>
-          <w:rFonts w:ascii="Courier New" w:hAnsi="Courier New" w:cs="Courier New"/>
-          <w:sz w:val="18"/>
-        </w:rPr>
-      </w:pPr>
-      <w:proofErr w:type="gramStart"/>
-      <w:r>
-        <w:rPr>
-          <w:rFonts w:ascii="Courier New" w:hAnsi="Courier New" w:cs="Courier New"/>
-          <w:sz w:val="18"/>
-        </w:rPr>
-        <w:t>enumeration</w:t>
-      </w:r>
-      <w:proofErr w:type="gramEnd"/>
-      <w:r>
-        <w:rPr>
-          <w:rFonts w:ascii="Courier New" w:hAnsi="Courier New" w:cs="Courier New"/>
-          <w:sz w:val="18"/>
-        </w:rPr>
-        <w:t xml:space="preserve"> area                          (id) EA                         8    </w:t>
-      </w:r>
-    </w:p>
-    <w:p>
-      <w:pPr>
-        <w:pStyle w:val="Header"/>
-        <w:rPr>
-          <w:rFonts w:ascii="Courier New" w:hAnsi="Courier New" w:cs="Courier New"/>
-          <w:sz w:val="18"/>
-        </w:rPr>
-      </w:pPr>
-      <w:proofErr w:type="gramStart"/>
-      <w:r>
-        <w:rPr>
-          <w:rFonts w:ascii="Courier New" w:hAnsi="Courier New" w:cs="Courier New"/>
-          <w:sz w:val="18"/>
-        </w:rPr>
-        <w:t>building</w:t>
-      </w:r>
-      <w:proofErr w:type="gramEnd"/>
-      <w:r>
-        <w:rPr>
-          <w:rFonts w:ascii="Courier New" w:hAnsi="Courier New" w:cs="Courier New"/>
-          <w:sz w:val="18"/>
-        </w:rPr>
-        <w:t xml:space="preserve"> number                           (id) BUILD                     11    </w:t>
+        <w:t xml:space="preserve">  (record type)                                                           1    </w:t>
+      </w:r>
+    </w:p>
+    <w:p>
+      <w:pPr>
+        <w:pStyle w:val="Header"/>
+        <w:rPr>
+          <w:rFonts w:ascii="Courier New" w:hAnsi="Courier New" w:cs="Courier New"/>
+          <w:sz w:val="18"/>
+        </w:rPr>
+      </w:pPr>
+      <w:r>
+        <w:rPr>
+          <w:rFonts w:ascii="Courier New" w:hAnsi="Courier New" w:cs="Courier New"/>
+          <w:sz w:val="18"/>
+        </w:rPr>
+        <w:t xml:space="preserve">province                                  (id) PROV                       2    </w:t>
+      </w:r>
+    </w:p>
+    <w:p>
+      <w:pPr>
+        <w:pStyle w:val="Header"/>
+        <w:rPr>
+          <w:rFonts w:ascii="Courier New" w:hAnsi="Courier New" w:cs="Courier New"/>
+          <w:sz w:val="18"/>
+        </w:rPr>
+      </w:pPr>
+      <w:r>
+        <w:rPr>
+          <w:rFonts w:ascii="Courier New" w:hAnsi="Courier New" w:cs="Courier New"/>
+          <w:sz w:val="18"/>
+        </w:rPr>
+        <w:t xml:space="preserve">district                                  (id) DIST                       4    </w:t>
+      </w:r>
+    </w:p>
+    <w:p>
+      <w:pPr>
+        <w:pStyle w:val="Header"/>
+        <w:rPr>
+          <w:rFonts w:ascii="Courier New" w:hAnsi="Courier New" w:cs="Courier New"/>
+          <w:sz w:val="18"/>
+        </w:rPr>
+      </w:pPr>
+      <w:r>
+        <w:rPr>
+          <w:rFonts w:ascii="Courier New" w:hAnsi="Courier New" w:cs="Courier New"/>
+          <w:sz w:val="18"/>
+        </w:rPr>
+        <w:t xml:space="preserve">village                                   (id) VILLAGE                    6    </w:t>
+      </w:r>
+    </w:p>
+    <w:p>
+      <w:pPr>
+        <w:pStyle w:val="Header"/>
+        <w:rPr>
+          <w:rFonts w:ascii="Courier New" w:hAnsi="Courier New" w:cs="Courier New"/>
+          <w:sz w:val="18"/>
+        </w:rPr>
+      </w:pPr>
+      <w:r>
+        <w:rPr>
+          <w:rFonts w:ascii="Courier New" w:hAnsi="Courier New" w:cs="Courier New"/>
+          <w:sz w:val="18"/>
+        </w:rPr>
+        <w:t xml:space="preserve">enumeration area                          (id) EA                         8    </w:t>
+      </w:r>
+    </w:p>
+    <w:p>
+      <w:pPr>
+        <w:pStyle w:val="Header"/>
+        <w:rPr>
+          <w:rFonts w:ascii="Courier New" w:hAnsi="Courier New" w:cs="Courier New"/>
+          <w:sz w:val="18"/>
+        </w:rPr>
+      </w:pPr>
+      <w:r>
+        <w:rPr>
+          <w:rFonts w:ascii="Courier New" w:hAnsi="Courier New" w:cs="Courier New"/>
+          <w:sz w:val="18"/>
+        </w:rPr>
+        <w:t xml:space="preserve">building number                           (id) BUILD                     11    </w:t>
       </w:r>
     </w:p>
     <w:p>
@@ -3198,148 +3119,87 @@
           <w:rFonts w:ascii="Courier New" w:hAnsi="Courier New" w:cs="Courier New"/>
           <w:sz w:val="18"/>
         </w:rPr>
-        <w:t xml:space="preserve">  (</w:t>
-      </w:r>
-      <w:proofErr w:type="gramStart"/>
-      <w:r>
-        <w:rPr>
-          <w:rFonts w:ascii="Courier New" w:hAnsi="Courier New" w:cs="Courier New"/>
-          <w:sz w:val="18"/>
-        </w:rPr>
-        <w:t>record</w:t>
-      </w:r>
-      <w:proofErr w:type="gramEnd"/>
-      <w:r>
-        <w:rPr>
-          <w:rFonts w:ascii="Courier New" w:hAnsi="Courier New" w:cs="Courier New"/>
-          <w:sz w:val="18"/>
-        </w:rPr>
-        <w:t xml:space="preserve"> type)                                                           1    </w:t>
-      </w:r>
-    </w:p>
-    <w:p>
-      <w:pPr>
-        <w:pStyle w:val="Header"/>
-        <w:rPr>
-          <w:rFonts w:ascii="Courier New" w:hAnsi="Courier New" w:cs="Courier New"/>
-          <w:sz w:val="18"/>
-        </w:rPr>
-      </w:pPr>
-      <w:proofErr w:type="gramStart"/>
-      <w:r>
-        <w:rPr>
-          <w:rFonts w:ascii="Courier New" w:hAnsi="Courier New" w:cs="Courier New"/>
-          <w:sz w:val="18"/>
-        </w:rPr>
-        <w:t>province</w:t>
-      </w:r>
-      <w:proofErr w:type="gramEnd"/>
-      <w:r>
-        <w:rPr>
-          <w:rFonts w:ascii="Courier New" w:hAnsi="Courier New" w:cs="Courier New"/>
-          <w:sz w:val="18"/>
-        </w:rPr>
-        <w:t xml:space="preserve">                                  (id) PROV                       2    </w:t>
-      </w:r>
-    </w:p>
-    <w:p>
-      <w:pPr>
-        <w:pStyle w:val="Header"/>
-        <w:rPr>
-          <w:rFonts w:ascii="Courier New" w:hAnsi="Courier New" w:cs="Courier New"/>
-          <w:sz w:val="18"/>
-        </w:rPr>
-      </w:pPr>
-      <w:proofErr w:type="gramStart"/>
-      <w:r>
-        <w:rPr>
-          <w:rFonts w:ascii="Courier New" w:hAnsi="Courier New" w:cs="Courier New"/>
-          <w:sz w:val="18"/>
-        </w:rPr>
-        <w:t>district</w:t>
-      </w:r>
-      <w:proofErr w:type="gramEnd"/>
-      <w:r>
-        <w:rPr>
-          <w:rFonts w:ascii="Courier New" w:hAnsi="Courier New" w:cs="Courier New"/>
-          <w:sz w:val="18"/>
-        </w:rPr>
-        <w:t xml:space="preserve">                                  (id) DIST                       4    </w:t>
-      </w:r>
-    </w:p>
-    <w:p>
-      <w:pPr>
-        <w:pStyle w:val="Header"/>
-        <w:rPr>
-          <w:rFonts w:ascii="Courier New" w:hAnsi="Courier New" w:cs="Courier New"/>
-          <w:sz w:val="18"/>
-        </w:rPr>
-      </w:pPr>
-      <w:proofErr w:type="gramStart"/>
-      <w:r>
-        <w:rPr>
-          <w:rFonts w:ascii="Courier New" w:hAnsi="Courier New" w:cs="Courier New"/>
-          <w:sz w:val="18"/>
-        </w:rPr>
-        <w:t>village</w:t>
-      </w:r>
-      <w:proofErr w:type="gramEnd"/>
-      <w:r>
-        <w:rPr>
-          <w:rFonts w:ascii="Courier New" w:hAnsi="Courier New" w:cs="Courier New"/>
-          <w:sz w:val="18"/>
-        </w:rPr>
-        <w:t xml:space="preserve">                                   (id) VILLAGE                    6    </w:t>
-      </w:r>
-    </w:p>
-    <w:p>
-      <w:pPr>
-        <w:pStyle w:val="Header"/>
-        <w:rPr>
-          <w:rFonts w:ascii="Courier New" w:hAnsi="Courier New" w:cs="Courier New"/>
-          <w:sz w:val="18"/>
-        </w:rPr>
-      </w:pPr>
-      <w:proofErr w:type="gramStart"/>
-      <w:r>
-        <w:rPr>
-          <w:rFonts w:ascii="Courier New" w:hAnsi="Courier New" w:cs="Courier New"/>
-          <w:sz w:val="18"/>
-        </w:rPr>
-        <w:t>enumeration</w:t>
-      </w:r>
-      <w:proofErr w:type="gramEnd"/>
-      <w:r>
-        <w:rPr>
-          <w:rFonts w:ascii="Courier New" w:hAnsi="Courier New" w:cs="Courier New"/>
-          <w:sz w:val="18"/>
-        </w:rPr>
-        <w:t xml:space="preserve"> area                          (id) EA                         8    </w:t>
-      </w:r>
-    </w:p>
-    <w:p>
-      <w:pPr>
-        <w:pStyle w:val="Header"/>
-        <w:rPr>
-          <w:rFonts w:ascii="Courier New" w:hAnsi="Courier New" w:cs="Courier New"/>
-          <w:sz w:val="18"/>
-        </w:rPr>
-      </w:pPr>
-      <w:proofErr w:type="gramStart"/>
-      <w:r>
-        <w:rPr>
-          <w:rFonts w:ascii="Courier New" w:hAnsi="Courier New" w:cs="Courier New"/>
-          <w:sz w:val="18"/>
-        </w:rPr>
-        <w:t>building</w:t>
-      </w:r>
-      <w:proofErr w:type="gramEnd"/>
-      <w:r>
-        <w:rPr>
-          <w:rFonts w:ascii="Courier New" w:hAnsi="Courier New" w:cs="Courier New"/>
-          <w:sz w:val="18"/>
-        </w:rPr>
-        <w:t xml:space="preserve"> number                           (id) BUILD                     11    </w:t>
+        <w:t xml:space="preserve">  (record type)                                                           1    </w:t>
+      </w:r>
+    </w:p>
+    <w:p>
+      <w:pPr>
+        <w:pStyle w:val="Header"/>
+        <w:rPr>
+          <w:rFonts w:ascii="Courier New" w:hAnsi="Courier New" w:cs="Courier New"/>
+          <w:sz w:val="18"/>
+        </w:rPr>
+      </w:pPr>
+      <w:r>
+        <w:rPr>
+          <w:rFonts w:ascii="Courier New" w:hAnsi="Courier New" w:cs="Courier New"/>
+          <w:sz w:val="18"/>
+        </w:rPr>
+        <w:t xml:space="preserve">province                                  (id) PROV                       2    </w:t>
+      </w:r>
+    </w:p>
+    <w:p>
+      <w:pPr>
+        <w:pStyle w:val="Header"/>
+        <w:rPr>
+          <w:rFonts w:ascii="Courier New" w:hAnsi="Courier New" w:cs="Courier New"/>
+          <w:sz w:val="18"/>
+        </w:rPr>
+      </w:pPr>
+      <w:r>
+        <w:rPr>
+          <w:rFonts w:ascii="Courier New" w:hAnsi="Courier New" w:cs="Courier New"/>
+          <w:sz w:val="18"/>
+        </w:rPr>
+        <w:t xml:space="preserve">district                                  (id) DIST                       4    </w:t>
+      </w:r>
+    </w:p>
+    <w:p>
+      <w:pPr>
+        <w:pStyle w:val="Header"/>
+        <w:rPr>
+          <w:rFonts w:ascii="Courier New" w:hAnsi="Courier New" w:cs="Courier New"/>
+          <w:sz w:val="18"/>
+        </w:rPr>
+      </w:pPr>
+      <w:r>
+        <w:rPr>
+          <w:rFonts w:ascii="Courier New" w:hAnsi="Courier New" w:cs="Courier New"/>
+          <w:sz w:val="18"/>
+        </w:rPr>
+        <w:t xml:space="preserve">village                                   (id) VILLAGE                    6    </w:t>
+      </w:r>
+    </w:p>
+    <w:p>
+      <w:pPr>
+        <w:pStyle w:val="Header"/>
+        <w:rPr>
+          <w:rFonts w:ascii="Courier New" w:hAnsi="Courier New" w:cs="Courier New"/>
+          <w:sz w:val="18"/>
+        </w:rPr>
+      </w:pPr>
+      <w:r>
+        <w:rPr>
+          <w:rFonts w:ascii="Courier New" w:hAnsi="Courier New" w:cs="Courier New"/>
+          <w:sz w:val="18"/>
+        </w:rPr>
+        <w:t xml:space="preserve">enumeration area                          (id) EA                         8    </w:t>
+      </w:r>
+    </w:p>
+    <w:p>
+      <w:pPr>
+        <w:pStyle w:val="Header"/>
+        <w:rPr>
+          <w:rFonts w:ascii="Courier New" w:hAnsi="Courier New" w:cs="Courier New"/>
+          <w:sz w:val="18"/>
+        </w:rPr>
+      </w:pPr>
+      <w:r>
+        <w:rPr>
+          <w:rFonts w:ascii="Courier New" w:hAnsi="Courier New" w:cs="Courier New"/>
+          <w:sz w:val="18"/>
+        </w:rPr>
+        <w:t xml:space="preserve">building number                           (id) BUILD                     11    </w:t>
       </w:r>
     </w:p>
     <w:p>
@@ -3540,148 +3400,87 @@
           <w:rFonts w:ascii="Courier New" w:hAnsi="Courier New" w:cs="Courier New"/>
           <w:sz w:val="18"/>
         </w:rPr>
-        <w:t xml:space="preserve">  (</w:t>
-      </w:r>
-      <w:proofErr w:type="gramStart"/>
-      <w:r>
-        <w:rPr>
-          <w:rFonts w:ascii="Courier New" w:hAnsi="Courier New" w:cs="Courier New"/>
-          <w:sz w:val="18"/>
-        </w:rPr>
-        <w:t>record</w:t>
-      </w:r>
-      <w:proofErr w:type="gramEnd"/>
-      <w:r>
-        <w:rPr>
-          <w:rFonts w:ascii="Courier New" w:hAnsi="Courier New" w:cs="Courier New"/>
-          <w:sz w:val="18"/>
-        </w:rPr>
-        <w:t xml:space="preserve"> type)                                                           1    </w:t>
-      </w:r>
-    </w:p>
-    <w:p>
-      <w:pPr>
-        <w:pStyle w:val="Header"/>
-        <w:rPr>
-          <w:rFonts w:ascii="Courier New" w:hAnsi="Courier New" w:cs="Courier New"/>
-          <w:sz w:val="18"/>
-        </w:rPr>
-      </w:pPr>
-      <w:proofErr w:type="gramStart"/>
-      <w:r>
-        <w:rPr>
-          <w:rFonts w:ascii="Courier New" w:hAnsi="Courier New" w:cs="Courier New"/>
-          <w:sz w:val="18"/>
-        </w:rPr>
-        <w:t>province</w:t>
-      </w:r>
-      <w:proofErr w:type="gramEnd"/>
-      <w:r>
-        <w:rPr>
-          <w:rFonts w:ascii="Courier New" w:hAnsi="Courier New" w:cs="Courier New"/>
-          <w:sz w:val="18"/>
-        </w:rPr>
-        <w:t xml:space="preserve">                                  (id) PROV                       2    </w:t>
-      </w:r>
-    </w:p>
-    <w:p>
-      <w:pPr>
-        <w:pStyle w:val="Header"/>
-        <w:rPr>
-          <w:rFonts w:ascii="Courier New" w:hAnsi="Courier New" w:cs="Courier New"/>
-          <w:sz w:val="18"/>
-        </w:rPr>
-      </w:pPr>
-      <w:proofErr w:type="gramStart"/>
-      <w:r>
-        <w:rPr>
-          <w:rFonts w:ascii="Courier New" w:hAnsi="Courier New" w:cs="Courier New"/>
-          <w:sz w:val="18"/>
-        </w:rPr>
-        <w:t>district</w:t>
-      </w:r>
-      <w:proofErr w:type="gramEnd"/>
-      <w:r>
-        <w:rPr>
-          <w:rFonts w:ascii="Courier New" w:hAnsi="Courier New" w:cs="Courier New"/>
-          <w:sz w:val="18"/>
-        </w:rPr>
-        <w:t xml:space="preserve">                                  (id) DIST                       4    </w:t>
-      </w:r>
-    </w:p>
-    <w:p>
-      <w:pPr>
-        <w:pStyle w:val="Header"/>
-        <w:rPr>
-          <w:rFonts w:ascii="Courier New" w:hAnsi="Courier New" w:cs="Courier New"/>
-          <w:sz w:val="18"/>
-        </w:rPr>
-      </w:pPr>
-      <w:proofErr w:type="gramStart"/>
-      <w:r>
-        <w:rPr>
-          <w:rFonts w:ascii="Courier New" w:hAnsi="Courier New" w:cs="Courier New"/>
-          <w:sz w:val="18"/>
-        </w:rPr>
-        <w:t>village</w:t>
-      </w:r>
-      <w:proofErr w:type="gramEnd"/>
-      <w:r>
-        <w:rPr>
-          <w:rFonts w:ascii="Courier New" w:hAnsi="Courier New" w:cs="Courier New"/>
-          <w:sz w:val="18"/>
-        </w:rPr>
-        <w:t xml:space="preserve">                                   (id) VILLAGE                    6    </w:t>
-      </w:r>
-    </w:p>
-    <w:p>
-      <w:pPr>
-        <w:pStyle w:val="Header"/>
-        <w:rPr>
-          <w:rFonts w:ascii="Courier New" w:hAnsi="Courier New" w:cs="Courier New"/>
-          <w:sz w:val="18"/>
-        </w:rPr>
-      </w:pPr>
-      <w:proofErr w:type="gramStart"/>
-      <w:r>
-        <w:rPr>
-          <w:rFonts w:ascii="Courier New" w:hAnsi="Courier New" w:cs="Courier New"/>
-          <w:sz w:val="18"/>
-        </w:rPr>
-        <w:t>enumeration</w:t>
-      </w:r>
-      <w:proofErr w:type="gramEnd"/>
-      <w:r>
-        <w:rPr>
-          <w:rFonts w:ascii="Courier New" w:hAnsi="Courier New" w:cs="Courier New"/>
-          <w:sz w:val="18"/>
-        </w:rPr>
-        <w:t xml:space="preserve"> area                          (id) EA                         8    </w:t>
-      </w:r>
-    </w:p>
-    <w:p>
-      <w:pPr>
-        <w:pStyle w:val="Header"/>
-        <w:rPr>
-          <w:rFonts w:ascii="Courier New" w:hAnsi="Courier New" w:cs="Courier New"/>
-          <w:sz w:val="18"/>
-        </w:rPr>
-      </w:pPr>
-      <w:proofErr w:type="gramStart"/>
-      <w:r>
-        <w:rPr>
-          <w:rFonts w:ascii="Courier New" w:hAnsi="Courier New" w:cs="Courier New"/>
-          <w:sz w:val="18"/>
-        </w:rPr>
-        <w:t>building</w:t>
-      </w:r>
-      <w:proofErr w:type="gramEnd"/>
-      <w:r>
-        <w:rPr>
-          <w:rFonts w:ascii="Courier New" w:hAnsi="Courier New" w:cs="Courier New"/>
-          <w:sz w:val="18"/>
-        </w:rPr>
-        <w:t xml:space="preserve"> number                           (id) BUILD                     11    </w:t>
+        <w:t xml:space="preserve">  (record type)                                                           1    </w:t>
+      </w:r>
+    </w:p>
+    <w:p>
+      <w:pPr>
+        <w:pStyle w:val="Header"/>
+        <w:rPr>
+          <w:rFonts w:ascii="Courier New" w:hAnsi="Courier New" w:cs="Courier New"/>
+          <w:sz w:val="18"/>
+        </w:rPr>
+      </w:pPr>
+      <w:r>
+        <w:rPr>
+          <w:rFonts w:ascii="Courier New" w:hAnsi="Courier New" w:cs="Courier New"/>
+          <w:sz w:val="18"/>
+        </w:rPr>
+        <w:t xml:space="preserve">province                                  (id) PROV                       2    </w:t>
+      </w:r>
+    </w:p>
+    <w:p>
+      <w:pPr>
+        <w:pStyle w:val="Header"/>
+        <w:rPr>
+          <w:rFonts w:ascii="Courier New" w:hAnsi="Courier New" w:cs="Courier New"/>
+          <w:sz w:val="18"/>
+        </w:rPr>
+      </w:pPr>
+      <w:r>
+        <w:rPr>
+          <w:rFonts w:ascii="Courier New" w:hAnsi="Courier New" w:cs="Courier New"/>
+          <w:sz w:val="18"/>
+        </w:rPr>
+        <w:t xml:space="preserve">district                                  (id) DIST                       4    </w:t>
+      </w:r>
+    </w:p>
+    <w:p>
+      <w:pPr>
+        <w:pStyle w:val="Header"/>
+        <w:rPr>
+          <w:rFonts w:ascii="Courier New" w:hAnsi="Courier New" w:cs="Courier New"/>
+          <w:sz w:val="18"/>
+        </w:rPr>
+      </w:pPr>
+      <w:r>
+        <w:rPr>
+          <w:rFonts w:ascii="Courier New" w:hAnsi="Courier New" w:cs="Courier New"/>
+          <w:sz w:val="18"/>
+        </w:rPr>
+        <w:t xml:space="preserve">village                                   (id) VILLAGE                    6    </w:t>
+      </w:r>
+    </w:p>
+    <w:p>
+      <w:pPr>
+        <w:pStyle w:val="Header"/>
+        <w:rPr>
+          <w:rFonts w:ascii="Courier New" w:hAnsi="Courier New" w:cs="Courier New"/>
+          <w:sz w:val="18"/>
+        </w:rPr>
+      </w:pPr>
+      <w:r>
+        <w:rPr>
+          <w:rFonts w:ascii="Courier New" w:hAnsi="Courier New" w:cs="Courier New"/>
+          <w:sz w:val="18"/>
+        </w:rPr>
+        <w:t xml:space="preserve">enumeration area                          (id) EA                         8    </w:t>
+      </w:r>
+    </w:p>
+    <w:p>
+      <w:pPr>
+        <w:pStyle w:val="Header"/>
+        <w:rPr>
+          <w:rFonts w:ascii="Courier New" w:hAnsi="Courier New" w:cs="Courier New"/>
+          <w:sz w:val="18"/>
+        </w:rPr>
+      </w:pPr>
+      <w:r>
+        <w:rPr>
+          <w:rFonts w:ascii="Courier New" w:hAnsi="Courier New" w:cs="Courier New"/>
+          <w:sz w:val="18"/>
+        </w:rPr>
+        <w:t xml:space="preserve">building number                           (id) BUILD                     11    </w:t>
       </w:r>
     </w:p>
     <w:p>
@@ -3932,6 +3731,115 @@
                 <pic:pic xmlns:pic="http://schemas.openxmlformats.org/drawingml/2006/picture">
                   <pic:nvPicPr>
                     <pic:cNvPr id="0" name="Picture 1"/>
+                    <pic:cNvPicPr>
+                      <a:picLocks noChangeAspect="1" noChangeArrowheads="1"/>
+                    </pic:cNvPicPr>
+                  </pic:nvPicPr>
+                  <pic:blipFill>
+                    <a:blip r:embed="rId7">
+                      <a:extLst>
+                        <a:ext uri="{28A0092B-C50C-407E-A947-70E740481C1C}">
+                          <a14:useLocalDpi xmlns:a14="http://schemas.microsoft.com/office/drawing/2010/main" val="0"/>
+                        </a:ext>
+                      </a:extLst>
+                    </a:blip>
+                    <a:srcRect/>
+                    <a:stretch>
+                      <a:fillRect/>
+                    </a:stretch>
+                  </pic:blipFill>
+                  <pic:spPr bwMode="auto">
+                    <a:xfrm>
+                      <a:off x="0" y="0"/>
+                      <a:ext cx="5486400" cy="3571875"/>
+                    </a:xfrm>
+                    <a:prstGeom prst="rect">
+                      <a:avLst/>
+                    </a:prstGeom>
+                    <a:noFill/>
+                    <a:ln>
+                      <a:noFill/>
+                    </a:ln>
+                  </pic:spPr>
+                </pic:pic>
+              </a:graphicData>
+            </a:graphic>
+          </wp:inline>
+        </w:drawing>
+      </w:r>
+    </w:p>
+    <w:p>
+      <w:pPr>
+        <w:pStyle w:val="Header"/>
+        <w:tabs>
+          <w:tab w:val="clear" w:pos="4320"/>
+          <w:tab w:val="clear" w:pos="8640"/>
+        </w:tabs>
+        <w:rPr>
+          <w:rFonts w:ascii="Courier New" w:hAnsi="Courier New" w:cs="Courier New"/>
+          <w:sz w:val="20"/>
+        </w:rPr>
+      </w:pPr>
+    </w:p>
+    <w:p>
+      <w:pPr>
+        <w:pStyle w:val="Header"/>
+        <w:tabs>
+          <w:tab w:val="clear" w:pos="4320"/>
+          <w:tab w:val="clear" w:pos="8640"/>
+        </w:tabs>
+        <w:rPr>
+          <w:rFonts w:ascii="Arial" w:hAnsi="Arial" w:cs="Arial"/>
+        </w:rPr>
+      </w:pPr>
+      <w:r>
+        <w:rPr>
+          <w:rFonts w:ascii="Arial" w:hAnsi="Arial" w:cs="Arial"/>
+        </w:rPr>
+        <w:t>Sample Node Level Form [Household and Person records]</w:t>
+      </w:r>
+    </w:p>
+    <w:p>
+      <w:pPr>
+        <w:pStyle w:val="Header"/>
+        <w:tabs>
+          <w:tab w:val="clear" w:pos="4320"/>
+          <w:tab w:val="clear" w:pos="8640"/>
+        </w:tabs>
+        <w:rPr>
+          <w:rFonts w:ascii="Arial" w:hAnsi="Arial" w:cs="Arial"/>
+        </w:rPr>
+      </w:pPr>
+    </w:p>
+    <w:p>
+      <w:pPr>
+        <w:pStyle w:val="Header"/>
+        <w:tabs>
+          <w:tab w:val="clear" w:pos="4320"/>
+          <w:tab w:val="clear" w:pos="8640"/>
+        </w:tabs>
+        <w:rPr>
+          <w:rFonts w:ascii="Arial" w:hAnsi="Arial" w:cs="Arial"/>
+        </w:rPr>
+      </w:pPr>
+      <w:r>
+        <w:rPr>
+          <w:rFonts w:ascii="Arial" w:hAnsi="Arial" w:cs="Arial"/>
+          <w:noProof/>
+        </w:rPr>
+        <w:drawing>
+          <wp:inline distT="0" distB="0" distL="0" distR="0" wp14:anchorId="33DC7985" wp14:editId="2C2EB909">
+            <wp:extent cx="5486400" cy="3571875"/>
+            <wp:effectExtent l="0" t="0" r="0" b="9525"/>
+            <wp:docPr id="2" name="Picture 2"/>
+            <wp:cNvGraphicFramePr>
+              <a:graphicFrameLocks xmlns:a="http://schemas.openxmlformats.org/drawingml/2006/main" noChangeAspect="1"/>
+            </wp:cNvGraphicFramePr>
+            <a:graphic xmlns:a="http://schemas.openxmlformats.org/drawingml/2006/main">
+              <a:graphicData uri="http://schemas.openxmlformats.org/drawingml/2006/picture">
+                <pic:pic xmlns:pic="http://schemas.openxmlformats.org/drawingml/2006/picture">
+                  <pic:nvPicPr>
+                    <pic:cNvPr id="0" name="Picture 2"/>
                     <pic:cNvPicPr>
                       <a:picLocks noChangeAspect="1" noChangeArrowheads="1"/>
                     </pic:cNvPicPr>
@@ -3977,115 +3885,6 @@
           <w:tab w:val="clear" w:pos="8640"/>
         </w:tabs>
         <w:rPr>
-          <w:rFonts w:ascii="Courier New" w:hAnsi="Courier New" w:cs="Courier New"/>
-          <w:sz w:val="20"/>
-        </w:rPr>
-      </w:pPr>
-    </w:p>
-    <w:p>
-      <w:pPr>
-        <w:pStyle w:val="Header"/>
-        <w:tabs>
-          <w:tab w:val="clear" w:pos="4320"/>
-          <w:tab w:val="clear" w:pos="8640"/>
-        </w:tabs>
-        <w:rPr>
-          <w:rFonts w:ascii="Arial" w:hAnsi="Arial" w:cs="Arial"/>
-        </w:rPr>
-      </w:pPr>
-      <w:r>
-        <w:rPr>
-          <w:rFonts w:ascii="Arial" w:hAnsi="Arial" w:cs="Arial"/>
-        </w:rPr>
-        <w:t>Sample Node Level Form [Household and Person records]</w:t>
-      </w:r>
-    </w:p>
-    <w:p>
-      <w:pPr>
-        <w:pStyle w:val="Header"/>
-        <w:tabs>
-          <w:tab w:val="clear" w:pos="4320"/>
-          <w:tab w:val="clear" w:pos="8640"/>
-        </w:tabs>
-        <w:rPr>
-          <w:rFonts w:ascii="Arial" w:hAnsi="Arial" w:cs="Arial"/>
-        </w:rPr>
-      </w:pPr>
-    </w:p>
-    <w:p>
-      <w:pPr>
-        <w:pStyle w:val="Header"/>
-        <w:tabs>
-          <w:tab w:val="clear" w:pos="4320"/>
-          <w:tab w:val="clear" w:pos="8640"/>
-        </w:tabs>
-        <w:rPr>
-          <w:rFonts w:ascii="Arial" w:hAnsi="Arial" w:cs="Arial"/>
-        </w:rPr>
-      </w:pPr>
-      <w:r>
-        <w:rPr>
-          <w:rFonts w:ascii="Arial" w:hAnsi="Arial" w:cs="Arial"/>
-          <w:noProof/>
-        </w:rPr>
-        <w:drawing>
-          <wp:inline distT="0" distB="0" distL="0" distR="0" wp14:anchorId="33DC7985" wp14:editId="2C2EB909">
-            <wp:extent cx="5486400" cy="3571875"/>
-            <wp:effectExtent l="0" t="0" r="0" b="9525"/>
-            <wp:docPr id="2" name="Picture 2"/>
-            <wp:cNvGraphicFramePr>
-              <a:graphicFrameLocks xmlns:a="http://schemas.openxmlformats.org/drawingml/2006/main" noChangeAspect="1"/>
-            </wp:cNvGraphicFramePr>
-            <a:graphic xmlns:a="http://schemas.openxmlformats.org/drawingml/2006/main">
-              <a:graphicData uri="http://schemas.openxmlformats.org/drawingml/2006/picture">
-                <pic:pic xmlns:pic="http://schemas.openxmlformats.org/drawingml/2006/picture">
-                  <pic:nvPicPr>
-                    <pic:cNvPr id="0" name="Picture 2"/>
-                    <pic:cNvPicPr>
-                      <a:picLocks noChangeAspect="1" noChangeArrowheads="1"/>
-                    </pic:cNvPicPr>
-                  </pic:nvPicPr>
-                  <pic:blipFill>
-                    <a:blip r:embed="rId9">
-                      <a:extLst>
-                        <a:ext uri="{28A0092B-C50C-407E-A947-70E740481C1C}">
-                          <a14:useLocalDpi xmlns:a14="http://schemas.microsoft.com/office/drawing/2010/main" val="0"/>
-                        </a:ext>
-                      </a:extLst>
-                    </a:blip>
-                    <a:srcRect/>
-                    <a:stretch>
-                      <a:fillRect/>
-                    </a:stretch>
-                  </pic:blipFill>
-                  <pic:spPr bwMode="auto">
-                    <a:xfrm>
-                      <a:off x="0" y="0"/>
-                      <a:ext cx="5486400" cy="3571875"/>
-                    </a:xfrm>
-                    <a:prstGeom prst="rect">
-                      <a:avLst/>
-                    </a:prstGeom>
-                    <a:noFill/>
-                    <a:ln>
-                      <a:noFill/>
-                    </a:ln>
-                  </pic:spPr>
-                </pic:pic>
-              </a:graphicData>
-            </a:graphic>
-          </wp:inline>
-        </w:drawing>
-      </w:r>
-    </w:p>
-    <w:p>
-      <w:pPr>
-        <w:pStyle w:val="Header"/>
-        <w:tabs>
-          <w:tab w:val="clear" w:pos="4320"/>
-          <w:tab w:val="clear" w:pos="8640"/>
-        </w:tabs>
-        <w:rPr>
           <w:rFonts w:ascii="Arial" w:hAnsi="Arial" w:cs="Arial"/>
         </w:rPr>
       </w:pPr>
@@ -4310,19 +4109,11 @@
         </w:rPr>
         <w:t xml:space="preserve">Ctrl+F12 to complete case </w:t>
       </w:r>
-      <w:proofErr w:type="gramStart"/>
       <w:r>
         <w:rPr>
           <w:rFonts w:ascii="Arial" w:hAnsi="Arial" w:cs="Arial"/>
         </w:rPr>
-        <w:t>[ or</w:t>
-      </w:r>
-      <w:proofErr w:type="gramEnd"/>
-      <w:r>
-        <w:rPr>
-          <w:rFonts w:ascii="Arial" w:hAnsi="Arial" w:cs="Arial"/>
-        </w:rPr>
-        <w:t xml:space="preserve"> you can Partial Save if allowed].</w:t>
+        <w:t>[ or you can Partial Save if allowed].</w:t>
       </w:r>
     </w:p>
     <w:p>
@@ -4427,50 +4218,36 @@
         <w:rPr>
           <w:rFonts w:ascii="Arial" w:hAnsi="Arial" w:cs="Arial"/>
         </w:rPr>
-        <w:t xml:space="preserve"> </w:t>
-      </w:r>
-      <w:proofErr w:type="gramStart"/>
+        <w:t xml:space="preserve"> building ID  </w:t>
+      </w:r>
       <w:r>
         <w:rPr>
           <w:rFonts w:ascii="Arial" w:hAnsi="Arial" w:cs="Arial"/>
         </w:rPr>
-        <w:t>building</w:t>
-      </w:r>
-      <w:proofErr w:type="gramEnd"/>
+        <w:sym w:font="Wingdings" w:char="F0E0"/>
+      </w:r>
       <w:r>
         <w:rPr>
           <w:rFonts w:ascii="Arial" w:hAnsi="Arial" w:cs="Arial"/>
         </w:rPr>
-        <w:t xml:space="preserve"> ID  </w:t>
-      </w:r>
-      <w:r>
+        <w:t>&lt;HH&gt;&lt;- record data -&gt;</w:t>
+      </w:r>
+    </w:p>
+    <w:p>
+      <w:pPr>
+        <w:pStyle w:val="Header"/>
+        <w:tabs>
+          <w:tab w:val="clear" w:pos="4320"/>
+          <w:tab w:val="clear" w:pos="8640"/>
+        </w:tabs>
         <w:rPr>
           <w:rFonts w:ascii="Arial" w:hAnsi="Arial" w:cs="Arial"/>
         </w:rPr>
-        <w:sym w:font="Wingdings" w:char="F0E0"/>
-      </w:r>
+      </w:pPr>
       <w:r>
         <w:rPr>
           <w:rFonts w:ascii="Arial" w:hAnsi="Arial" w:cs="Arial"/>
         </w:rPr>
-        <w:t>&lt;HH&gt;&lt;- record data -&gt;</w:t>
-      </w:r>
-    </w:p>
-    <w:p>
-      <w:pPr>
-        <w:pStyle w:val="Header"/>
-        <w:tabs>
-          <w:tab w:val="clear" w:pos="4320"/>
-          <w:tab w:val="clear" w:pos="8640"/>
-        </w:tabs>
-        <w:rPr>
-          <w:rFonts w:ascii="Arial" w:hAnsi="Arial" w:cs="Arial"/>
-        </w:rPr>
-      </w:pPr>
-      <w:r>
-        <w:rPr>
-          <w:rFonts w:ascii="Arial" w:hAnsi="Arial" w:cs="Arial"/>
-        </w:rPr>
         <w:t xml:space="preserve">                                         ID</w:t>
       </w:r>
     </w:p>
@@ -4486,21 +4263,7 @@
         <w:rPr>
           <w:rFonts w:ascii="Courier New" w:hAnsi="Courier New" w:cs="Courier New"/>
         </w:rPr>
-        <w:t xml:space="preserve">1010101001001   </w:t>
-      </w:r>
-      <w:proofErr w:type="gramStart"/>
-      <w:r>
-        <w:rPr>
-          <w:rFonts w:ascii="Courier New" w:hAnsi="Courier New" w:cs="Courier New"/>
-        </w:rPr>
-        <w:t>11001  &lt;</w:t>
-      </w:r>
-      <w:proofErr w:type="gramEnd"/>
-      <w:r>
-        <w:rPr>
-          <w:rFonts w:ascii="Courier New" w:hAnsi="Courier New" w:cs="Courier New"/>
-        </w:rPr>
-        <w:t>- building</w:t>
+        <w:t>1010101001001   11001  &lt;- building</w:t>
       </w:r>
     </w:p>
     <w:p>
@@ -4654,12 +4417,12 @@
       </w:r>
     </w:p>
     <w:sectPr>
-      <w:headerReference w:type="even" r:id="rId10"/>
-      <w:headerReference w:type="default" r:id="rId11"/>
-      <w:footerReference w:type="even" r:id="rId12"/>
-      <w:footerReference w:type="default" r:id="rId13"/>
-      <w:headerReference w:type="first" r:id="rId14"/>
-      <w:footerReference w:type="first" r:id="rId15"/>
+      <w:headerReference w:type="even" r:id="rId9"/>
+      <w:headerReference w:type="default" r:id="rId10"/>
+      <w:footerReference w:type="even" r:id="rId11"/>
+      <w:footerReference w:type="default" r:id="rId12"/>
+      <w:headerReference w:type="first" r:id="rId13"/>
+      <w:footerReference w:type="first" r:id="rId14"/>
       <w:pgSz w:w="12240" w:h="15840"/>
       <w:pgMar w:top="1440" w:right="1800" w:bottom="1440" w:left="1800" w:header="720" w:footer="720" w:gutter="0"/>
       <w:cols w:space="720"/>
@@ -4670,7 +4433,7 @@
 </file>
 
 <file path=word/endnotes.xml><?xml version="1.0" encoding="utf-8"?>
-<w:endnotes xmlns:wpc="http://schemas.microsoft.com/office/word/2010/wordprocessingCanvas" xmlns:mc="http://schemas.openxmlformats.org/markup-compatibility/2006" xmlns:o="urn:schemas-microsoft-com:office:office" xmlns:r="http://schemas.openxmlformats.org/officeDocument/2006/relationships" xmlns:m="http://schemas.openxmlformats.org/officeDocument/2006/math" xmlns:v="urn:schemas-microsoft-com:vml" xmlns:wp14="http://schemas.microsoft.com/office/word/2010/wordprocessingDrawing" xmlns:wp="http://schemas.openxmlformats.org/drawingml/2006/wordprocessingDrawing" xmlns:w10="urn:schemas-microsoft-com:office:word" xmlns:w="http://schemas.openxmlformats.org/wordprocessingml/2006/main" xmlns:w14="http://schemas.microsoft.com/office/word/2010/wordml" xmlns:wpg="http://schemas.microsoft.com/office/word/2010/wordprocessingGroup" xmlns:wpi="http://schemas.microsoft.com/office/word/2010/wordprocessingInk" xmlns:wne="http://schemas.microsoft.com/office/word/2006/wordml" xmlns:wps="http://schemas.microsoft.com/office/word/2010/wordprocessingShape" mc:Ignorable="w14 wp14">
+<w:endnotes xmlns:wpc="http://schemas.microsoft.com/office/word/2010/wordprocessingCanvas" xmlns:cx="http://schemas.microsoft.com/office/drawing/2014/chartex" xmlns:cx1="http://schemas.microsoft.com/office/drawing/2015/9/8/chartex" xmlns:cx2="http://schemas.microsoft.com/office/drawing/2015/10/21/chartex" xmlns:cx3="http://schemas.microsoft.com/office/drawing/2016/5/9/chartex" xmlns:cx4="http://schemas.microsoft.com/office/drawing/2016/5/10/chartex" xmlns:cx5="http://schemas.microsoft.com/office/drawing/2016/5/11/chartex" xmlns:cx6="http://schemas.microsoft.com/office/drawing/2016/5/12/chartex" xmlns:cx7="http://schemas.microsoft.com/office/drawing/2016/5/13/chartex" xmlns:cx8="http://schemas.microsoft.com/office/drawing/2016/5/14/chartex" xmlns:mc="http://schemas.openxmlformats.org/markup-compatibility/2006" xmlns:aink="http://schemas.microsoft.com/office/drawing/2016/ink" xmlns:am3d="http://schemas.microsoft.com/office/drawing/2017/model3d" xmlns:o="urn:schemas-microsoft-com:office:office" xmlns:oel="http://schemas.microsoft.com/office/2019/extlst" xmlns:r="http://schemas.openxmlformats.org/officeDocument/2006/relationships" xmlns:m="http://schemas.openxmlformats.org/officeDocument/2006/math" xmlns:v="urn:schemas-microsoft-com:vml" xmlns:wp14="http://schemas.microsoft.com/office/word/2010/wordprocessingDrawing" xmlns:wp="http://schemas.openxmlformats.org/drawingml/2006/wordprocessingDrawing" xmlns:w10="urn:schemas-microsoft-com:office:word" xmlns:w="http://schemas.openxmlformats.org/wordprocessingml/2006/main" xmlns:w14="http://schemas.microsoft.com/office/word/2010/wordml" xmlns:w15="http://schemas.microsoft.com/office/word/2012/wordml" xmlns:w16cei="http://schemas.microsoft.com/office/word/2026/wordml/cei" xmlns:w16cex="http://schemas.microsoft.com/office/word/2018/wordml/cex" xmlns:w16cid="http://schemas.microsoft.com/office/word/2016/wordml/cid" xmlns:w16="http://schemas.microsoft.com/office/word/2018/wordml" xmlns:w16du="http://schemas.microsoft.com/office/word/2023/wordml/word16du" xmlns:w16sdtdh="http://schemas.microsoft.com/office/word/2020/wordml/sdtdatahash" xmlns:w16sdtfl="http://schemas.microsoft.com/office/word/2024/wordml/sdtformatlock" xmlns:w16se="http://schemas.microsoft.com/office/word/2015/wordml/symex" xmlns:wpg="http://schemas.microsoft.com/office/word/2010/wordprocessingGroup" xmlns:wpi="http://schemas.microsoft.com/office/word/2010/wordprocessingInk" xmlns:wne="http://schemas.microsoft.com/office/word/2006/wordml" xmlns:wps="http://schemas.microsoft.com/office/word/2010/wordprocessingShape" mc:Ignorable="w14 w15 w16se w16cid w16 w16cex w16sdtdh w16sdtfl w16du wp14">
   <w:endnote w:type="separator" w:id="-1">
     <w:p>
       <w:r>
@@ -4689,7 +4452,7 @@
 </file>
 
 <file path=word/footer1.xml><?xml version="1.0" encoding="utf-8"?>
-<w:ftr xmlns:wpc="http://schemas.microsoft.com/office/word/2010/wordprocessingCanvas" xmlns:mc="http://schemas.openxmlformats.org/markup-compatibility/2006" xmlns:o="urn:schemas-microsoft-com:office:office" xmlns:r="http://schemas.openxmlformats.org/officeDocument/2006/relationships" xmlns:m="http://schemas.openxmlformats.org/officeDocument/2006/math" xmlns:v="urn:schemas-microsoft-com:vml" xmlns:wp14="http://schemas.microsoft.com/office/word/2010/wordprocessingDrawing" xmlns:wp="http://schemas.openxmlformats.org/drawingml/2006/wordprocessingDrawing" xmlns:w10="urn:schemas-microsoft-com:office:word" xmlns:w="http://schemas.openxmlformats.org/wordprocessingml/2006/main" xmlns:w14="http://schemas.microsoft.com/office/word/2010/wordml" xmlns:wpg="http://schemas.microsoft.com/office/word/2010/wordprocessingGroup" xmlns:wpi="http://schemas.microsoft.com/office/word/2010/wordprocessingInk" xmlns:wne="http://schemas.microsoft.com/office/word/2006/wordml" xmlns:wps="http://schemas.microsoft.com/office/word/2010/wordprocessingShape" mc:Ignorable="w14 wp14">
+<w:ftr xmlns:wpc="http://schemas.microsoft.com/office/word/2010/wordprocessingCanvas" xmlns:cx="http://schemas.microsoft.com/office/drawing/2014/chartex" xmlns:cx1="http://schemas.microsoft.com/office/drawing/2015/9/8/chartex" xmlns:cx2="http://schemas.microsoft.com/office/drawing/2015/10/21/chartex" xmlns:cx3="http://schemas.microsoft.com/office/drawing/2016/5/9/chartex" xmlns:cx4="http://schemas.microsoft.com/office/drawing/2016/5/10/chartex" xmlns:cx5="http://schemas.microsoft.com/office/drawing/2016/5/11/chartex" xmlns:cx6="http://schemas.microsoft.com/office/drawing/2016/5/12/chartex" xmlns:cx7="http://schemas.microsoft.com/office/drawing/2016/5/13/chartex" xmlns:cx8="http://schemas.microsoft.com/office/drawing/2016/5/14/chartex" xmlns:mc="http://schemas.openxmlformats.org/markup-compatibility/2006" xmlns:aink="http://schemas.microsoft.com/office/drawing/2016/ink" xmlns:am3d="http://schemas.microsoft.com/office/drawing/2017/model3d" xmlns:o="urn:schemas-microsoft-com:office:office" xmlns:oel="http://schemas.microsoft.com/office/2019/extlst" xmlns:r="http://schemas.openxmlformats.org/officeDocument/2006/relationships" xmlns:m="http://schemas.openxmlformats.org/officeDocument/2006/math" xmlns:v="urn:schemas-microsoft-com:vml" xmlns:wp14="http://schemas.microsoft.com/office/word/2010/wordprocessingDrawing" xmlns:wp="http://schemas.openxmlformats.org/drawingml/2006/wordprocessingDrawing" xmlns:w10="urn:schemas-microsoft-com:office:word" xmlns:w="http://schemas.openxmlformats.org/wordprocessingml/2006/main" xmlns:w14="http://schemas.microsoft.com/office/word/2010/wordml" xmlns:w15="http://schemas.microsoft.com/office/word/2012/wordml" xmlns:w16cei="http://schemas.microsoft.com/office/word/2026/wordml/cei" xmlns:w16cex="http://schemas.microsoft.com/office/word/2018/wordml/cex" xmlns:w16cid="http://schemas.microsoft.com/office/word/2016/wordml/cid" xmlns:w16="http://schemas.microsoft.com/office/word/2018/wordml" xmlns:w16du="http://schemas.microsoft.com/office/word/2023/wordml/word16du" xmlns:w16sdtdh="http://schemas.microsoft.com/office/word/2020/wordml/sdtdatahash" xmlns:w16sdtfl="http://schemas.microsoft.com/office/word/2024/wordml/sdtformatlock" xmlns:w16se="http://schemas.microsoft.com/office/word/2015/wordml/symex" xmlns:wpg="http://schemas.microsoft.com/office/word/2010/wordprocessingGroup" xmlns:wpi="http://schemas.microsoft.com/office/word/2010/wordprocessingInk" xmlns:wne="http://schemas.microsoft.com/office/word/2006/wordml" xmlns:wps="http://schemas.microsoft.com/office/word/2010/wordprocessingShape" mc:Ignorable="w14 w15 w16se w16cid w16 w16cex w16sdtdh w16sdtfl w16du wp14">
   <w:p>
     <w:pPr>
       <w:pStyle w:val="Footer"/>
@@ -4699,7 +4462,7 @@
 </file>
 
 <file path=word/footer2.xml><?xml version="1.0" encoding="utf-8"?>
-<w:ftr xmlns:wpc="http://schemas.microsoft.com/office/word/2010/wordprocessingCanvas" xmlns:mc="http://schemas.openxmlformats.org/markup-compatibility/2006" xmlns:o="urn:schemas-microsoft-com:office:office" xmlns:r="http://schemas.openxmlformats.org/officeDocument/2006/relationships" xmlns:m="http://schemas.openxmlformats.org/officeDocument/2006/math" xmlns:v="urn:schemas-microsoft-com:vml" xmlns:wp14="http://schemas.microsoft.com/office/word/2010/wordprocessingDrawing" xmlns:wp="http://schemas.openxmlformats.org/drawingml/2006/wordprocessingDrawing" xmlns:w10="urn:schemas-microsoft-com:office:word" xmlns:w="http://schemas.openxmlformats.org/wordprocessingml/2006/main" xmlns:w14="http://schemas.microsoft.com/office/word/2010/wordml" xmlns:wpg="http://schemas.microsoft.com/office/word/2010/wordprocessingGroup" xmlns:wpi="http://schemas.microsoft.com/office/word/2010/wordprocessingInk" xmlns:wne="http://schemas.microsoft.com/office/word/2006/wordml" xmlns:wps="http://schemas.microsoft.com/office/word/2010/wordprocessingShape" mc:Ignorable="w14 wp14">
+<w:ftr xmlns:wpc="http://schemas.microsoft.com/office/word/2010/wordprocessingCanvas" xmlns:cx="http://schemas.microsoft.com/office/drawing/2014/chartex" xmlns:cx1="http://schemas.microsoft.com/office/drawing/2015/9/8/chartex" xmlns:cx2="http://schemas.microsoft.com/office/drawing/2015/10/21/chartex" xmlns:cx3="http://schemas.microsoft.com/office/drawing/2016/5/9/chartex" xmlns:cx4="http://schemas.microsoft.com/office/drawing/2016/5/10/chartex" xmlns:cx5="http://schemas.microsoft.com/office/drawing/2016/5/11/chartex" xmlns:cx6="http://schemas.microsoft.com/office/drawing/2016/5/12/chartex" xmlns:cx7="http://schemas.microsoft.com/office/drawing/2016/5/13/chartex" xmlns:cx8="http://schemas.microsoft.com/office/drawing/2016/5/14/chartex" xmlns:mc="http://schemas.openxmlformats.org/markup-compatibility/2006" xmlns:aink="http://schemas.microsoft.com/office/drawing/2016/ink" xmlns:am3d="http://schemas.microsoft.com/office/drawing/2017/model3d" xmlns:o="urn:schemas-microsoft-com:office:office" xmlns:oel="http://schemas.microsoft.com/office/2019/extlst" xmlns:r="http://schemas.openxmlformats.org/officeDocument/2006/relationships" xmlns:m="http://schemas.openxmlformats.org/officeDocument/2006/math" xmlns:v="urn:schemas-microsoft-com:vml" xmlns:wp14="http://schemas.microsoft.com/office/word/2010/wordprocessingDrawing" xmlns:wp="http://schemas.openxmlformats.org/drawingml/2006/wordprocessingDrawing" xmlns:w10="urn:schemas-microsoft-com:office:word" xmlns:w="http://schemas.openxmlformats.org/wordprocessingml/2006/main" xmlns:w14="http://schemas.microsoft.com/office/word/2010/wordml" xmlns:w15="http://schemas.microsoft.com/office/word/2012/wordml" xmlns:w16cei="http://schemas.microsoft.com/office/word/2026/wordml/cei" xmlns:w16cex="http://schemas.microsoft.com/office/word/2018/wordml/cex" xmlns:w16cid="http://schemas.microsoft.com/office/word/2016/wordml/cid" xmlns:w16="http://schemas.microsoft.com/office/word/2018/wordml" xmlns:w16du="http://schemas.microsoft.com/office/word/2023/wordml/word16du" xmlns:w16sdtdh="http://schemas.microsoft.com/office/word/2020/wordml/sdtdatahash" xmlns:w16sdtfl="http://schemas.microsoft.com/office/word/2024/wordml/sdtformatlock" xmlns:w16se="http://schemas.microsoft.com/office/word/2015/wordml/symex" xmlns:wpg="http://schemas.microsoft.com/office/word/2010/wordprocessingGroup" xmlns:wpi="http://schemas.microsoft.com/office/word/2010/wordprocessingInk" xmlns:wne="http://schemas.microsoft.com/office/word/2006/wordml" xmlns:wps="http://schemas.microsoft.com/office/word/2010/wordprocessingShape" mc:Ignorable="w14 w15 w16se w16cid w16 w16cex w16sdtdh w16sdtfl w16du wp14">
   <w:p>
     <w:pPr>
       <w:pStyle w:val="Footer"/>
@@ -4709,7 +4472,7 @@
 </file>
 
 <file path=word/footer3.xml><?xml version="1.0" encoding="utf-8"?>
-<w:ftr xmlns:wpc="http://schemas.microsoft.com/office/word/2010/wordprocessingCanvas" xmlns:mc="http://schemas.openxmlformats.org/markup-compatibility/2006" xmlns:o="urn:schemas-microsoft-com:office:office" xmlns:r="http://schemas.openxmlformats.org/officeDocument/2006/relationships" xmlns:m="http://schemas.openxmlformats.org/officeDocument/2006/math" xmlns:v="urn:schemas-microsoft-com:vml" xmlns:wp14="http://schemas.microsoft.com/office/word/2010/wordprocessingDrawing" xmlns:wp="http://schemas.openxmlformats.org/drawingml/2006/wordprocessingDrawing" xmlns:w10="urn:schemas-microsoft-com:office:word" xmlns:w="http://schemas.openxmlformats.org/wordprocessingml/2006/main" xmlns:w14="http://schemas.microsoft.com/office/word/2010/wordml" xmlns:wpg="http://schemas.microsoft.com/office/word/2010/wordprocessingGroup" xmlns:wpi="http://schemas.microsoft.com/office/word/2010/wordprocessingInk" xmlns:wne="http://schemas.microsoft.com/office/word/2006/wordml" xmlns:wps="http://schemas.microsoft.com/office/word/2010/wordprocessingShape" mc:Ignorable="w14 wp14">
+<w:ftr xmlns:wpc="http://schemas.microsoft.com/office/word/2010/wordprocessingCanvas" xmlns:cx="http://schemas.microsoft.com/office/drawing/2014/chartex" xmlns:cx1="http://schemas.microsoft.com/office/drawing/2015/9/8/chartex" xmlns:cx2="http://schemas.microsoft.com/office/drawing/2015/10/21/chartex" xmlns:cx3="http://schemas.microsoft.com/office/drawing/2016/5/9/chartex" xmlns:cx4="http://schemas.microsoft.com/office/drawing/2016/5/10/chartex" xmlns:cx5="http://schemas.microsoft.com/office/drawing/2016/5/11/chartex" xmlns:cx6="http://schemas.microsoft.com/office/drawing/2016/5/12/chartex" xmlns:cx7="http://schemas.microsoft.com/office/drawing/2016/5/13/chartex" xmlns:cx8="http://schemas.microsoft.com/office/drawing/2016/5/14/chartex" xmlns:mc="http://schemas.openxmlformats.org/markup-compatibility/2006" xmlns:aink="http://schemas.microsoft.com/office/drawing/2016/ink" xmlns:am3d="http://schemas.microsoft.com/office/drawing/2017/model3d" xmlns:o="urn:schemas-microsoft-com:office:office" xmlns:oel="http://schemas.microsoft.com/office/2019/extlst" xmlns:r="http://schemas.openxmlformats.org/officeDocument/2006/relationships" xmlns:m="http://schemas.openxmlformats.org/officeDocument/2006/math" xmlns:v="urn:schemas-microsoft-com:vml" xmlns:wp14="http://schemas.microsoft.com/office/word/2010/wordprocessingDrawing" xmlns:wp="http://schemas.openxmlformats.org/drawingml/2006/wordprocessingDrawing" xmlns:w10="urn:schemas-microsoft-com:office:word" xmlns:w="http://schemas.openxmlformats.org/wordprocessingml/2006/main" xmlns:w14="http://schemas.microsoft.com/office/word/2010/wordml" xmlns:w15="http://schemas.microsoft.com/office/word/2012/wordml" xmlns:w16cei="http://schemas.microsoft.com/office/word/2026/wordml/cei" xmlns:w16cex="http://schemas.microsoft.com/office/word/2018/wordml/cex" xmlns:w16cid="http://schemas.microsoft.com/office/word/2016/wordml/cid" xmlns:w16="http://schemas.microsoft.com/office/word/2018/wordml" xmlns:w16du="http://schemas.microsoft.com/office/word/2023/wordml/word16du" xmlns:w16sdtdh="http://schemas.microsoft.com/office/word/2020/wordml/sdtdatahash" xmlns:w16sdtfl="http://schemas.microsoft.com/office/word/2024/wordml/sdtformatlock" xmlns:w16se="http://schemas.microsoft.com/office/word/2015/wordml/symex" xmlns:wpg="http://schemas.microsoft.com/office/word/2010/wordprocessingGroup" xmlns:wpi="http://schemas.microsoft.com/office/word/2010/wordprocessingInk" xmlns:wne="http://schemas.microsoft.com/office/word/2006/wordml" xmlns:wps="http://schemas.microsoft.com/office/word/2010/wordprocessingShape" mc:Ignorable="w14 w15 w16se w16cid w16 w16cex w16sdtdh w16sdtfl w16du wp14">
   <w:p>
     <w:pPr>
       <w:pStyle w:val="Footer"/>
@@ -4719,7 +4482,7 @@
 </file>
 
 <file path=word/footnotes.xml><?xml version="1.0" encoding="utf-8"?>
-<w:footnotes xmlns:wpc="http://schemas.microsoft.com/office/word/2010/wordprocessingCanvas" xmlns:mc="http://schemas.openxmlformats.org/markup-compatibility/2006" xmlns:o="urn:schemas-microsoft-com:office:office" xmlns:r="http://schemas.openxmlformats.org/officeDocument/2006/relationships" xmlns:m="http://schemas.openxmlformats.org/officeDocument/2006/math" xmlns:v="urn:schemas-microsoft-com:vml" xmlns:wp14="http://schemas.microsoft.com/office/word/2010/wordprocessingDrawing" xmlns:wp="http://schemas.openxmlformats.org/drawingml/2006/wordprocessingDrawing" xmlns:w10="urn:schemas-microsoft-com:office:word" xmlns:w="http://schemas.openxmlformats.org/wordprocessingml/2006/main" xmlns:w14="http://schemas.microsoft.com/office/word/2010/wordml" xmlns:wpg="http://schemas.microsoft.com/office/word/2010/wordprocessingGroup" xmlns:wpi="http://schemas.microsoft.com/office/word/2010/wordprocessingInk" xmlns:wne="http://schemas.microsoft.com/office/word/2006/wordml" xmlns:wps="http://schemas.microsoft.com/office/word/2010/wordprocessingShape" mc:Ignorable="w14 wp14">
+<w:footnotes xmlns:wpc="http://schemas.microsoft.com/office/word/2010/wordprocessingCanvas" xmlns:cx="http://schemas.microsoft.com/office/drawing/2014/chartex" xmlns:cx1="http://schemas.microsoft.com/office/drawing/2015/9/8/chartex" xmlns:cx2="http://schemas.microsoft.com/office/drawing/2015/10/21/chartex" xmlns:cx3="http://schemas.microsoft.com/office/drawing/2016/5/9/chartex" xmlns:cx4="http://schemas.microsoft.com/office/drawing/2016/5/10/chartex" xmlns:cx5="http://schemas.microsoft.com/office/drawing/2016/5/11/chartex" xmlns:cx6="http://schemas.microsoft.com/office/drawing/2016/5/12/chartex" xmlns:cx7="http://schemas.microsoft.com/office/drawing/2016/5/13/chartex" xmlns:cx8="http://schemas.microsoft.com/office/drawing/2016/5/14/chartex" xmlns:mc="http://schemas.openxmlformats.org/markup-compatibility/2006" xmlns:aink="http://schemas.microsoft.com/office/drawing/2016/ink" xmlns:am3d="http://schemas.microsoft.com/office/drawing/2017/model3d" xmlns:o="urn:schemas-microsoft-com:office:office" xmlns:oel="http://schemas.microsoft.com/office/2019/extlst" xmlns:r="http://schemas.openxmlformats.org/officeDocument/2006/relationships" xmlns:m="http://schemas.openxmlformats.org/officeDocument/2006/math" xmlns:v="urn:schemas-microsoft-com:vml" xmlns:wp14="http://schemas.microsoft.com/office/word/2010/wordprocessingDrawing" xmlns:wp="http://schemas.openxmlformats.org/drawingml/2006/wordprocessingDrawing" xmlns:w10="urn:schemas-microsoft-com:office:word" xmlns:w="http://schemas.openxmlformats.org/wordprocessingml/2006/main" xmlns:w14="http://schemas.microsoft.com/office/word/2010/wordml" xmlns:w15="http://schemas.microsoft.com/office/word/2012/wordml" xmlns:w16cei="http://schemas.microsoft.com/office/word/2026/wordml/cei" xmlns:w16cex="http://schemas.microsoft.com/office/word/2018/wordml/cex" xmlns:w16cid="http://schemas.microsoft.com/office/word/2016/wordml/cid" xmlns:w16="http://schemas.microsoft.com/office/word/2018/wordml" xmlns:w16du="http://schemas.microsoft.com/office/word/2023/wordml/word16du" xmlns:w16sdtdh="http://schemas.microsoft.com/office/word/2020/wordml/sdtdatahash" xmlns:w16sdtfl="http://schemas.microsoft.com/office/word/2024/wordml/sdtformatlock" xmlns:w16se="http://schemas.microsoft.com/office/word/2015/wordml/symex" xmlns:wpg="http://schemas.microsoft.com/office/word/2010/wordprocessingGroup" xmlns:wpi="http://schemas.microsoft.com/office/word/2010/wordprocessingInk" xmlns:wne="http://schemas.microsoft.com/office/word/2006/wordml" xmlns:wps="http://schemas.microsoft.com/office/word/2010/wordprocessingShape" mc:Ignorable="w14 w15 w16se w16cid w16 w16cex w16sdtdh w16sdtfl w16du wp14">
   <w:footnote w:type="separator" w:id="-1">
     <w:p>
       <w:r>
@@ -4738,7 +4501,7 @@
 </file>
 
 <file path=word/header1.xml><?xml version="1.0" encoding="utf-8"?>
-<w:hdr xmlns:wpc="http://schemas.microsoft.com/office/word/2010/wordprocessingCanvas" xmlns:mc="http://schemas.openxmlformats.org/markup-compatibility/2006" xmlns:o="urn:schemas-microsoft-com:office:office" xmlns:r="http://schemas.openxmlformats.org/officeDocument/2006/relationships" xmlns:m="http://schemas.openxmlformats.org/officeDocument/2006/math" xmlns:v="urn:schemas-microsoft-com:vml" xmlns:wp14="http://schemas.microsoft.com/office/word/2010/wordprocessingDrawing" xmlns:wp="http://schemas.openxmlformats.org/drawingml/2006/wordprocessingDrawing" xmlns:w10="urn:schemas-microsoft-com:office:word" xmlns:w="http://schemas.openxmlformats.org/wordprocessingml/2006/main" xmlns:w14="http://schemas.microsoft.com/office/word/2010/wordml" xmlns:wpg="http://schemas.microsoft.com/office/word/2010/wordprocessingGroup" xmlns:wpi="http://schemas.microsoft.com/office/word/2010/wordprocessingInk" xmlns:wne="http://schemas.microsoft.com/office/word/2006/wordml" xmlns:wps="http://schemas.microsoft.com/office/word/2010/wordprocessingShape" mc:Ignorable="w14 wp14">
+<w:hdr xmlns:wpc="http://schemas.microsoft.com/office/word/2010/wordprocessingCanvas" xmlns:cx="http://schemas.microsoft.com/office/drawing/2014/chartex" xmlns:cx1="http://schemas.microsoft.com/office/drawing/2015/9/8/chartex" xmlns:cx2="http://schemas.microsoft.com/office/drawing/2015/10/21/chartex" xmlns:cx3="http://schemas.microsoft.com/office/drawing/2016/5/9/chartex" xmlns:cx4="http://schemas.microsoft.com/office/drawing/2016/5/10/chartex" xmlns:cx5="http://schemas.microsoft.com/office/drawing/2016/5/11/chartex" xmlns:cx6="http://schemas.microsoft.com/office/drawing/2016/5/12/chartex" xmlns:cx7="http://schemas.microsoft.com/office/drawing/2016/5/13/chartex" xmlns:cx8="http://schemas.microsoft.com/office/drawing/2016/5/14/chartex" xmlns:mc="http://schemas.openxmlformats.org/markup-compatibility/2006" xmlns:aink="http://schemas.microsoft.com/office/drawing/2016/ink" xmlns:am3d="http://schemas.microsoft.com/office/drawing/2017/model3d" xmlns:o="urn:schemas-microsoft-com:office:office" xmlns:oel="http://schemas.microsoft.com/office/2019/extlst" xmlns:r="http://schemas.openxmlformats.org/officeDocument/2006/relationships" xmlns:m="http://schemas.openxmlformats.org/officeDocument/2006/math" xmlns:v="urn:schemas-microsoft-com:vml" xmlns:wp14="http://schemas.microsoft.com/office/word/2010/wordprocessingDrawing" xmlns:wp="http://schemas.openxmlformats.org/drawingml/2006/wordprocessingDrawing" xmlns:w10="urn:schemas-microsoft-com:office:word" xmlns:w="http://schemas.openxmlformats.org/wordprocessingml/2006/main" xmlns:w14="http://schemas.microsoft.com/office/word/2010/wordml" xmlns:w15="http://schemas.microsoft.com/office/word/2012/wordml" xmlns:w16cei="http://schemas.microsoft.com/office/word/2026/wordml/cei" xmlns:w16cex="http://schemas.microsoft.com/office/word/2018/wordml/cex" xmlns:w16cid="http://schemas.microsoft.com/office/word/2016/wordml/cid" xmlns:w16="http://schemas.microsoft.com/office/word/2018/wordml" xmlns:w16du="http://schemas.microsoft.com/office/word/2023/wordml/word16du" xmlns:w16sdtdh="http://schemas.microsoft.com/office/word/2020/wordml/sdtdatahash" xmlns:w16sdtfl="http://schemas.microsoft.com/office/word/2024/wordml/sdtformatlock" xmlns:w16se="http://schemas.microsoft.com/office/word/2015/wordml/symex" xmlns:wpg="http://schemas.microsoft.com/office/word/2010/wordprocessingGroup" xmlns:wpi="http://schemas.microsoft.com/office/word/2010/wordprocessingInk" xmlns:wne="http://schemas.microsoft.com/office/word/2006/wordml" xmlns:wps="http://schemas.microsoft.com/office/word/2010/wordprocessingShape" mc:Ignorable="w14 w15 w16se w16cid w16 w16cex w16sdtdh w16sdtfl w16du wp14">
   <w:p>
     <w:pPr>
       <w:pStyle w:val="Header"/>
@@ -4748,7 +4511,7 @@
 </file>
 
 <file path=word/header2.xml><?xml version="1.0" encoding="utf-8"?>
-<w:hdr xmlns:wpc="http://schemas.microsoft.com/office/word/2010/wordprocessingCanvas" xmlns:mc="http://schemas.openxmlformats.org/markup-compatibility/2006" xmlns:o="urn:schemas-microsoft-com:office:office" xmlns:r="http://schemas.openxmlformats.org/officeDocument/2006/relationships" xmlns:m="http://schemas.openxmlformats.org/officeDocument/2006/math" xmlns:v="urn:schemas-microsoft-com:vml" xmlns:wp14="http://schemas.microsoft.com/office/word/2010/wordprocessingDrawing" xmlns:wp="http://schemas.openxmlformats.org/drawingml/2006/wordprocessingDrawing" xmlns:w10="urn:schemas-microsoft-com:office:word" xmlns:w="http://schemas.openxmlformats.org/wordprocessingml/2006/main" xmlns:w14="http://schemas.microsoft.com/office/word/2010/wordml" xmlns:wpg="http://schemas.microsoft.com/office/word/2010/wordprocessingGroup" xmlns:wpi="http://schemas.microsoft.com/office/word/2010/wordprocessingInk" xmlns:wne="http://schemas.microsoft.com/office/word/2006/wordml" xmlns:wps="http://schemas.microsoft.com/office/word/2010/wordprocessingShape" mc:Ignorable="w14 wp14">
+<w:hdr xmlns:wpc="http://schemas.microsoft.com/office/word/2010/wordprocessingCanvas" xmlns:cx="http://schemas.microsoft.com/office/drawing/2014/chartex" xmlns:cx1="http://schemas.microsoft.com/office/drawing/2015/9/8/chartex" xmlns:cx2="http://schemas.microsoft.com/office/drawing/2015/10/21/chartex" xmlns:cx3="http://schemas.microsoft.com/office/drawing/2016/5/9/chartex" xmlns:cx4="http://schemas.microsoft.com/office/drawing/2016/5/10/chartex" xmlns:cx5="http://schemas.microsoft.com/office/drawing/2016/5/11/chartex" xmlns:cx6="http://schemas.microsoft.com/office/drawing/2016/5/12/chartex" xmlns:cx7="http://schemas.microsoft.com/office/drawing/2016/5/13/chartex" xmlns:cx8="http://schemas.microsoft.com/office/drawing/2016/5/14/chartex" xmlns:mc="http://schemas.openxmlformats.org/markup-compatibility/2006" xmlns:aink="http://schemas.microsoft.com/office/drawing/2016/ink" xmlns:am3d="http://schemas.microsoft.com/office/drawing/2017/model3d" xmlns:o="urn:schemas-microsoft-com:office:office" xmlns:oel="http://schemas.microsoft.com/office/2019/extlst" xmlns:r="http://schemas.openxmlformats.org/officeDocument/2006/relationships" xmlns:m="http://schemas.openxmlformats.org/officeDocument/2006/math" xmlns:v="urn:schemas-microsoft-com:vml" xmlns:wp14="http://schemas.microsoft.com/office/word/2010/wordprocessingDrawing" xmlns:wp="http://schemas.openxmlformats.org/drawingml/2006/wordprocessingDrawing" xmlns:w10="urn:schemas-microsoft-com:office:word" xmlns:w="http://schemas.openxmlformats.org/wordprocessingml/2006/main" xmlns:w14="http://schemas.microsoft.com/office/word/2010/wordml" xmlns:w15="http://schemas.microsoft.com/office/word/2012/wordml" xmlns:w16cei="http://schemas.microsoft.com/office/word/2026/wordml/cei" xmlns:w16cex="http://schemas.microsoft.com/office/word/2018/wordml/cex" xmlns:w16cid="http://schemas.microsoft.com/office/word/2016/wordml/cid" xmlns:w16="http://schemas.microsoft.com/office/word/2018/wordml" xmlns:w16du="http://schemas.microsoft.com/office/word/2023/wordml/word16du" xmlns:w16sdtdh="http://schemas.microsoft.com/office/word/2020/wordml/sdtdatahash" xmlns:w16sdtfl="http://schemas.microsoft.com/office/word/2024/wordml/sdtformatlock" xmlns:w16se="http://schemas.microsoft.com/office/word/2015/wordml/symex" xmlns:wpg="http://schemas.microsoft.com/office/word/2010/wordprocessingGroup" xmlns:wpi="http://schemas.microsoft.com/office/word/2010/wordprocessingInk" xmlns:wne="http://schemas.microsoft.com/office/word/2006/wordml" xmlns:wps="http://schemas.microsoft.com/office/word/2010/wordprocessingShape" mc:Ignorable="w14 w15 w16se w16cid w16 w16cex w16sdtdh w16sdtfl w16du wp14">
   <w:p>
     <w:pPr>
       <w:pStyle w:val="Header"/>
@@ -4758,7 +4521,7 @@
 </file>
 
 <file path=word/header3.xml><?xml version="1.0" encoding="utf-8"?>
-<w:hdr xmlns:wpc="http://schemas.microsoft.com/office/word/2010/wordprocessingCanvas" xmlns:mc="http://schemas.openxmlformats.org/markup-compatibility/2006" xmlns:o="urn:schemas-microsoft-com:office:office" xmlns:r="http://schemas.openxmlformats.org/officeDocument/2006/relationships" xmlns:m="http://schemas.openxmlformats.org/officeDocument/2006/math" xmlns:v="urn:schemas-microsoft-com:vml" xmlns:wp14="http://schemas.microsoft.com/office/word/2010/wordprocessingDrawing" xmlns:wp="http://schemas.openxmlformats.org/drawingml/2006/wordprocessingDrawing" xmlns:w10="urn:schemas-microsoft-com:office:word" xmlns:w="http://schemas.openxmlformats.org/wordprocessingml/2006/main" xmlns:w14="http://schemas.microsoft.com/office/word/2010/wordml" xmlns:wpg="http://schemas.microsoft.com/office/word/2010/wordprocessingGroup" xmlns:wpi="http://schemas.microsoft.com/office/word/2010/wordprocessingInk" xmlns:wne="http://schemas.microsoft.com/office/word/2006/wordml" xmlns:wps="http://schemas.microsoft.com/office/word/2010/wordprocessingShape" mc:Ignorable="w14 wp14">
+<w:hdr xmlns:wpc="http://schemas.microsoft.com/office/word/2010/wordprocessingCanvas" xmlns:cx="http://schemas.microsoft.com/office/drawing/2014/chartex" xmlns:cx1="http://schemas.microsoft.com/office/drawing/2015/9/8/chartex" xmlns:cx2="http://schemas.microsoft.com/office/drawing/2015/10/21/chartex" xmlns:cx3="http://schemas.microsoft.com/office/drawing/2016/5/9/chartex" xmlns:cx4="http://schemas.microsoft.com/office/drawing/2016/5/10/chartex" xmlns:cx5="http://schemas.microsoft.com/office/drawing/2016/5/11/chartex" xmlns:cx6="http://schemas.microsoft.com/office/drawing/2016/5/12/chartex" xmlns:cx7="http://schemas.microsoft.com/office/drawing/2016/5/13/chartex" xmlns:cx8="http://schemas.microsoft.com/office/drawing/2016/5/14/chartex" xmlns:mc="http://schemas.openxmlformats.org/markup-compatibility/2006" xmlns:aink="http://schemas.microsoft.com/office/drawing/2016/ink" xmlns:am3d="http://schemas.microsoft.com/office/drawing/2017/model3d" xmlns:o="urn:schemas-microsoft-com:office:office" xmlns:oel="http://schemas.microsoft.com/office/2019/extlst" xmlns:r="http://schemas.openxmlformats.org/officeDocument/2006/relationships" xmlns:m="http://schemas.openxmlformats.org/officeDocument/2006/math" xmlns:v="urn:schemas-microsoft-com:vml" xmlns:wp14="http://schemas.microsoft.com/office/word/2010/wordprocessingDrawing" xmlns:wp="http://schemas.openxmlformats.org/drawingml/2006/wordprocessingDrawing" xmlns:w10="urn:schemas-microsoft-com:office:word" xmlns:w="http://schemas.openxmlformats.org/wordprocessingml/2006/main" xmlns:w14="http://schemas.microsoft.com/office/word/2010/wordml" xmlns:w15="http://schemas.microsoft.com/office/word/2012/wordml" xmlns:w16cei="http://schemas.microsoft.com/office/word/2026/wordml/cei" xmlns:w16cex="http://schemas.microsoft.com/office/word/2018/wordml/cex" xmlns:w16cid="http://schemas.microsoft.com/office/word/2016/wordml/cid" xmlns:w16="http://schemas.microsoft.com/office/word/2018/wordml" xmlns:w16du="http://schemas.microsoft.com/office/word/2023/wordml/word16du" xmlns:w16sdtdh="http://schemas.microsoft.com/office/word/2020/wordml/sdtdatahash" xmlns:w16sdtfl="http://schemas.microsoft.com/office/word/2024/wordml/sdtformatlock" xmlns:w16se="http://schemas.microsoft.com/office/word/2015/wordml/symex" xmlns:wpg="http://schemas.microsoft.com/office/word/2010/wordprocessingGroup" xmlns:wpi="http://schemas.microsoft.com/office/word/2010/wordprocessingInk" xmlns:wne="http://schemas.microsoft.com/office/word/2006/wordml" xmlns:wps="http://schemas.microsoft.com/office/word/2010/wordprocessingShape" mc:Ignorable="w14 w15 w16se w16cid w16 w16cex w16sdtdh w16sdtfl w16du wp14">
   <w:p>
     <w:pPr>
       <w:pStyle w:val="Header"/>
@@ -4768,8 +4531,8 @@
 </file>
 
 <file path=word/numbering.xml><?xml version="1.0" encoding="utf-8"?>
-<w:numbering xmlns:wpc="http://schemas.microsoft.com/office/word/2010/wordprocessingCanvas" xmlns:mc="http://schemas.openxmlformats.org/markup-compatibility/2006" xmlns:o="urn:schemas-microsoft-com:office:office" xmlns:r="http://schemas.openxmlformats.org/officeDocument/2006/relationships" xmlns:m="http://schemas.openxmlformats.org/officeDocument/2006/math" xmlns:v="urn:schemas-microsoft-com:vml" xmlns:wp14="http://schemas.microsoft.com/office/word/2010/wordprocessingDrawing" xmlns:wp="http://schemas.openxmlformats.org/drawingml/2006/wordprocessingDrawing" xmlns:w10="urn:schemas-microsoft-com:office:word" xmlns:w="http://schemas.openxmlformats.org/wordprocessingml/2006/main" xmlns:w14="http://schemas.microsoft.com/office/word/2010/wordml" xmlns:wpg="http://schemas.microsoft.com/office/word/2010/wordprocessingGroup" xmlns:wpi="http://schemas.microsoft.com/office/word/2010/wordprocessingInk" xmlns:wne="http://schemas.microsoft.com/office/word/2006/wordml" xmlns:wps="http://schemas.microsoft.com/office/word/2010/wordprocessingShape" mc:Ignorable="w14 wp14">
-  <w:abstractNum w:abstractNumId="0">
+<w:numbering xmlns:wpc="http://schemas.microsoft.com/office/word/2010/wordprocessingCanvas" xmlns:cx="http://schemas.microsoft.com/office/drawing/2014/chartex" xmlns:cx1="http://schemas.microsoft.com/office/drawing/2015/9/8/chartex" xmlns:cx2="http://schemas.microsoft.com/office/drawing/2015/10/21/chartex" xmlns:cx3="http://schemas.microsoft.com/office/drawing/2016/5/9/chartex" xmlns:cx4="http://schemas.microsoft.com/office/drawing/2016/5/10/chartex" xmlns:cx5="http://schemas.microsoft.com/office/drawing/2016/5/11/chartex" xmlns:cx6="http://schemas.microsoft.com/office/drawing/2016/5/12/chartex" xmlns:cx7="http://schemas.microsoft.com/office/drawing/2016/5/13/chartex" xmlns:cx8="http://schemas.microsoft.com/office/drawing/2016/5/14/chartex" xmlns:mc="http://schemas.openxmlformats.org/markup-compatibility/2006" xmlns:aink="http://schemas.microsoft.com/office/drawing/2016/ink" xmlns:am3d="http://schemas.microsoft.com/office/drawing/2017/model3d" xmlns:o="urn:schemas-microsoft-com:office:office" xmlns:oel="http://schemas.microsoft.com/office/2019/extlst" xmlns:r="http://schemas.openxmlformats.org/officeDocument/2006/relationships" xmlns:m="http://schemas.openxmlformats.org/officeDocument/2006/math" xmlns:v="urn:schemas-microsoft-com:vml" xmlns:wp14="http://schemas.microsoft.com/office/word/2010/wordprocessingDrawing" xmlns:wp="http://schemas.openxmlformats.org/drawingml/2006/wordprocessingDrawing" xmlns:w10="urn:schemas-microsoft-com:office:word" xmlns:w="http://schemas.openxmlformats.org/wordprocessingml/2006/main" xmlns:w14="http://schemas.microsoft.com/office/word/2010/wordml" xmlns:w15="http://schemas.microsoft.com/office/word/2012/wordml" xmlns:w16cei="http://schemas.microsoft.com/office/word/2026/wordml/cei" xmlns:w16cex="http://schemas.microsoft.com/office/word/2018/wordml/cex" xmlns:w16cid="http://schemas.microsoft.com/office/word/2016/wordml/cid" xmlns:w16="http://schemas.microsoft.com/office/word/2018/wordml" xmlns:w16du="http://schemas.microsoft.com/office/word/2023/wordml/word16du" xmlns:w16sdtdh="http://schemas.microsoft.com/office/word/2020/wordml/sdtdatahash" xmlns:w16sdtfl="http://schemas.microsoft.com/office/word/2024/wordml/sdtformatlock" xmlns:w16se="http://schemas.microsoft.com/office/word/2015/wordml/symex" xmlns:wpg="http://schemas.microsoft.com/office/word/2010/wordprocessingGroup" xmlns:wpi="http://schemas.microsoft.com/office/word/2010/wordprocessingInk" xmlns:wne="http://schemas.microsoft.com/office/word/2006/wordml" xmlns:wps="http://schemas.microsoft.com/office/word/2010/wordprocessingShape" mc:Ignorable="w14 w15 w16se w16cid w16 w16cex w16sdtdh w16sdtfl w16du wp14">
+  <w:abstractNum w:abstractNumId="0" w15:restartNumberingAfterBreak="0">
     <w:nsid w:val="17526511"/>
     <w:multiLevelType w:val="hybridMultilevel"/>
     <w:tmpl w:val="18F85D56"/>
@@ -4909,7 +4672,7 @@
       </w:rPr>
     </w:lvl>
   </w:abstractNum>
-  <w:abstractNum w:abstractNumId="1">
+  <w:abstractNum w:abstractNumId="1" w15:restartNumberingAfterBreak="0">
     <w:nsid w:val="1EE61077"/>
     <w:multiLevelType w:val="hybridMultilevel"/>
     <w:tmpl w:val="96ACA976"/>
@@ -5049,7 +4812,7 @@
       </w:rPr>
     </w:lvl>
   </w:abstractNum>
-  <w:abstractNum w:abstractNumId="2">
+  <w:abstractNum w:abstractNumId="2" w15:restartNumberingAfterBreak="0">
     <w:nsid w:val="4B042F25"/>
     <w:multiLevelType w:val="hybridMultilevel"/>
     <w:tmpl w:val="53CA07B4"/>
@@ -5165,20 +4928,20 @@
       </w:pPr>
     </w:lvl>
   </w:abstractNum>
-  <w:num w:numId="1">
+  <w:num w:numId="1" w16cid:durableId="1375037731">
     <w:abstractNumId w:val="0"/>
   </w:num>
-  <w:num w:numId="2">
+  <w:num w:numId="2" w16cid:durableId="1972859654">
     <w:abstractNumId w:val="1"/>
   </w:num>
-  <w:num w:numId="3">
+  <w:num w:numId="3" w16cid:durableId="1465928799">
     <w:abstractNumId w:val="2"/>
   </w:num>
 </w:numbering>
 </file>
 
 <file path=word/styles.xml><?xml version="1.0" encoding="utf-8"?>
-<w:styles xmlns:mc="http://schemas.openxmlformats.org/markup-compatibility/2006" xmlns:r="http://schemas.openxmlformats.org/officeDocument/2006/relationships" xmlns:w="http://schemas.openxmlformats.org/wordprocessingml/2006/main" xmlns:w14="http://schemas.microsoft.com/office/word/2010/wordml" mc:Ignorable="w14">
+<w:styles xmlns:mc="http://schemas.openxmlformats.org/markup-compatibility/2006" xmlns:r="http://schemas.openxmlformats.org/officeDocument/2006/relationships" xmlns:w="http://schemas.openxmlformats.org/wordprocessingml/2006/main" xmlns:w14="http://schemas.microsoft.com/office/word/2010/wordml" xmlns:w15="http://schemas.microsoft.com/office/word/2012/wordml" xmlns:w16cex="http://schemas.microsoft.com/office/word/2018/wordml/cex" xmlns:w16cid="http://schemas.microsoft.com/office/word/2016/wordml/cid" xmlns:w16="http://schemas.microsoft.com/office/word/2018/wordml" xmlns:w16du="http://schemas.microsoft.com/office/word/2023/wordml/word16du" xmlns:w16sdtdh="http://schemas.microsoft.com/office/word/2020/wordml/sdtdatahash" xmlns:w16sdtfl="http://schemas.microsoft.com/office/word/2024/wordml/sdtformatlock" xmlns:w16se="http://schemas.microsoft.com/office/word/2015/wordml/symex" mc:Ignorable="w14 w15 w16se w16cid w16 w16cex w16sdtdh w16sdtfl w16du">
   <w:docDefaults>
     <w:rPrDefault>
       <w:rPr>
@@ -5188,399 +4951,383 @@
     </w:rPrDefault>
     <w:pPrDefault/>
   </w:docDefaults>
-  <w:latentStyles w:defLockedState="0" w:defUIPriority="99" w:defSemiHidden="1" w:defUnhideWhenUsed="1" w:defQFormat="0" w:count="267">
-    <w:lsdException w:name="Normal" w:semiHidden="0" w:uiPriority="0" w:unhideWhenUsed="0" w:qFormat="1"/>
-    <w:lsdException w:name="heading 1" w:semiHidden="0" w:uiPriority="9" w:unhideWhenUsed="0" w:qFormat="1"/>
-    <w:lsdException w:name="heading 2" w:uiPriority="9" w:qFormat="1"/>
-    <w:lsdException w:name="heading 3" w:uiPriority="9" w:qFormat="1"/>
-    <w:lsdException w:name="heading 4" w:uiPriority="9" w:qFormat="1"/>
-    <w:lsdException w:name="heading 5" w:uiPriority="9" w:qFormat="1"/>
-    <w:lsdException w:name="heading 6" w:uiPriority="9" w:qFormat="1"/>
-    <w:lsdException w:name="heading 7" w:uiPriority="9" w:qFormat="1"/>
-    <w:lsdException w:name="heading 8" w:uiPriority="9" w:qFormat="1"/>
-    <w:lsdException w:name="heading 9" w:uiPriority="9" w:qFormat="1"/>
-    <w:lsdException w:name="toc 1" w:uiPriority="39"/>
-    <w:lsdException w:name="toc 2" w:uiPriority="39"/>
-    <w:lsdException w:name="toc 3" w:uiPriority="39"/>
-    <w:lsdException w:name="toc 4" w:uiPriority="39"/>
-    <w:lsdException w:name="toc 5" w:uiPriority="39"/>
-    <w:lsdException w:name="toc 6" w:uiPriority="39"/>
-    <w:lsdException w:name="toc 7" w:uiPriority="39"/>
-    <w:lsdException w:name="toc 8" w:uiPriority="39"/>
-    <w:lsdException w:name="toc 9" w:uiPriority="39"/>
-    <w:lsdException w:name="caption" w:uiPriority="35" w:qFormat="1"/>
-    <w:lsdException w:name="Title" w:semiHidden="0" w:uiPriority="10" w:unhideWhenUsed="0" w:qFormat="1"/>
-    <w:lsdException w:name="Default Paragraph Font" w:uiPriority="1"/>
-    <w:lsdException w:name="Subtitle" w:semiHidden="0" w:uiPriority="11" w:unhideWhenUsed="0" w:qFormat="1"/>
-    <w:lsdException w:name="Strong" w:semiHidden="0" w:uiPriority="22" w:unhideWhenUsed="0" w:qFormat="1"/>
-    <w:lsdException w:name="Emphasis" w:semiHidden="0" w:uiPriority="20" w:unhideWhenUsed="0" w:qFormat="1"/>
-    <w:lsdException w:name="Table Grid" w:semiHidden="0" w:uiPriority="59" w:unhideWhenUsed="0"/>
-    <w:lsdException w:name="Placeholder Text" w:unhideWhenUsed="0"/>
-    <w:lsdException w:name="No Spacing" w:semiHidden="0" w:uiPriority="1" w:unhideWhenUsed="0" w:qFormat="1"/>
-    <w:lsdException w:name="Light Shading" w:semiHidden="0" w:uiPriority="60" w:unhideWhenUsed="0"/>
-    <w:lsdException w:name="Light List" w:semiHidden="0" w:uiPriority="61" w:unhideWhenUsed="0"/>
-    <w:lsdException w:name="Light Grid" w:semiHidden="0" w:uiPriority="62" w:unhideWhenUsed="0"/>
-    <w:lsdException w:name="Medium Shading 1" w:semiHidden="0" w:uiPriority="63" w:unhideWhenUsed="0"/>
-    <w:lsdException w:name="Medium Shading 2" w:semiHidden="0" w:uiPriority="64" w:unhideWhenUsed="0"/>
-    <w:lsdException w:name="Medium List 1" w:semiHidden="0" w:uiPriority="65" w:unhideWhenUsed="0"/>
-    <w:lsdException w:name="Medium List 2" w:semiHidden="0" w:uiPriority="66" w:unhideWhenUsed="0"/>
-    <w:lsdException w:name="Medium Grid 1" w:semiHidden="0" w:uiPriority="67" w:unhideWhenUsed="0"/>
-    <w:lsdException w:name="Medium Grid 2" w:semiHidden="0" w:uiPriority="68" w:unhideWhenUsed="0"/>
-    <w:lsdException w:name="Medium Grid 3" w:semiHidden="0" w:uiPriority="69" w:unhideWhenUsed="0"/>
-    <w:lsdException w:name="Dark List" w:semiHidden="0" w:uiPriority="70" w:unhideWhenUsed="0"/>
-    <w:lsdException w:name="Colorful Shading" w:semiHidden="0" w:uiPriority="71" w:unhideWhenUsed="0"/>
-    <w:lsdException w:name="Colorful List" w:semiHidden="0" w:uiPriority="72" w:unhideWhenUsed="0"/>
-    <w:lsdException w:name="Colorful Grid" w:semiHidden="0" w:uiPriority="73" w:unhideWhenUsed="0"/>
-    <w:lsdException w:name="Light Shading Accent 1" w:semiHidden="0" w:uiPriority="60" w:unhideWhenUsed="0"/>
-    <w:lsdException w:name="Light List Accent 1" w:semiHidden="0" w:uiPriority="61" w:unhideWhenUsed="0"/>
-    <w:lsdException w:name="Light Grid Accent 1" w:semiHidden="0" w:uiPriority="62" w:unhideWhenUsed="0"/>
-    <w:lsdException w:name="Medium Shading 1 Accent 1" w:semiHidden="0" w:uiPriority="63" w:unhideWhenUsed="0"/>
-    <w:lsdException w:name="Medium Shading 2 Accent 1" w:semiHidden="0" w:uiPriority="64" w:unhideWhenUsed="0"/>
-    <w:lsdException w:name="Medium List 1 Accent 1" w:semiHidden="0" w:uiPriority="65" w:unhideWhenUsed="0"/>
-    <w:lsdException w:name="Revision" w:unhideWhenUsed="0"/>
-    <w:lsdException w:name="List Paragraph" w:semiHidden="0" w:uiPriority="34" w:unhideWhenUsed="0" w:qFormat="1"/>
-    <w:lsdException w:name="Quote" w:semiHidden="0" w:uiPriority="29" w:unhideWhenUsed="0" w:qFormat="1"/>
-    <w:lsdException w:name="Intense Quote" w:semiHidden="0" w:uiPriority="30" w:unhideWhenUsed="0" w:qFormat="1"/>
-    <w:lsdException w:name="Medium List 2 Accent 1" w:semiHidden="0" w:uiPriority="66" w:unhideWhenUsed="0"/>
-    <w:lsdException w:name="Medium Grid 1 Accent 1" w:semiHidden="0" w:uiPriority="67" w:unhideWhenUsed="0"/>
-    <w:lsdException w:name="Medium Grid 2 Accent 1" w:semiHidden="0" w:uiPriority="68" w:unhideWhenUsed="0"/>
-    <w:lsdException w:name="Medium Grid 3 Accent 1" w:semiHidden="0" w:uiPriority="69" w:unhideWhenUsed="0"/>
-    <w:lsdException w:name="Dark List Accent 1" w:semiHidden="0" w:uiPriority="70" w:unhideWhenUsed="0"/>
-    <w:lsdException w:name="Colorful Shading Accent 1" w:semiHidden="0" w:uiPriority="71" w:unhideWhenUsed="0"/>
-    <w:lsdException w:name="Colorful List Accent 1" w:semiHidden="0" w:uiPriority="72" w:unhideWhenUsed="0"/>
-    <w:lsdException w:name="Colorful Grid Accent 1" w:semiHidden="0" w:uiPriority="73" w:unhideWhenUsed="0"/>
-    <w:lsdException w:name="Light Shading Accent 2" w:semiHidden="0" w:uiPriority="60" w:unhideWhenUsed="0"/>
-    <w:lsdException w:name="Light List Accent 2" w:semiHidden="0" w:uiPriority="61" w:unhideWhenUsed="0"/>
-    <w:lsdException w:name="Light Grid Accent 2" w:semiHidden="0" w:uiPriority="62" w:unhideWhenUsed="0"/>
-    <w:lsdException w:name="Medium Shading 1 Accent 2" w:semiHidden="0" w:uiPriority="63" w:unhideWhenUsed="0"/>
-    <w:lsdException w:name="Medium Shading 2 Accent 2" w:semiHidden="0" w:uiPriority="64" w:unhideWhenUsed="0"/>
-    <w:lsdException w:name="Medium List 1 Accent 2" w:semiHidden="0" w:uiPriority="65" w:unhideWhenUsed="0"/>
-    <w:lsdException w:name="Medium List 2 Accent 2" w:semiHidden="0" w:uiPriority="66" w:unhideWhenUsed="0"/>
-    <w:lsdException w:name="Medium Grid 1 Accent 2" w:semiHidden="0" w:uiPriority="67" w:unhideWhenUsed="0"/>
-    <w:lsdException w:name="Medium Grid 2 Accent 2" w:semiHidden="0" w:uiPriority="68" w:unhideWhenUsed="0"/>
-    <w:lsdException w:name="Medium Grid 3 Accent 2" w:semiHidden="0" w:uiPriority="69" w:unhideWhenUsed="0"/>
-    <w:lsdException w:name="Dark List Accent 2" w:semiHidden="0" w:uiPriority="70" w:unhideWhenUsed="0"/>
-    <w:lsdException w:name="Colorful Shading Accent 2" w:semiHidden="0" w:uiPriority="71" w:unhideWhenUsed="0"/>
-    <w:lsdException w:name="Colorful List Accent 2" w:semiHidden="0" w:uiPriority="72" w:unhideWhenUsed="0"/>
-    <w:lsdException w:name="Colorful Grid Accent 2" w:semiHidden="0" w:uiPriority="73" w:unhideWhenUsed="0"/>
-    <w:lsdException w:name="Light Shading Accent 3" w:semiHidden="0" w:uiPriority="60" w:unhideWhenUsed="0"/>
-    <w:lsdException w:name="Light List Accent 3" w:semiHidden="0" w:uiPriority="61" w:unhideWhenUsed="0"/>
-    <w:lsdException w:name="Light Grid Accent 3" w:semiHidden="0" w:uiPriority="62" w:unhideWhenUsed="0"/>
-    <w:lsdException w:name="Medium Shading 1 Accent 3" w:semiHidden="0" w:uiPriority="63" w:unhideWhenUsed="0"/>
-    <w:lsdException w:name="Medium Shading 2 Accent 3" w:semiHidden="0" w:uiPriority="64" w:unhideWhenUsed="0"/>
-    <w:lsdException w:name="Medium List 1 Accent 3" w:semiHidden="0" w:uiPriority="65" w:unhideWhenUsed="0"/>
-    <w:lsdException w:name="Medium List 2 Accent 3" w:semiHidden="0" w:uiPriority="66" w:unhideWhenUsed="0"/>
-    <w:lsdException w:name="Medium Grid 1 Accent 3" w:semiHidden="0" w:uiPriority="67" w:unhideWhenUsed="0"/>
-    <w:lsdException w:name="Medium Grid 2 Accent 3" w:semiHidden="0" w:uiPriority="68" w:unhideWhenUsed="0"/>
-    <w:lsdException w:name="Medium Grid 3 Accent 3" w:semiHidden="0" w:uiPriority="69" w:unhideWhenUsed="0"/>
-    <w:lsdException w:name="Dark List Accent 3" w:semiHidden="0" w:uiPriority="70" w:unhideWhenUsed="0"/>
-    <w:lsdException w:name="Colorful Shading Accent 3" w:semiHidden="0" w:uiPriority="71" w:unhideWhenUsed="0"/>
-    <w:lsdException w:name="Colorful List Accent 3" w:semiHidden="0" w:uiPriority="72" w:unhideWhenUsed="0"/>
-    <w:lsdException w:name="Colorful Grid Accent 3" w:semiHidden="0" w:uiPriority="73" w:unhideWhenUsed="0"/>
-    <w:lsdException w:name="Light Shading Accent 4" w:semiHidden="0" w:uiPriority="60" w:unhideWhenUsed="0"/>
-    <w:lsdException w:name="Light List Accent 4" w:semiHidden="0" w:uiPriority="61" w:unhideWhenUsed="0"/>
-    <w:lsdException w:name="Light Grid Accent 4" w:semiHidden="0" w:uiPriority="62" w:unhideWhenUsed="0"/>
-    <w:lsdException w:name="Medium Shading 1 Accent 4" w:semiHidden="0" w:uiPriority="63" w:unhideWhenUsed="0"/>
-    <w:lsdException w:name="Medium Shading 2 Accent 4" w:semiHidden="0" w:uiPriority="64" w:unhideWhenUsed="0"/>
-    <w:lsdException w:name="Medium List 1 Accent 4" w:semiHidden="0" w:uiPriority="65" w:unhideWhenUsed="0"/>
-    <w:lsdException w:name="Medium List 2 Accent 4" w:semiHidden="0" w:uiPriority="66" w:unhideWhenUsed="0"/>
-    <w:lsdException w:name="Medium Grid 1 Accent 4" w:semiHidden="0" w:uiPriority="67" w:unhideWhenUsed="0"/>
-    <w:lsdException w:name="Medium Grid 2 Accent 4" w:semiHidden="0" w:uiPriority="68" w:unhideWhenUsed="0"/>
-    <w:lsdException w:name="Medium Grid 3 Accent 4" w:semiHidden="0" w:uiPriority="69" w:unhideWhenUsed="0"/>
-    <w:lsdException w:name="Dark List Accent 4" w:semiHidden="0" w:uiPriority="70" w:unhideWhenUsed="0"/>
-    <w:lsdException w:name="Colorful Shading Accent 4" w:semiHidden="0" w:uiPriority="71" w:unhideWhenUsed="0"/>
-    <w:lsdException w:name="Colorful List Accent 4" w:semiHidden="0" w:uiPriority="72" w:unhideWhenUsed="0"/>
-    <w:lsdException w:name="Colorful Grid Accent 4" w:semiHidden="0" w:uiPriority="73" w:unhideWhenUsed="0"/>
-    <w:lsdException w:name="Light Shading Accent 5" w:semiHidden="0" w:uiPriority="60" w:unhideWhenUsed="0"/>
-    <w:lsdException w:name="Light List Accent 5" w:semiHidden="0" w:uiPriority="61" w:unhideWhenUsed="0"/>
-    <w:lsdException w:name="Light Grid Accent 5" w:semiHidden="0" w:uiPriority="62" w:unhideWhenUsed="0"/>
-    <w:lsdException w:name="Medium Shading 1 Accent 5" w:semiHidden="0" w:uiPriority="63" w:unhideWhenUsed="0"/>
-    <w:lsdException w:name="Medium Shading 2 Accent 5" w:semiHidden="0" w:uiPriority="64" w:unhideWhenUsed="0"/>
-    <w:lsdException w:name="Medium List 1 Accent 5" w:semiHidden="0" w:uiPriority="65" w:unhideWhenUsed="0"/>
-    <w:lsdException w:name="Medium List 2 Accent 5" w:semiHidden="0" w:uiPriority="66" w:unhideWhenUsed="0"/>
-    <w:lsdException w:name="Medium Grid 1 Accent 5" w:semiHidden="0" w:uiPriority="67" w:unhideWhenUsed="0"/>
-    <w:lsdException w:name="Medium Grid 2 Accent 5" w:semiHidden="0" w:uiPriority="68" w:unhideWhenUsed="0"/>
-    <w:lsdException w:name="Medium Grid 3 Accent 5" w:semiHidden="0" w:uiPriority="69" w:unhideWhenUsed="0"/>
-    <w:lsdException w:name="Dark List Accent 5" w:semiHidden="0" w:uiPriority="70" w:unhideWhenUsed="0"/>
-    <w:lsdException w:name="Colorful Shading Accent 5" w:semiHidden="0" w:uiPriority="71" w:unhideWhenUsed="0"/>
-    <w:lsdException w:name="Colorful List Accent 5" w:semiHidden="0" w:uiPriority="72" w:unhideWhenUsed="0"/>
-    <w:lsdException w:name="Colorful Grid Accent 5" w:semiHidden="0" w:uiPriority="73" w:unhideWhenUsed="0"/>
-    <w:lsdException w:name="Light Shading Accent 6" w:semiHidden="0" w:uiPriority="60" w:unhideWhenUsed="0"/>
-    <w:lsdException w:name="Light List Accent 6" w:semiHidden="0" w:uiPriority="61" w:unhideWhenUsed="0"/>
-    <w:lsdException w:name="Light Grid Accent 6" w:semiHidden="0" w:uiPriority="62" w:unhideWhenUsed="0"/>
-    <w:lsdException w:name="Medium Shading 1 Accent 6" w:semiHidden="0" w:uiPriority="63" w:unhideWhenUsed="0"/>
-    <w:lsdException w:name="Medium Shading 2 Accent 6" w:semiHidden="0" w:uiPriority="64" w:unhideWhenUsed="0"/>
-    <w:lsdException w:name="Medium List 1 Accent 6" w:semiHidden="0" w:uiPriority="65" w:unhideWhenUsed="0"/>
-    <w:lsdException w:name="Medium List 2 Accent 6" w:semiHidden="0" w:uiPriority="66" w:unhideWhenUsed="0"/>
-    <w:lsdException w:name="Medium Grid 1 Accent 6" w:semiHidden="0" w:uiPriority="67" w:unhideWhenUsed="0"/>
-    <w:lsdException w:name="Medium Grid 2 Accent 6" w:semiHidden="0" w:uiPriority="68" w:unhideWhenUsed="0"/>
-    <w:lsdException w:name="Medium Grid 3 Accent 6" w:semiHidden="0" w:uiPriority="69" w:unhideWhenUsed="0"/>
-    <w:lsdException w:name="Dark List Accent 6" w:semiHidden="0" w:uiPriority="70" w:unhideWhenUsed="0"/>
-    <w:lsdException w:name="Colorful Shading Accent 6" w:semiHidden="0" w:uiPriority="71" w:unhideWhenUsed="0"/>
-    <w:lsdException w:name="Colorful List Accent 6" w:semiHidden="0" w:uiPriority="72" w:unhideWhenUsed="0"/>
-    <w:lsdException w:name="Colorful Grid Accent 6" w:semiHidden="0" w:uiPriority="73" w:unhideWhenUsed="0"/>
-    <w:lsdException w:name="Subtle Emphasis" w:semiHidden="0" w:uiPriority="19" w:unhideWhenUsed="0" w:qFormat="1"/>
-    <w:lsdException w:name="Intense Emphasis" w:semiHidden="0" w:uiPriority="21" w:unhideWhenUsed="0" w:qFormat="1"/>
-    <w:lsdException w:name="Subtle Reference" w:semiHidden="0" w:uiPriority="31" w:unhideWhenUsed="0" w:qFormat="1"/>
-    <w:lsdException w:name="Intense Reference" w:semiHidden="0" w:uiPriority="32" w:unhideWhenUsed="0" w:qFormat="1"/>
-    <w:lsdException w:name="Book Title" w:semiHidden="0" w:uiPriority="33" w:unhideWhenUsed="0" w:qFormat="1"/>
-    <w:lsdException w:name="Bibliography" w:uiPriority="37"/>
-    <w:lsdException w:name="TOC Heading" w:uiPriority="39" w:qFormat="1"/>
-  </w:latentStyles>
-  <w:style w:type="paragraph" w:default="1" w:styleId="Normal">
-    <w:name w:val="Normal"/>
-    <w:qFormat/>
-    <w:rPr>
-      <w:sz w:val="24"/>
-      <w:szCs w:val="24"/>
-    </w:rPr>
-  </w:style>
-  <w:style w:type="character" w:default="1" w:styleId="DefaultParagraphFont">
-    <w:name w:val="Default Paragraph Font"/>
-    <w:uiPriority w:val="1"/>
-    <w:semiHidden/>
-    <w:unhideWhenUsed/>
-  </w:style>
-  <w:style w:type="table" w:default="1" w:styleId="TableNormal">
-    <w:name w:val="Normal Table"/>
-    <w:uiPriority w:val="99"/>
-    <w:semiHidden/>
-    <w:unhideWhenUsed/>
-    <w:tblPr>
-      <w:tblInd w:w="0" w:type="dxa"/>
-      <w:tblCellMar>
-        <w:top w:w="0" w:type="dxa"/>
-        <w:left w:w="108" w:type="dxa"/>
-        <w:bottom w:w="0" w:type="dxa"/>
-        <w:right w:w="108" w:type="dxa"/>
-      </w:tblCellMar>
-    </w:tblPr>
-  </w:style>
-  <w:style w:type="numbering" w:default="1" w:styleId="NoList">
-    <w:name w:val="No List"/>
-    <w:uiPriority w:val="99"/>
-    <w:semiHidden/>
-    <w:unhideWhenUsed/>
-  </w:style>
-  <w:style w:type="paragraph" w:styleId="Header">
-    <w:name w:val="header"/>
-    <w:basedOn w:val="Normal"/>
-    <w:semiHidden/>
-    <w:pPr>
-      <w:tabs>
-        <w:tab w:val="center" w:pos="4320"/>
-        <w:tab w:val="right" w:pos="8640"/>
-      </w:tabs>
-    </w:pPr>
-  </w:style>
-  <w:style w:type="paragraph" w:styleId="Footer">
-    <w:name w:val="footer"/>
-    <w:basedOn w:val="Normal"/>
-    <w:semiHidden/>
-    <w:pPr>
-      <w:tabs>
-        <w:tab w:val="center" w:pos="4320"/>
-        <w:tab w:val="right" w:pos="8640"/>
-      </w:tabs>
-    </w:pPr>
-  </w:style>
-  <w:style w:type="character" w:styleId="PageNumber">
-    <w:name w:val="page number"/>
-    <w:basedOn w:val="DefaultParagraphFont"/>
-    <w:semiHidden/>
-  </w:style>
-  <w:style w:type="paragraph" w:styleId="Title">
-    <w:name w:val="Title"/>
-    <w:basedOn w:val="Normal"/>
-    <w:qFormat/>
-    <w:pPr>
-      <w:jc w:val="center"/>
-    </w:pPr>
-    <w:rPr>
-      <w:b/>
-      <w:bCs/>
-      <w:sz w:val="28"/>
-    </w:rPr>
-  </w:style>
-  <w:style w:type="paragraph" w:styleId="BalloonText">
-    <w:name w:val="Balloon Text"/>
-    <w:basedOn w:val="Normal"/>
-    <w:link w:val="BalloonTextChar"/>
-    <w:uiPriority w:val="99"/>
-    <w:semiHidden/>
-    <w:unhideWhenUsed/>
-    <w:rsid w:val="00BE4E37"/>
-    <w:rPr>
-      <w:rFonts w:ascii="Tahoma" w:hAnsi="Tahoma" w:cs="Tahoma"/>
-      <w:sz w:val="16"/>
-      <w:szCs w:val="16"/>
-    </w:rPr>
-  </w:style>
-  <w:style w:type="character" w:customStyle="1" w:styleId="BalloonTextChar">
-    <w:name w:val="Balloon Text Char"/>
-    <w:basedOn w:val="DefaultParagraphFont"/>
-    <w:link w:val="BalloonText"/>
-    <w:uiPriority w:val="99"/>
-    <w:semiHidden/>
-    <w:rsid w:val="00BE4E37"/>
-    <w:rPr>
-      <w:rFonts w:ascii="Tahoma" w:hAnsi="Tahoma" w:cs="Tahoma"/>
-      <w:sz w:val="16"/>
-      <w:szCs w:val="16"/>
-    </w:rPr>
-  </w:style>
-</w:styles>
-</file>
-
-<file path=word/stylesWithEffects.xml><?xml version="1.0" encoding="utf-8"?>
-<w:styles xmlns:wpc="http://schemas.microsoft.com/office/word/2010/wordprocessingCanvas" xmlns:mc="http://schemas.openxmlformats.org/markup-compatibility/2006" xmlns:o="urn:schemas-microsoft-com:office:office" xmlns:r="http://schemas.openxmlformats.org/officeDocument/2006/relationships" xmlns:m="http://schemas.openxmlformats.org/officeDocument/2006/math" xmlns:v="urn:schemas-microsoft-com:vml" xmlns:wp14="http://schemas.microsoft.com/office/word/2010/wordprocessingDrawing" xmlns:wp="http://schemas.openxmlformats.org/drawingml/2006/wordprocessingDrawing" xmlns:w10="urn:schemas-microsoft-com:office:word" xmlns:w="http://schemas.openxmlformats.org/wordprocessingml/2006/main" xmlns:w14="http://schemas.microsoft.com/office/word/2010/wordml" xmlns:wpg="http://schemas.microsoft.com/office/word/2010/wordprocessingGroup" xmlns:wpi="http://schemas.microsoft.com/office/word/2010/wordprocessingInk" xmlns:wne="http://schemas.microsoft.com/office/word/2006/wordml" xmlns:wps="http://schemas.microsoft.com/office/word/2010/wordprocessingShape" mc:Ignorable="w14 wp14">
-  <w:docDefaults>
-    <w:rPrDefault>
-      <w:rPr>
-        <w:rFonts w:ascii="Times New Roman" w:eastAsia="Times New Roman" w:hAnsi="Times New Roman" w:cs="Times New Roman"/>
-        <w:lang w:val="en-US" w:eastAsia="en-US" w:bidi="ar-SA"/>
-      </w:rPr>
-    </w:rPrDefault>
-    <w:pPrDefault/>
-  </w:docDefaults>
-  <w:latentStyles w:defLockedState="0" w:defUIPriority="99" w:defSemiHidden="1" w:defUnhideWhenUsed="1" w:defQFormat="0" w:count="267">
-    <w:lsdException w:name="Normal" w:semiHidden="0" w:uiPriority="0" w:unhideWhenUsed="0" w:qFormat="1"/>
-    <w:lsdException w:name="heading 1" w:semiHidden="0" w:uiPriority="9" w:unhideWhenUsed="0" w:qFormat="1"/>
-    <w:lsdException w:name="heading 2" w:uiPriority="9" w:qFormat="1"/>
-    <w:lsdException w:name="heading 3" w:uiPriority="9" w:qFormat="1"/>
-    <w:lsdException w:name="heading 4" w:uiPriority="9" w:qFormat="1"/>
-    <w:lsdException w:name="heading 5" w:uiPriority="9" w:qFormat="1"/>
-    <w:lsdException w:name="heading 6" w:uiPriority="9" w:qFormat="1"/>
-    <w:lsdException w:name="heading 7" w:uiPriority="9" w:qFormat="1"/>
-    <w:lsdException w:name="heading 8" w:uiPriority="9" w:qFormat="1"/>
-    <w:lsdException w:name="heading 9" w:uiPriority="9" w:qFormat="1"/>
-    <w:lsdException w:name="toc 1" w:uiPriority="39"/>
-    <w:lsdException w:name="toc 2" w:uiPriority="39"/>
-    <w:lsdException w:name="toc 3" w:uiPriority="39"/>
-    <w:lsdException w:name="toc 4" w:uiPriority="39"/>
-    <w:lsdException w:name="toc 5" w:uiPriority="39"/>
-    <w:lsdException w:name="toc 6" w:uiPriority="39"/>
-    <w:lsdException w:name="toc 7" w:uiPriority="39"/>
-    <w:lsdException w:name="toc 8" w:uiPriority="39"/>
-    <w:lsdException w:name="toc 9" w:uiPriority="39"/>
-    <w:lsdException w:name="caption" w:uiPriority="35" w:qFormat="1"/>
-    <w:lsdException w:name="Title" w:semiHidden="0" w:uiPriority="10" w:unhideWhenUsed="0" w:qFormat="1"/>
-    <w:lsdException w:name="Default Paragraph Font" w:uiPriority="1"/>
-    <w:lsdException w:name="Subtitle" w:semiHidden="0" w:uiPriority="11" w:unhideWhenUsed="0" w:qFormat="1"/>
-    <w:lsdException w:name="Strong" w:semiHidden="0" w:uiPriority="22" w:unhideWhenUsed="0" w:qFormat="1"/>
-    <w:lsdException w:name="Emphasis" w:semiHidden="0" w:uiPriority="20" w:unhideWhenUsed="0" w:qFormat="1"/>
-    <w:lsdException w:name="Table Grid" w:semiHidden="0" w:uiPriority="59" w:unhideWhenUsed="0"/>
-    <w:lsdException w:name="Placeholder Text" w:unhideWhenUsed="0"/>
-    <w:lsdException w:name="No Spacing" w:semiHidden="0" w:uiPriority="1" w:unhideWhenUsed="0" w:qFormat="1"/>
-    <w:lsdException w:name="Light Shading" w:semiHidden="0" w:uiPriority="60" w:unhideWhenUsed="0"/>
-    <w:lsdException w:name="Light List" w:semiHidden="0" w:uiPriority="61" w:unhideWhenUsed="0"/>
-    <w:lsdException w:name="Light Grid" w:semiHidden="0" w:uiPriority="62" w:unhideWhenUsed="0"/>
-    <w:lsdException w:name="Medium Shading 1" w:semiHidden="0" w:uiPriority="63" w:unhideWhenUsed="0"/>
-    <w:lsdException w:name="Medium Shading 2" w:semiHidden="0" w:uiPriority="64" w:unhideWhenUsed="0"/>
-    <w:lsdException w:name="Medium List 1" w:semiHidden="0" w:uiPriority="65" w:unhideWhenUsed="0"/>
-    <w:lsdException w:name="Medium List 2" w:semiHidden="0" w:uiPriority="66" w:unhideWhenUsed="0"/>
-    <w:lsdException w:name="Medium Grid 1" w:semiHidden="0" w:uiPriority="67" w:unhideWhenUsed="0"/>
-    <w:lsdException w:name="Medium Grid 2" w:semiHidden="0" w:uiPriority="68" w:unhideWhenUsed="0"/>
-    <w:lsdException w:name="Medium Grid 3" w:semiHidden="0" w:uiPriority="69" w:unhideWhenUsed="0"/>
-    <w:lsdException w:name="Dark List" w:semiHidden="0" w:uiPriority="70" w:unhideWhenUsed="0"/>
-    <w:lsdException w:name="Colorful Shading" w:semiHidden="0" w:uiPriority="71" w:unhideWhenUsed="0"/>
-    <w:lsdException w:name="Colorful List" w:semiHidden="0" w:uiPriority="72" w:unhideWhenUsed="0"/>
-    <w:lsdException w:name="Colorful Grid" w:semiHidden="0" w:uiPriority="73" w:unhideWhenUsed="0"/>
-    <w:lsdException w:name="Light Shading Accent 1" w:semiHidden="0" w:uiPriority="60" w:unhideWhenUsed="0"/>
-    <w:lsdException w:name="Light List Accent 1" w:semiHidden="0" w:uiPriority="61" w:unhideWhenUsed="0"/>
-    <w:lsdException w:name="Light Grid Accent 1" w:semiHidden="0" w:uiPriority="62" w:unhideWhenUsed="0"/>
-    <w:lsdException w:name="Medium Shading 1 Accent 1" w:semiHidden="0" w:uiPriority="63" w:unhideWhenUsed="0"/>
-    <w:lsdException w:name="Medium Shading 2 Accent 1" w:semiHidden="0" w:uiPriority="64" w:unhideWhenUsed="0"/>
-    <w:lsdException w:name="Medium List 1 Accent 1" w:semiHidden="0" w:uiPriority="65" w:unhideWhenUsed="0"/>
-    <w:lsdException w:name="Revision" w:unhideWhenUsed="0"/>
-    <w:lsdException w:name="List Paragraph" w:semiHidden="0" w:uiPriority="34" w:unhideWhenUsed="0" w:qFormat="1"/>
-    <w:lsdException w:name="Quote" w:semiHidden="0" w:uiPriority="29" w:unhideWhenUsed="0" w:qFormat="1"/>
-    <w:lsdException w:name="Intense Quote" w:semiHidden="0" w:uiPriority="30" w:unhideWhenUsed="0" w:qFormat="1"/>
-    <w:lsdException w:name="Medium List 2 Accent 1" w:semiHidden="0" w:uiPriority="66" w:unhideWhenUsed="0"/>
-    <w:lsdException w:name="Medium Grid 1 Accent 1" w:semiHidden="0" w:uiPriority="67" w:unhideWhenUsed="0"/>
-    <w:lsdException w:name="Medium Grid 2 Accent 1" w:semiHidden="0" w:uiPriority="68" w:unhideWhenUsed="0"/>
-    <w:lsdException w:name="Medium Grid 3 Accent 1" w:semiHidden="0" w:uiPriority="69" w:unhideWhenUsed="0"/>
-    <w:lsdException w:name="Dark List Accent 1" w:semiHidden="0" w:uiPriority="70" w:unhideWhenUsed="0"/>
-    <w:lsdException w:name="Colorful Shading Accent 1" w:semiHidden="0" w:uiPriority="71" w:unhideWhenUsed="0"/>
-    <w:lsdException w:name="Colorful List Accent 1" w:semiHidden="0" w:uiPriority="72" w:unhideWhenUsed="0"/>
-    <w:lsdException w:name="Colorful Grid Accent 1" w:semiHidden="0" w:uiPriority="73" w:unhideWhenUsed="0"/>
-    <w:lsdException w:name="Light Shading Accent 2" w:semiHidden="0" w:uiPriority="60" w:unhideWhenUsed="0"/>
-    <w:lsdException w:name="Light List Accent 2" w:semiHidden="0" w:uiPriority="61" w:unhideWhenUsed="0"/>
-    <w:lsdException w:name="Light Grid Accent 2" w:semiHidden="0" w:uiPriority="62" w:unhideWhenUsed="0"/>
-    <w:lsdException w:name="Medium Shading 1 Accent 2" w:semiHidden="0" w:uiPriority="63" w:unhideWhenUsed="0"/>
-    <w:lsdException w:name="Medium Shading 2 Accent 2" w:semiHidden="0" w:uiPriority="64" w:unhideWhenUsed="0"/>
-    <w:lsdException w:name="Medium List 1 Accent 2" w:semiHidden="0" w:uiPriority="65" w:unhideWhenUsed="0"/>
-    <w:lsdException w:name="Medium List 2 Accent 2" w:semiHidden="0" w:uiPriority="66" w:unhideWhenUsed="0"/>
-    <w:lsdException w:name="Medium Grid 1 Accent 2" w:semiHidden="0" w:uiPriority="67" w:unhideWhenUsed="0"/>
-    <w:lsdException w:name="Medium Grid 2 Accent 2" w:semiHidden="0" w:uiPriority="68" w:unhideWhenUsed="0"/>
-    <w:lsdException w:name="Medium Grid 3 Accent 2" w:semiHidden="0" w:uiPriority="69" w:unhideWhenUsed="0"/>
-    <w:lsdException w:name="Dark List Accent 2" w:semiHidden="0" w:uiPriority="70" w:unhideWhenUsed="0"/>
-    <w:lsdException w:name="Colorful Shading Accent 2" w:semiHidden="0" w:uiPriority="71" w:unhideWhenUsed="0"/>
-    <w:lsdException w:name="Colorful List Accent 2" w:semiHidden="0" w:uiPriority="72" w:unhideWhenUsed="0"/>
-    <w:lsdException w:name="Colorful Grid Accent 2" w:semiHidden="0" w:uiPriority="73" w:unhideWhenUsed="0"/>
-    <w:lsdException w:name="Light Shading Accent 3" w:semiHidden="0" w:uiPriority="60" w:unhideWhenUsed="0"/>
-    <w:lsdException w:name="Light List Accent 3" w:semiHidden="0" w:uiPriority="61" w:unhideWhenUsed="0"/>
-    <w:lsdException w:name="Light Grid Accent 3" w:semiHidden="0" w:uiPriority="62" w:unhideWhenUsed="0"/>
-    <w:lsdException w:name="Medium Shading 1 Accent 3" w:semiHidden="0" w:uiPriority="63" w:unhideWhenUsed="0"/>
-    <w:lsdException w:name="Medium Shading 2 Accent 3" w:semiHidden="0" w:uiPriority="64" w:unhideWhenUsed="0"/>
-    <w:lsdException w:name="Medium List 1 Accent 3" w:semiHidden="0" w:uiPriority="65" w:unhideWhenUsed="0"/>
-    <w:lsdException w:name="Medium List 2 Accent 3" w:semiHidden="0" w:uiPriority="66" w:unhideWhenUsed="0"/>
-    <w:lsdException w:name="Medium Grid 1 Accent 3" w:semiHidden="0" w:uiPriority="67" w:unhideWhenUsed="0"/>
-    <w:lsdException w:name="Medium Grid 2 Accent 3" w:semiHidden="0" w:uiPriority="68" w:unhideWhenUsed="0"/>
-    <w:lsdException w:name="Medium Grid 3 Accent 3" w:semiHidden="0" w:uiPriority="69" w:unhideWhenUsed="0"/>
-    <w:lsdException w:name="Dark List Accent 3" w:semiHidden="0" w:uiPriority="70" w:unhideWhenUsed="0"/>
-    <w:lsdException w:name="Colorful Shading Accent 3" w:semiHidden="0" w:uiPriority="71" w:unhideWhenUsed="0"/>
-    <w:lsdException w:name="Colorful List Accent 3" w:semiHidden="0" w:uiPriority="72" w:unhideWhenUsed="0"/>
-    <w:lsdException w:name="Colorful Grid Accent 3" w:semiHidden="0" w:uiPriority="73" w:unhideWhenUsed="0"/>
-    <w:lsdException w:name="Light Shading Accent 4" w:semiHidden="0" w:uiPriority="60" w:unhideWhenUsed="0"/>
-    <w:lsdException w:name="Light List Accent 4" w:semiHidden="0" w:uiPriority="61" w:unhideWhenUsed="0"/>
-    <w:lsdException w:name="Light Grid Accent 4" w:semiHidden="0" w:uiPriority="62" w:unhideWhenUsed="0"/>
-    <w:lsdException w:name="Medium Shading 1 Accent 4" w:semiHidden="0" w:uiPriority="63" w:unhideWhenUsed="0"/>
-    <w:lsdException w:name="Medium Shading 2 Accent 4" w:semiHidden="0" w:uiPriority="64" w:unhideWhenUsed="0"/>
-    <w:lsdException w:name="Medium List 1 Accent 4" w:semiHidden="0" w:uiPriority="65" w:unhideWhenUsed="0"/>
-    <w:lsdException w:name="Medium List 2 Accent 4" w:semiHidden="0" w:uiPriority="66" w:unhideWhenUsed="0"/>
-    <w:lsdException w:name="Medium Grid 1 Accent 4" w:semiHidden="0" w:uiPriority="67" w:unhideWhenUsed="0"/>
-    <w:lsdException w:name="Medium Grid 2 Accent 4" w:semiHidden="0" w:uiPriority="68" w:unhideWhenUsed="0"/>
-    <w:lsdException w:name="Medium Grid 3 Accent 4" w:semiHidden="0" w:uiPriority="69" w:unhideWhenUsed="0"/>
-    <w:lsdException w:name="Dark List Accent 4" w:semiHidden="0" w:uiPriority="70" w:unhideWhenUsed="0"/>
-    <w:lsdException w:name="Colorful Shading Accent 4" w:semiHidden="0" w:uiPriority="71" w:unhideWhenUsed="0"/>
-    <w:lsdException w:name="Colorful List Accent 4" w:semiHidden="0" w:uiPriority="72" w:unhideWhenUsed="0"/>
-    <w:lsdException w:name="Colorful Grid Accent 4" w:semiHidden="0" w:uiPriority="73" w:unhideWhenUsed="0"/>
-    <w:lsdException w:name="Light Shading Accent 5" w:semiHidden="0" w:uiPriority="60" w:unhideWhenUsed="0"/>
-    <w:lsdException w:name="Light List Accent 5" w:semiHidden="0" w:uiPriority="61" w:unhideWhenUsed="0"/>
-    <w:lsdException w:name="Light Grid Accent 5" w:semiHidden="0" w:uiPriority="62" w:unhideWhenUsed="0"/>
-    <w:lsdException w:name="Medium Shading 1 Accent 5" w:semiHidden="0" w:uiPriority="63" w:unhideWhenUsed="0"/>
-    <w:lsdException w:name="Medium Shading 2 Accent 5" w:semiHidden="0" w:uiPriority="64" w:unhideWhenUsed="0"/>
-    <w:lsdException w:name="Medium List 1 Accent 5" w:semiHidden="0" w:uiPriority="65" w:unhideWhenUsed="0"/>
-    <w:lsdException w:name="Medium List 2 Accent 5" w:semiHidden="0" w:uiPriority="66" w:unhideWhenUsed="0"/>
-    <w:lsdException w:name="Medium Grid 1 Accent 5" w:semiHidden="0" w:uiPriority="67" w:unhideWhenUsed="0"/>
-    <w:lsdException w:name="Medium Grid 2 Accent 5" w:semiHidden="0" w:uiPriority="68" w:unhideWhenUsed="0"/>
-    <w:lsdException w:name="Medium Grid 3 Accent 5" w:semiHidden="0" w:uiPriority="69" w:unhideWhenUsed="0"/>
-    <w:lsdException w:name="Dark List Accent 5" w:semiHidden="0" w:uiPriority="70" w:unhideWhenUsed="0"/>
-    <w:lsdException w:name="Colorful Shading Accent 5" w:semiHidden="0" w:uiPriority="71" w:unhideWhenUsed="0"/>
-    <w:lsdException w:name="Colorful List Accent 5" w:semiHidden="0" w:uiPriority="72" w:unhideWhenUsed="0"/>
-    <w:lsdException w:name="Colorful Grid Accent 5" w:semiHidden="0" w:uiPriority="73" w:unhideWhenUsed="0"/>
-    <w:lsdException w:name="Light Shading Accent 6" w:semiHidden="0" w:uiPriority="60" w:unhideWhenUsed="0"/>
-    <w:lsdException w:name="Light List Accent 6" w:semiHidden="0" w:uiPriority="61" w:unhideWhenUsed="0"/>
-    <w:lsdException w:name="Light Grid Accent 6" w:semiHidden="0" w:uiPriority="62" w:unhideWhenUsed="0"/>
-    <w:lsdException w:name="Medium Shading 1 Accent 6" w:semiHidden="0" w:uiPriority="63" w:unhideWhenUsed="0"/>
-    <w:lsdException w:name="Medium Shading 2 Accent 6" w:semiHidden="0" w:uiPriority="64" w:unhideWhenUsed="0"/>
-    <w:lsdException w:name="Medium List 1 Accent 6" w:semiHidden="0" w:uiPriority="65" w:unhideWhenUsed="0"/>
-    <w:lsdException w:name="Medium List 2 Accent 6" w:semiHidden="0" w:uiPriority="66" w:unhideWhenUsed="0"/>
-    <w:lsdException w:name="Medium Grid 1 Accent 6" w:semiHidden="0" w:uiPriority="67" w:unhideWhenUsed="0"/>
-    <w:lsdException w:name="Medium Grid 2 Accent 6" w:semiHidden="0" w:uiPriority="68" w:unhideWhenUsed="0"/>
-    <w:lsdException w:name="Medium Grid 3 Accent 6" w:semiHidden="0" w:uiPriority="69" w:unhideWhenUsed="0"/>
-    <w:lsdException w:name="Dark List Accent 6" w:semiHidden="0" w:uiPriority="70" w:unhideWhenUsed="0"/>
-    <w:lsdException w:name="Colorful Shading Accent 6" w:semiHidden="0" w:uiPriority="71" w:unhideWhenUsed="0"/>
-    <w:lsdException w:name="Colorful List Accent 6" w:semiHidden="0" w:uiPriority="72" w:unhideWhenUsed="0"/>
-    <w:lsdException w:name="Colorful Grid Accent 6" w:semiHidden="0" w:uiPriority="73" w:unhideWhenUsed="0"/>
-    <w:lsdException w:name="Subtle Emphasis" w:semiHidden="0" w:uiPriority="19" w:unhideWhenUsed="0" w:qFormat="1"/>
-    <w:lsdException w:name="Intense Emphasis" w:semiHidden="0" w:uiPriority="21" w:unhideWhenUsed="0" w:qFormat="1"/>
-    <w:lsdException w:name="Subtle Reference" w:semiHidden="0" w:uiPriority="31" w:unhideWhenUsed="0" w:qFormat="1"/>
-    <w:lsdException w:name="Intense Reference" w:semiHidden="0" w:uiPriority="32" w:unhideWhenUsed="0" w:qFormat="1"/>
-    <w:lsdException w:name="Book Title" w:semiHidden="0" w:uiPriority="33" w:unhideWhenUsed="0" w:qFormat="1"/>
-    <w:lsdException w:name="Bibliography" w:uiPriority="37"/>
-    <w:lsdException w:name="TOC Heading" w:uiPriority="39" w:qFormat="1"/>
+  <w:latentStyles w:defLockedState="0" w:defUIPriority="99" w:defSemiHidden="0" w:defUnhideWhenUsed="0" w:defQFormat="0" w:count="376">
+    <w:lsdException w:name="Normal" w:uiPriority="0" w:qFormat="1"/>
+    <w:lsdException w:name="heading 1" w:uiPriority="9" w:qFormat="1"/>
+    <w:lsdException w:name="heading 2" w:semiHidden="1" w:uiPriority="9" w:unhideWhenUsed="1" w:qFormat="1"/>
+    <w:lsdException w:name="heading 3" w:semiHidden="1" w:uiPriority="9" w:unhideWhenUsed="1" w:qFormat="1"/>
+    <w:lsdException w:name="heading 4" w:semiHidden="1" w:uiPriority="9" w:unhideWhenUsed="1" w:qFormat="1"/>
+    <w:lsdException w:name="heading 5" w:semiHidden="1" w:uiPriority="9" w:unhideWhenUsed="1" w:qFormat="1"/>
+    <w:lsdException w:name="heading 6" w:semiHidden="1" w:uiPriority="9" w:unhideWhenUsed="1" w:qFormat="1"/>
+    <w:lsdException w:name="heading 7" w:semiHidden="1" w:uiPriority="9" w:unhideWhenUsed="1" w:qFormat="1"/>
+    <w:lsdException w:name="heading 8" w:semiHidden="1" w:uiPriority="9" w:unhideWhenUsed="1" w:qFormat="1"/>
+    <w:lsdException w:name="heading 9" w:semiHidden="1" w:uiPriority="9" w:unhideWhenUsed="1" w:qFormat="1"/>
+    <w:lsdException w:name="index 1" w:semiHidden="1" w:unhideWhenUsed="1"/>
+    <w:lsdException w:name="index 2" w:semiHidden="1" w:unhideWhenUsed="1"/>
+    <w:lsdException w:name="index 3" w:semiHidden="1" w:unhideWhenUsed="1"/>
+    <w:lsdException w:name="index 4" w:semiHidden="1" w:unhideWhenUsed="1"/>
+    <w:lsdException w:name="index 5" w:semiHidden="1" w:unhideWhenUsed="1"/>
+    <w:lsdException w:name="index 6" w:semiHidden="1" w:unhideWhenUsed="1"/>
+    <w:lsdException w:name="index 7" w:semiHidden="1" w:unhideWhenUsed="1"/>
+    <w:lsdException w:name="index 8" w:semiHidden="1" w:unhideWhenUsed="1"/>
+    <w:lsdException w:name="index 9" w:semiHidden="1" w:unhideWhenUsed="1"/>
+    <w:lsdException w:name="toc 1" w:semiHidden="1" w:uiPriority="39" w:unhideWhenUsed="1"/>
+    <w:lsdException w:name="toc 2" w:semiHidden="1" w:uiPriority="39" w:unhideWhenUsed="1"/>
+    <w:lsdException w:name="toc 3" w:semiHidden="1" w:uiPriority="39" w:unhideWhenUsed="1"/>
+    <w:lsdException w:name="toc 4" w:semiHidden="1" w:uiPriority="39" w:unhideWhenUsed="1"/>
+    <w:lsdException w:name="toc 5" w:semiHidden="1" w:uiPriority="39" w:unhideWhenUsed="1"/>
+    <w:lsdException w:name="toc 6" w:semiHidden="1" w:uiPriority="39" w:unhideWhenUsed="1"/>
+    <w:lsdException w:name="toc 7" w:semiHidden="1" w:uiPriority="39" w:unhideWhenUsed="1"/>
+    <w:lsdException w:name="toc 8" w:semiHidden="1" w:uiPriority="39" w:unhideWhenUsed="1"/>
+    <w:lsdException w:name="toc 9" w:semiHidden="1" w:uiPriority="39" w:unhideWhenUsed="1"/>
+    <w:lsdException w:name="Normal Indent" w:semiHidden="1" w:unhideWhenUsed="1"/>
+    <w:lsdException w:name="footnote text" w:semiHidden="1" w:unhideWhenUsed="1"/>
+    <w:lsdException w:name="annotation text" w:semiHidden="1" w:unhideWhenUsed="1"/>
+    <w:lsdException w:name="header" w:semiHidden="1" w:unhideWhenUsed="1"/>
+    <w:lsdException w:name="footer" w:semiHidden="1" w:unhideWhenUsed="1"/>
+    <w:lsdException w:name="index heading" w:semiHidden="1" w:unhideWhenUsed="1"/>
+    <w:lsdException w:name="caption" w:semiHidden="1" w:uiPriority="35" w:unhideWhenUsed="1" w:qFormat="1"/>
+    <w:lsdException w:name="table of figures" w:semiHidden="1" w:unhideWhenUsed="1"/>
+    <w:lsdException w:name="envelope address" w:semiHidden="1" w:unhideWhenUsed="1"/>
+    <w:lsdException w:name="envelope return" w:semiHidden="1" w:unhideWhenUsed="1"/>
+    <w:lsdException w:name="footnote reference" w:semiHidden="1" w:unhideWhenUsed="1"/>
+    <w:lsdException w:name="annotation reference" w:semiHidden="1" w:unhideWhenUsed="1"/>
+    <w:lsdException w:name="line number" w:semiHidden="1" w:unhideWhenUsed="1"/>
+    <w:lsdException w:name="page number" w:semiHidden="1" w:unhideWhenUsed="1"/>
+    <w:lsdException w:name="endnote reference" w:semiHidden="1" w:unhideWhenUsed="1"/>
+    <w:lsdException w:name="endnote text" w:semiHidden="1" w:unhideWhenUsed="1"/>
+    <w:lsdException w:name="table of authorities" w:semiHidden="1" w:unhideWhenUsed="1"/>
+    <w:lsdException w:name="macro" w:semiHidden="1" w:unhideWhenUsed="1"/>
+    <w:lsdException w:name="toa heading" w:semiHidden="1" w:unhideWhenUsed="1"/>
+    <w:lsdException w:name="List" w:semiHidden="1" w:unhideWhenUsed="1"/>
+    <w:lsdException w:name="List Bullet" w:semiHidden="1" w:unhideWhenUsed="1"/>
+    <w:lsdException w:name="List Number" w:semiHidden="1" w:unhideWhenUsed="1"/>
+    <w:lsdException w:name="List 2" w:semiHidden="1" w:unhideWhenUsed="1"/>
+    <w:lsdException w:name="List 3" w:semiHidden="1" w:unhideWhenUsed="1"/>
+    <w:lsdException w:name="List 4" w:semiHidden="1" w:unhideWhenUsed="1"/>
+    <w:lsdException w:name="List 5" w:semiHidden="1" w:unhideWhenUsed="1"/>
+    <w:lsdException w:name="List Bullet 2" w:semiHidden="1" w:unhideWhenUsed="1"/>
+    <w:lsdException w:name="List Bullet 3" w:semiHidden="1" w:unhideWhenUsed="1"/>
+    <w:lsdException w:name="List Bullet 4" w:semiHidden="1" w:unhideWhenUsed="1"/>
+    <w:lsdException w:name="List Bullet 5" w:semiHidden="1" w:unhideWhenUsed="1"/>
+    <w:lsdException w:name="List Number 2" w:semiHidden="1" w:unhideWhenUsed="1"/>
+    <w:lsdException w:name="List Number 3" w:semiHidden="1" w:unhideWhenUsed="1"/>
+    <w:lsdException w:name="List Number 4" w:semiHidden="1" w:unhideWhenUsed="1"/>
+    <w:lsdException w:name="List Number 5" w:semiHidden="1" w:unhideWhenUsed="1"/>
+    <w:lsdException w:name="Title" w:uiPriority="10" w:qFormat="1"/>
+    <w:lsdException w:name="Closing" w:semiHidden="1" w:unhideWhenUsed="1"/>
+    <w:lsdException w:name="Signature" w:semiHidden="1" w:unhideWhenUsed="1"/>
+    <w:lsdException w:name="Default Paragraph Font" w:semiHidden="1" w:uiPriority="1" w:unhideWhenUsed="1"/>
+    <w:lsdException w:name="Body Text" w:semiHidden="1" w:unhideWhenUsed="1"/>
+    <w:lsdException w:name="Body Text Indent" w:semiHidden="1" w:unhideWhenUsed="1"/>
+    <w:lsdException w:name="List Continue" w:semiHidden="1" w:unhideWhenUsed="1"/>
+    <w:lsdException w:name="List Continue 2" w:semiHidden="1" w:unhideWhenUsed="1"/>
+    <w:lsdException w:name="List Continue 3" w:semiHidden="1" w:unhideWhenUsed="1"/>
+    <w:lsdException w:name="List Continue 4" w:semiHidden="1" w:unhideWhenUsed="1"/>
+    <w:lsdException w:name="List Continue 5" w:semiHidden="1" w:unhideWhenUsed="1"/>
+    <w:lsdException w:name="Message Header" w:semiHidden="1" w:unhideWhenUsed="1"/>
+    <w:lsdException w:name="Subtitle" w:uiPriority="11" w:qFormat="1"/>
+    <w:lsdException w:name="Salutation" w:semiHidden="1" w:unhideWhenUsed="1"/>
+    <w:lsdException w:name="Date" w:semiHidden="1" w:unhideWhenUsed="1"/>
+    <w:lsdException w:name="Body Text First Indent" w:semiHidden="1" w:unhideWhenUsed="1"/>
+    <w:lsdException w:name="Body Text First Indent 2" w:semiHidden="1" w:unhideWhenUsed="1"/>
+    <w:lsdException w:name="Note Heading" w:semiHidden="1" w:unhideWhenUsed="1"/>
+    <w:lsdException w:name="Body Text 2" w:semiHidden="1" w:unhideWhenUsed="1"/>
+    <w:lsdException w:name="Body Text 3" w:semiHidden="1" w:unhideWhenUsed="1"/>
+    <w:lsdException w:name="Body Text Indent 2" w:semiHidden="1" w:unhideWhenUsed="1"/>
+    <w:lsdException w:name="Body Text Indent 3" w:semiHidden="1" w:unhideWhenUsed="1"/>
+    <w:lsdException w:name="Block Text" w:semiHidden="1" w:unhideWhenUsed="1"/>
+    <w:lsdException w:name="Hyperlink" w:semiHidden="1" w:unhideWhenUsed="1"/>
+    <w:lsdException w:name="FollowedHyperlink" w:semiHidden="1" w:unhideWhenUsed="1"/>
+    <w:lsdException w:name="Strong" w:uiPriority="22" w:qFormat="1"/>
+    <w:lsdException w:name="Emphasis" w:uiPriority="20" w:qFormat="1"/>
+    <w:lsdException w:name="Document Map" w:semiHidden="1" w:unhideWhenUsed="1"/>
+    <w:lsdException w:name="Plain Text" w:semiHidden="1" w:unhideWhenUsed="1"/>
+    <w:lsdException w:name="E-mail Signature" w:semiHidden="1" w:unhideWhenUsed="1"/>
+    <w:lsdException w:name="HTML Top of Form" w:semiHidden="1" w:unhideWhenUsed="1"/>
+    <w:lsdException w:name="HTML Bottom of Form" w:semiHidden="1" w:unhideWhenUsed="1"/>
+    <w:lsdException w:name="Normal (Web)" w:semiHidden="1" w:unhideWhenUsed="1"/>
+    <w:lsdException w:name="HTML Acronym" w:semiHidden="1" w:unhideWhenUsed="1"/>
+    <w:lsdException w:name="HTML Address" w:semiHidden="1" w:unhideWhenUsed="1"/>
+    <w:lsdException w:name="HTML Cite" w:semiHidden="1" w:unhideWhenUsed="1"/>
+    <w:lsdException w:name="HTML Code" w:semiHidden="1" w:unhideWhenUsed="1"/>
+    <w:lsdException w:name="HTML Definition" w:semiHidden="1" w:unhideWhenUsed="1"/>
+    <w:lsdException w:name="HTML Keyboard" w:semiHidden="1" w:unhideWhenUsed="1"/>
+    <w:lsdException w:name="HTML Preformatted" w:semiHidden="1" w:unhideWhenUsed="1"/>
+    <w:lsdException w:name="HTML Sample" w:semiHidden="1" w:unhideWhenUsed="1"/>
+    <w:lsdException w:name="HTML Typewriter" w:semiHidden="1" w:unhideWhenUsed="1"/>
+    <w:lsdException w:name="HTML Variable" w:semiHidden="1" w:unhideWhenUsed="1"/>
+    <w:lsdException w:name="Normal Table" w:semiHidden="1" w:unhideWhenUsed="1"/>
+    <w:lsdException w:name="annotation subject" w:semiHidden="1" w:unhideWhenUsed="1"/>
+    <w:lsdException w:name="No List" w:semiHidden="1" w:unhideWhenUsed="1"/>
+    <w:lsdException w:name="Outline List 1" w:semiHidden="1" w:unhideWhenUsed="1"/>
+    <w:lsdException w:name="Outline List 2" w:semiHidden="1" w:unhideWhenUsed="1"/>
+    <w:lsdException w:name="Outline List 3" w:semiHidden="1" w:unhideWhenUsed="1"/>
+    <w:lsdException w:name="Table Simple 1" w:semiHidden="1" w:unhideWhenUsed="1"/>
+    <w:lsdException w:name="Table Simple 2" w:semiHidden="1" w:unhideWhenUsed="1"/>
+    <w:lsdException w:name="Table Simple 3" w:semiHidden="1" w:unhideWhenUsed="1"/>
+    <w:lsdException w:name="Table Classic 1" w:semiHidden="1" w:unhideWhenUsed="1"/>
+    <w:lsdException w:name="Table Classic 2" w:semiHidden="1" w:unhideWhenUsed="1"/>
+    <w:lsdException w:name="Table Classic 3" w:semiHidden="1" w:unhideWhenUsed="1"/>
+    <w:lsdException w:name="Table Classic 4" w:semiHidden="1" w:unhideWhenUsed="1"/>
+    <w:lsdException w:name="Table Colorful 1" w:semiHidden="1" w:unhideWhenUsed="1"/>
+    <w:lsdException w:name="Table Colorful 2" w:semiHidden="1" w:unhideWhenUsed="1"/>
+    <w:lsdException w:name="Table Colorful 3" w:semiHidden="1" w:unhideWhenUsed="1"/>
+    <w:lsdException w:name="Table Columns 1" w:semiHidden="1" w:unhideWhenUsed="1"/>
+    <w:lsdException w:name="Table Columns 2" w:semiHidden="1" w:unhideWhenUsed="1"/>
+    <w:lsdException w:name="Table Columns 3" w:semiHidden="1" w:unhideWhenUsed="1"/>
+    <w:lsdException w:name="Table Columns 4" w:semiHidden="1" w:unhideWhenUsed="1"/>
+    <w:lsdException w:name="Table Columns 5" w:semiHidden="1" w:unhideWhenUsed="1"/>
+    <w:lsdException w:name="Table Grid 1" w:semiHidden="1" w:unhideWhenUsed="1"/>
+    <w:lsdException w:name="Table Grid 2" w:semiHidden="1" w:unhideWhenUsed="1"/>
+    <w:lsdException w:name="Table Grid 3" w:semiHidden="1" w:unhideWhenUsed="1"/>
+    <w:lsdException w:name="Table Grid 4" w:semiHidden="1" w:unhideWhenUsed="1"/>
+    <w:lsdException w:name="Table Grid 5" w:semiHidden="1" w:unhideWhenUsed="1"/>
+    <w:lsdException w:name="Table Grid 6" w:semiHidden="1" w:unhideWhenUsed="1"/>
+    <w:lsdException w:name="Table Grid 7" w:semiHidden="1" w:unhideWhenUsed="1"/>
+    <w:lsdException w:name="Table Grid 8" w:semiHidden="1" w:unhideWhenUsed="1"/>
+    <w:lsdException w:name="Table List 1" w:semiHidden="1" w:unhideWhenUsed="1"/>
+    <w:lsdException w:name="Table List 2" w:semiHidden="1" w:unhideWhenUsed="1"/>
+    <w:lsdException w:name="Table List 3" w:semiHidden="1" w:unhideWhenUsed="1"/>
+    <w:lsdException w:name="Table List 4" w:semiHidden="1" w:unhideWhenUsed="1"/>
+    <w:lsdException w:name="Table List 5" w:semiHidden="1" w:unhideWhenUsed="1"/>
+    <w:lsdException w:name="Table List 6" w:semiHidden="1" w:unhideWhenUsed="1"/>
+    <w:lsdException w:name="Table List 7" w:semiHidden="1" w:unhideWhenUsed="1"/>
+    <w:lsdException w:name="Table List 8" w:semiHidden="1" w:unhideWhenUsed="1"/>
+    <w:lsdException w:name="Table 3D effects 1" w:semiHidden="1" w:unhideWhenUsed="1"/>
+    <w:lsdException w:name="Table 3D effects 2" w:semiHidden="1" w:unhideWhenUsed="1"/>
+    <w:lsdException w:name="Table 3D effects 3" w:semiHidden="1" w:unhideWhenUsed="1"/>
+    <w:lsdException w:name="Table Contemporary" w:semiHidden="1" w:unhideWhenUsed="1"/>
+    <w:lsdException w:name="Table Elegant" w:semiHidden="1" w:unhideWhenUsed="1"/>
+    <w:lsdException w:name="Table Professional" w:semiHidden="1" w:unhideWhenUsed="1"/>
+    <w:lsdException w:name="Table Subtle 1" w:semiHidden="1" w:unhideWhenUsed="1"/>
+    <w:lsdException w:name="Table Subtle 2" w:semiHidden="1" w:unhideWhenUsed="1"/>
+    <w:lsdException w:name="Table Web 1" w:semiHidden="1" w:unhideWhenUsed="1"/>
+    <w:lsdException w:name="Table Web 2" w:semiHidden="1" w:unhideWhenUsed="1"/>
+    <w:lsdException w:name="Table Web 3" w:semiHidden="1" w:unhideWhenUsed="1"/>
+    <w:lsdException w:name="Balloon Text" w:semiHidden="1" w:unhideWhenUsed="1"/>
+    <w:lsdException w:name="Table Grid" w:uiPriority="59"/>
+    <w:lsdException w:name="Table Theme" w:semiHidden="1" w:unhideWhenUsed="1"/>
+    <w:lsdException w:name="Placeholder Text" w:semiHidden="1"/>
+    <w:lsdException w:name="No Spacing" w:uiPriority="1" w:qFormat="1"/>
+    <w:lsdException w:name="Light Shading" w:uiPriority="60"/>
+    <w:lsdException w:name="Light List" w:uiPriority="61"/>
+    <w:lsdException w:name="Light Grid" w:uiPriority="62"/>
+    <w:lsdException w:name="Medium Shading 1" w:uiPriority="63"/>
+    <w:lsdException w:name="Medium Shading 2" w:uiPriority="64"/>
+    <w:lsdException w:name="Medium List 1" w:uiPriority="65"/>
+    <w:lsdException w:name="Medium List 2" w:uiPriority="66"/>
+    <w:lsdException w:name="Medium Grid 1" w:uiPriority="67"/>
+    <w:lsdException w:name="Medium Grid 2" w:uiPriority="68"/>
+    <w:lsdException w:name="Medium Grid 3" w:uiPriority="69"/>
+    <w:lsdException w:name="Dark List" w:uiPriority="70"/>
+    <w:lsdException w:name="Colorful Shading" w:uiPriority="71"/>
+    <w:lsdException w:name="Colorful List" w:uiPriority="72"/>
+    <w:lsdException w:name="Colorful Grid" w:uiPriority="73"/>
+    <w:lsdException w:name="Light Shading Accent 1" w:uiPriority="60"/>
+    <w:lsdException w:name="Light List Accent 1" w:uiPriority="61"/>
+    <w:lsdException w:name="Light Grid Accent 1" w:uiPriority="62"/>
+    <w:lsdException w:name="Medium Shading 1 Accent 1" w:uiPriority="63"/>
+    <w:lsdException w:name="Medium Shading 2 Accent 1" w:uiPriority="64"/>
+    <w:lsdException w:name="Medium List 1 Accent 1" w:uiPriority="65"/>
+    <w:lsdException w:name="Revision" w:semiHidden="1"/>
+    <w:lsdException w:name="List Paragraph" w:uiPriority="34" w:qFormat="1"/>
+    <w:lsdException w:name="Quote" w:uiPriority="29" w:qFormat="1"/>
+    <w:lsdException w:name="Intense Quote" w:uiPriority="30" w:qFormat="1"/>
+    <w:lsdException w:name="Medium List 2 Accent 1" w:uiPriority="66"/>
+    <w:lsdException w:name="Medium Grid 1 Accent 1" w:uiPriority="67"/>
+    <w:lsdException w:name="Medium Grid 2 Accent 1" w:uiPriority="68"/>
+    <w:lsdException w:name="Medium Grid 3 Accent 1" w:uiPriority="69"/>
+    <w:lsdException w:name="Dark List Accent 1" w:uiPriority="70"/>
+    <w:lsdException w:name="Colorful Shading Accent 1" w:uiPriority="71"/>
+    <w:lsdException w:name="Colorful List Accent 1" w:uiPriority="72"/>
+    <w:lsdException w:name="Colorful Grid Accent 1" w:uiPriority="73"/>
+    <w:lsdException w:name="Light Shading Accent 2" w:uiPriority="60"/>
+    <w:lsdException w:name="Light List Accent 2" w:uiPriority="61"/>
+    <w:lsdException w:name="Light Grid Accent 2" w:uiPriority="62"/>
+    <w:lsdException w:name="Medium Shading 1 Accent 2" w:uiPriority="63"/>
+    <w:lsdException w:name="Medium Shading 2 Accent 2" w:uiPriority="64"/>
+    <w:lsdException w:name="Medium List 1 Accent 2" w:uiPriority="65"/>
+    <w:lsdException w:name="Medium List 2 Accent 2" w:uiPriority="66"/>
+    <w:lsdException w:name="Medium Grid 1 Accent 2" w:uiPriority="67"/>
+    <w:lsdException w:name="Medium Grid 2 Accent 2" w:uiPriority="68"/>
+    <w:lsdException w:name="Medium Grid 3 Accent 2" w:uiPriority="69"/>
+    <w:lsdException w:name="Dark List Accent 2" w:uiPriority="70"/>
+    <w:lsdException w:name="Colorful Shading Accent 2" w:uiPriority="71"/>
+    <w:lsdException w:name="Colorful List Accent 2" w:uiPriority="72"/>
+    <w:lsdException w:name="Colorful Grid Accent 2" w:uiPriority="73"/>
+    <w:lsdException w:name="Light Shading Accent 3" w:uiPriority="60"/>
+    <w:lsdException w:name="Light List Accent 3" w:uiPriority="61"/>
+    <w:lsdException w:name="Light Grid Accent 3" w:uiPriority="62"/>
+    <w:lsdException w:name="Medium Shading 1 Accent 3" w:uiPriority="63"/>
+    <w:lsdException w:name="Medium Shading 2 Accent 3" w:uiPriority="64"/>
+    <w:lsdException w:name="Medium List 1 Accent 3" w:uiPriority="65"/>
+    <w:lsdException w:name="Medium List 2 Accent 3" w:uiPriority="66"/>
+    <w:lsdException w:name="Medium Grid 1 Accent 3" w:uiPriority="67"/>
+    <w:lsdException w:name="Medium Grid 2 Accent 3" w:uiPriority="68"/>
+    <w:lsdException w:name="Medium Grid 3 Accent 3" w:uiPriority="69"/>
+    <w:lsdException w:name="Dark List Accent 3" w:uiPriority="70"/>
+    <w:lsdException w:name="Colorful Shading Accent 3" w:uiPriority="71"/>
+    <w:lsdException w:name="Colorful List Accent 3" w:uiPriority="72"/>
+    <w:lsdException w:name="Colorful Grid Accent 3" w:uiPriority="73"/>
+    <w:lsdException w:name="Light Shading Accent 4" w:uiPriority="60"/>
+    <w:lsdException w:name="Light List Accent 4" w:uiPriority="61"/>
+    <w:lsdException w:name="Light Grid Accent 4" w:uiPriority="62"/>
+    <w:lsdException w:name="Medium Shading 1 Accent 4" w:uiPriority="63"/>
+    <w:lsdException w:name="Medium Shading 2 Accent 4" w:uiPriority="64"/>
+    <w:lsdException w:name="Medium List 1 Accent 4" w:uiPriority="65"/>
+    <w:lsdException w:name="Medium List 2 Accent 4" w:uiPriority="66"/>
+    <w:lsdException w:name="Medium Grid 1 Accent 4" w:uiPriority="67"/>
+    <w:lsdException w:name="Medium Grid 2 Accent 4" w:uiPriority="68"/>
+    <w:lsdException w:name="Medium Grid 3 Accent 4" w:uiPriority="69"/>
+    <w:lsdException w:name="Dark List Accent 4" w:uiPriority="70"/>
+    <w:lsdException w:name="Colorful Shading Accent 4" w:uiPriority="71"/>
+    <w:lsdException w:name="Colorful List Accent 4" w:uiPriority="72"/>
+    <w:lsdException w:name="Colorful Grid Accent 4" w:uiPriority="73"/>
+    <w:lsdException w:name="Light Shading Accent 5" w:uiPriority="60"/>
+    <w:lsdException w:name="Light List Accent 5" w:uiPriority="61"/>
+    <w:lsdException w:name="Light Grid Accent 5" w:uiPriority="62"/>
+    <w:lsdException w:name="Medium Shading 1 Accent 5" w:uiPriority="63"/>
+    <w:lsdException w:name="Medium Shading 2 Accent 5" w:uiPriority="64"/>
+    <w:lsdException w:name="Medium List 1 Accent 5" w:uiPriority="65"/>
+    <w:lsdException w:name="Medium List 2 Accent 5" w:uiPriority="66"/>
+    <w:lsdException w:name="Medium Grid 1 Accent 5" w:uiPriority="67"/>
+    <w:lsdException w:name="Medium Grid 2 Accent 5" w:uiPriority="68"/>
+    <w:lsdException w:name="Medium Grid 3 Accent 5" w:uiPriority="69"/>
+    <w:lsdException w:name="Dark List Accent 5" w:uiPriority="70"/>
+    <w:lsdException w:name="Colorful Shading Accent 5" w:uiPriority="71"/>
+    <w:lsdException w:name="Colorful List Accent 5" w:uiPriority="72"/>
+    <w:lsdException w:name="Colorful Grid Accent 5" w:uiPriority="73"/>
+    <w:lsdException w:name="Light Shading Accent 6" w:uiPriority="60"/>
+    <w:lsdException w:name="Light List Accent 6" w:uiPriority="61"/>
+    <w:lsdException w:name="Light Grid Accent 6" w:uiPriority="62"/>
+    <w:lsdException w:name="Medium Shading 1 Accent 6" w:uiPriority="63"/>
+    <w:lsdException w:name="Medium Shading 2 Accent 6" w:uiPriority="64"/>
+    <w:lsdException w:name="Medium List 1 Accent 6" w:uiPriority="65"/>
+    <w:lsdException w:name="Medium List 2 Accent 6" w:uiPriority="66"/>
+    <w:lsdException w:name="Medium Grid 1 Accent 6" w:uiPriority="67"/>
+    <w:lsdException w:name="Medium Grid 2 Accent 6" w:uiPriority="68"/>
+    <w:lsdException w:name="Medium Grid 3 Accent 6" w:uiPriority="69"/>
+    <w:lsdException w:name="Dark List Accent 6" w:uiPriority="70"/>
+    <w:lsdException w:name="Colorful Shading Accent 6" w:uiPriority="71"/>
+    <w:lsdException w:name="Colorful List Accent 6" w:uiPriority="72"/>
+    <w:lsdException w:name="Colorful Grid Accent 6" w:uiPriority="73"/>
+    <w:lsdException w:name="Subtle Emphasis" w:uiPriority="19" w:qFormat="1"/>
+    <w:lsdException w:name="Intense Emphasis" w:uiPriority="21" w:qFormat="1"/>
+    <w:lsdException w:name="Subtle Reference" w:uiPriority="31" w:qFormat="1"/>
+    <w:lsdException w:name="Intense Reference" w:uiPriority="32" w:qFormat="1"/>
+    <w:lsdException w:name="Book Title" w:uiPriority="33" w:qFormat="1"/>
+    <w:lsdException w:name="Bibliography" w:semiHidden="1" w:uiPriority="37" w:unhideWhenUsed="1"/>
+    <w:lsdException w:name="TOC Heading" w:semiHidden="1" w:uiPriority="39" w:unhideWhenUsed="1" w:qFormat="1"/>
+    <w:lsdException w:name="Plain Table 1" w:uiPriority="41"/>
+    <w:lsdException w:name="Plain Table 2" w:uiPriority="42"/>
+    <w:lsdException w:name="Plain Table 3" w:uiPriority="43"/>
+    <w:lsdException w:name="Plain Table 4" w:uiPriority="44"/>
+    <w:lsdException w:name="Plain Table 5" w:uiPriority="45"/>
+    <w:lsdException w:name="Grid Table Light" w:uiPriority="40"/>
+    <w:lsdException w:name="Grid Table 1 Light" w:uiPriority="46"/>
+    <w:lsdException w:name="Grid Table 2" w:uiPriority="47"/>
+    <w:lsdException w:name="Grid Table 3" w:uiPriority="48"/>
+    <w:lsdException w:name="Grid Table 4" w:uiPriority="49"/>
+    <w:lsdException w:name="Grid Table 5 Dark" w:uiPriority="50"/>
+    <w:lsdException w:name="Grid Table 6 Colorful" w:uiPriority="51"/>
+    <w:lsdException w:name="Grid Table 7 Colorful" w:uiPriority="52"/>
+    <w:lsdException w:name="Grid Table 1 Light Accent 1" w:uiPriority="46"/>
+    <w:lsdException w:name="Grid Table 2 Accent 1" w:uiPriority="47"/>
+    <w:lsdException w:name="Grid Table 3 Accent 1" w:uiPriority="48"/>
+    <w:lsdException w:name="Grid Table 4 Accent 1" w:uiPriority="49"/>
+    <w:lsdException w:name="Grid Table 5 Dark Accent 1" w:uiPriority="50"/>
+    <w:lsdException w:name="Grid Table 6 Colorful Accent 1" w:uiPriority="51"/>
+    <w:lsdException w:name="Grid Table 7 Colorful Accent 1" w:uiPriority="52"/>
+    <w:lsdException w:name="Grid Table 1 Light Accent 2" w:uiPriority="46"/>
+    <w:lsdException w:name="Grid Table 2 Accent 2" w:uiPriority="47"/>
+    <w:lsdException w:name="Grid Table 3 Accent 2" w:uiPriority="48"/>
+    <w:lsdException w:name="Grid Table 4 Accent 2" w:uiPriority="49"/>
+    <w:lsdException w:name="Grid Table 5 Dark Accent 2" w:uiPriority="50"/>
+    <w:lsdException w:name="Grid Table 6 Colorful Accent 2" w:uiPriority="51"/>
+    <w:lsdException w:name="Grid Table 7 Colorful Accent 2" w:uiPriority="52"/>
+    <w:lsdException w:name="Grid Table 1 Light Accent 3" w:uiPriority="46"/>
+    <w:lsdException w:name="Grid Table 2 Accent 3" w:uiPriority="47"/>
+    <w:lsdException w:name="Grid Table 3 Accent 3" w:uiPriority="48"/>
+    <w:lsdException w:name="Grid Table 4 Accent 3" w:uiPriority="49"/>
+    <w:lsdException w:name="Grid Table 5 Dark Accent 3" w:uiPriority="50"/>
+    <w:lsdException w:name="Grid Table 6 Colorful Accent 3" w:uiPriority="51"/>
+    <w:lsdException w:name="Grid Table 7 Colorful Accent 3" w:uiPriority="52"/>
+    <w:lsdException w:name="Grid Table 1 Light Accent 4" w:uiPriority="46"/>
+    <w:lsdException w:name="Grid Table 2 Accent 4" w:uiPriority="47"/>
+    <w:lsdException w:name="Grid Table 3 Accent 4" w:uiPriority="48"/>
+    <w:lsdException w:name="Grid Table 4 Accent 4" w:uiPriority="49"/>
+    <w:lsdException w:name="Grid Table 5 Dark Accent 4" w:uiPriority="50"/>
+    <w:lsdException w:name="Grid Table 6 Colorful Accent 4" w:uiPriority="51"/>
+    <w:lsdException w:name="Grid Table 7 Colorful Accent 4" w:uiPriority="52"/>
+    <w:lsdException w:name="Grid Table 1 Light Accent 5" w:uiPriority="46"/>
+    <w:lsdException w:name="Grid Table 2 Accent 5" w:uiPriority="47"/>
+    <w:lsdException w:name="Grid Table 3 Accent 5" w:uiPriority="48"/>
+    <w:lsdException w:name="Grid Table 4 Accent 5" w:uiPriority="49"/>
+    <w:lsdException w:name="Grid Table 5 Dark Accent 5" w:uiPriority="50"/>
+    <w:lsdException w:name="Grid Table 6 Colorful Accent 5" w:uiPriority="51"/>
+    <w:lsdException w:name="Grid Table 7 Colorful Accent 5" w:uiPriority="52"/>
+    <w:lsdException w:name="Grid Table 1 Light Accent 6" w:uiPriority="46"/>
+    <w:lsdException w:name="Grid Table 2 Accent 6" w:uiPriority="47"/>
+    <w:lsdException w:name="Grid Table 3 Accent 6" w:uiPriority="48"/>
+    <w:lsdException w:name="Grid Table 4 Accent 6" w:uiPriority="49"/>
+    <w:lsdException w:name="Grid Table 5 Dark Accent 6" w:uiPriority="50"/>
+    <w:lsdException w:name="Grid Table 6 Colorful Accent 6" w:uiPriority="51"/>
+    <w:lsdException w:name="Grid Table 7 Colorful Accent 6" w:uiPriority="52"/>
+    <w:lsdException w:name="List Table 1 Light" w:uiPriority="46"/>
+    <w:lsdException w:name="List Table 2" w:uiPriority="47"/>
+    <w:lsdException w:name="List Table 3" w:uiPriority="48"/>
+    <w:lsdException w:name="List Table 4" w:uiPriority="49"/>
+    <w:lsdException w:name="List Table 5 Dark" w:uiPriority="50"/>
+    <w:lsdException w:name="List Table 6 Colorful" w:uiPriority="51"/>
+    <w:lsdException w:name="List Table 7 Colorful" w:uiPriority="52"/>
+    <w:lsdException w:name="List Table 1 Light Accent 1" w:uiPriority="46"/>
+    <w:lsdException w:name="List Table 2 Accent 1" w:uiPriority="47"/>
+    <w:lsdException w:name="List Table 3 Accent 1" w:uiPriority="48"/>
+    <w:lsdException w:name="List Table 4 Accent 1" w:uiPriority="49"/>
+    <w:lsdException w:name="List Table 5 Dark Accent 1" w:uiPriority="50"/>
+    <w:lsdException w:name="List Table 6 Colorful Accent 1" w:uiPriority="51"/>
+    <w:lsdException w:name="List Table 7 Colorful Accent 1" w:uiPriority="52"/>
+    <w:lsdException w:name="List Table 1 Light Accent 2" w:uiPriority="46"/>
+    <w:lsdException w:name="List Table 2 Accent 2" w:uiPriority="47"/>
+    <w:lsdException w:name="List Table 3 Accent 2" w:uiPriority="48"/>
+    <w:lsdException w:name="List Table 4 Accent 2" w:uiPriority="49"/>
+    <w:lsdException w:name="List Table 5 Dark Accent 2" w:uiPriority="50"/>
+    <w:lsdException w:name="List Table 6 Colorful Accent 2" w:uiPriority="51"/>
+    <w:lsdException w:name="List Table 7 Colorful Accent 2" w:uiPriority="52"/>
+    <w:lsdException w:name="List Table 1 Light Accent 3" w:uiPriority="46"/>
+    <w:lsdException w:name="List Table 2 Accent 3" w:uiPriority="47"/>
+    <w:lsdException w:name="List Table 3 Accent 3" w:uiPriority="48"/>
+    <w:lsdException w:name="List Table 4 Accent 3" w:uiPriority="49"/>
+    <w:lsdException w:name="List Table 5 Dark Accent 3" w:uiPriority="50"/>
+    <w:lsdException w:name="List Table 6 Colorful Accent 3" w:uiPriority="51"/>
+    <w:lsdException w:name="List Table 7 Colorful Accent 3" w:uiPriority="52"/>
+    <w:lsdException w:name="List Table 1 Light Accent 4" w:uiPriority="46"/>
+    <w:lsdException w:name="List Table 2 Accent 4" w:uiPriority="47"/>
+    <w:lsdException w:name="List Table 3 Accent 4" w:uiPriority="48"/>
+    <w:lsdException w:name="List Table 4 Accent 4" w:uiPriority="49"/>
+    <w:lsdException w:name="List Table 5 Dark Accent 4" w:uiPriority="50"/>
+    <w:lsdException w:name="List Table 6 Colorful Accent 4" w:uiPriority="51"/>
+    <w:lsdException w:name="List Table 7 Colorful Accent 4" w:uiPriority="52"/>
+    <w:lsdException w:name="List Table 1 Light Accent 5" w:uiPriority="46"/>
+    <w:lsdException w:name="List Table 2 Accent 5" w:uiPriority="47"/>
+    <w:lsdException w:name="List Table 3 Accent 5" w:uiPriority="48"/>
+    <w:lsdException w:name="List Table 4 Accent 5" w:uiPriority="49"/>
+    <w:lsdException w:name="List Table 5 Dark Accent 5" w:uiPriority="50"/>
+    <w:lsdException w:name="List Table 6 Colorful Accent 5" w:uiPriority="51"/>
+    <w:lsdException w:name="List Table 7 Colorful Accent 5" w:uiPriority="52"/>
+    <w:lsdException w:name="List Table 1 Light Accent 6" w:uiPriority="46"/>
+    <w:lsdException w:name="List Table 2 Accent 6" w:uiPriority="47"/>
+    <w:lsdException w:name="List Table 3 Accent 6" w:uiPriority="48"/>
+    <w:lsdException w:name="List Table 4 Accent 6" w:uiPriority="49"/>
+    <w:lsdException w:name="List Table 5 Dark Accent 6" w:uiPriority="50"/>
+    <w:lsdException w:name="List Table 6 Colorful Accent 6" w:uiPriority="51"/>
+    <w:lsdException w:name="List Table 7 Colorful Accent 6" w:uiPriority="52"/>
+    <w:lsdException w:name="Mention" w:semiHidden="1" w:unhideWhenUsed="1"/>
+    <w:lsdException w:name="Smart Hyperlink" w:semiHidden="1" w:unhideWhenUsed="1"/>
+    <w:lsdException w:name="Hashtag" w:semiHidden="1" w:unhideWhenUsed="1"/>
+    <w:lsdException w:name="Unresolved Mention" w:semiHidden="1" w:unhideWhenUsed="1"/>
+    <w:lsdException w:name="Smart Link" w:semiHidden="1" w:unhideWhenUsed="1"/>
   </w:latentStyles>
   <w:style w:type="paragraph" w:default="1" w:styleId="Normal">
     <w:name w:val="Normal"/>

</xml_diff>